<commit_message>
Caso 86 v2: informe Word y PPT revisados con foco en el caso y ejemplos
- Word: reestructurado con ejemplo práctico de Pedro médico, tablas comparativas,
  diagrama del esquema, sección normativa compacta como tabla de referencia,
  menos texto expositivo de la ley y más análisis del caso concreto.
  Incluye info del Grupo 4: Andrea Añasco, Gema Sepúlveda, Karen Rebolledo, Nicolás Muñoz.

- PPT: slide de presentación con integrantes del grupo (slide 3 sobre fondo azul),
  slide del esquema con ejemplo de Pedro y flujo visual, tabla de requisitos con
  semáforo verde/rojo, tabla de impacto numérico, 5 alternativas en layout compacto.
  Menos texto normativo, más foco en el caso, ejemplos concretos en cada slide.

https://claude.ai/code/session_01Wu4J5kMW3gnyas1BwZ5v9s
</commit_message>
<xml_diff>
--- a/Caso86_Informe.docx
+++ b/Caso86_Informe.docx
@@ -23,9 +23,9 @@
         <w:rPr>
           <w:b/>
           <w:color w:val="1A3A5C"/>
-          <w:sz w:val="28"/>
+          <w:sz w:val="40"/>
         </w:rPr>
-        <w:t>CASO 86 — CATÁLOGO DE ESQUEMAS TRIBUTARIOS SII 2025</w:t>
+        <w:t>CASO 86</w:t>
       </w:r>
     </w:p>
     <w:p>
@@ -36,9 +36,9 @@
         <w:rPr>
           <w:b/>
           <w:color w:val="2E6DA4"/>
-          <w:sz w:val="22"/>
+          <w:sz w:val="24"/>
         </w:rPr>
-        <w:t>Prestación de servicios profesionales mediante interposición de sociedad de profesionales</w:t>
+        <w:t>Prestación de Servicios Profesionales mediante Sociedad Interpuesta</w:t>
       </w:r>
     </w:p>
     <w:p>
@@ -51,9 +51,77 @@
           <w:color w:val="555555"/>
           <w:sz w:val="20"/>
         </w:rPr>
-        <w:t>Informe de Análisis y Defensa de Posición</w:t>
+        <w:t>Catálogo de Esquemas Tributarios SII 2025</w:t>
       </w:r>
     </w:p>
+    <w:p/>
+    <w:tbl>
+      <w:tblPr>
+        <w:tblStyle w:val="LightGrid-Accent1"/>
+        <w:tblW w:type="auto" w:w="0"/>
+        <w:jc w:val="center"/>
+        <w:tblLook w:firstColumn="1" w:firstRow="1" w:lastColumn="0" w:lastRow="0" w:noHBand="0" w:noVBand="1" w:val="04A0"/>
+      </w:tblPr>
+      <w:tblGrid>
+        <w:gridCol w:w="4703"/>
+        <w:gridCol w:w="4703"/>
+      </w:tblGrid>
+      <w:tr>
+        <w:tc>
+          <w:tcPr>
+            <w:tcW w:type="dxa" w:w="4703"/>
+            <w:shd w:val="clear" w:color="auto" w:fill="1A3A5C"/>
+          </w:tcPr>
+          <w:p>
+            <w:r>
+              <w:rPr>
+                <w:b/>
+                <w:color w:val="FFFFFF"/>
+                <w:sz w:val="22"/>
+              </w:rPr>
+              <w:t>Grupo 4</w:t>
+            </w:r>
+          </w:p>
+        </w:tc>
+        <w:tc>
+          <w:tcPr>
+            <w:tcW w:type="dxa" w:w="4703"/>
+            <w:shd w:val="clear" w:color="auto" w:fill="1A3A5C"/>
+          </w:tcPr>
+          <w:p>
+            <w:r>
+              <w:rPr>
+                <w:b/>
+                <w:color w:val="FFFFFF"/>
+                <w:sz w:val="22"/>
+              </w:rPr>
+              <w:t>Magíster en Dirección Tributaria UVM</w:t>
+            </w:r>
+          </w:p>
+        </w:tc>
+      </w:tr>
+      <w:tr>
+        <w:tc>
+          <w:tcPr>
+            <w:tcW w:type="dxa" w:w="9406"/>
+            <w:gridSpan w:val="2"/>
+          </w:tcPr>
+          <w:p>
+            <w:pPr>
+              <w:jc w:val="center"/>
+            </w:pPr>
+            <w:r>
+              <w:rPr>
+                <w:color w:val="1A3A5C"/>
+                <w:sz w:val="20"/>
+              </w:rPr>
+              <w:t>Andrea Añasco  ·  Gema Sepúlveda  ·  Karen Rebolledo  ·  Nicolás Muñoz</w:t>
+            </w:r>
+          </w:p>
+        </w:tc>
+      </w:tr>
+    </w:tbl>
+    <w:p/>
     <w:p>
       <w:pPr>
         <w:jc w:val="center"/>
@@ -61,9 +129,8 @@
       <w:r>
         <w:rPr>
           <w:color w:val="2E6DA4"/>
-          <w:sz w:val="16"/>
         </w:rPr>
-        <w:t>________________________________________________________________________________</w:t>
+        <w:t>────────────────────────────────────────────────────────────────────────────────</w:t>
       </w:r>
     </w:p>
     <w:p>
@@ -79,7 +146,7 @@
           <w:color w:val="1A3A5C"/>
           <w:sz w:val="24"/>
         </w:rPr>
-        <w:t>I.  DESCRIPCIÓN DEL ESQUEMA OBJETO DE ANÁLISIS</w:t>
+        <w:t>I.  EL ESQUEMA — ¿QUÉ SE HACE Y POR QUÉ IMPORTA?</w:t>
       </w:r>
     </w:p>
     <w:p>
@@ -89,9 +156,23 @@
       <w:r>
         <w:rPr>
           <w:b w:val="0"/>
+          <w:i w:val="0"/>
           <w:sz w:val="21"/>
         </w:rPr>
-        <w:t>El contribuyente A, persona natural, constituye junto a otros dos socios (B y C) una sociedad de profesionales D, destinada formalmente a la prestación de servicios. La participación social se distribuye en partes iguales (33,33% cada uno), tanto en capital como en utilidades. El capital social aportado no resulta significativo en comparación con los ingresos anuales generados por la compañía.</w:t>
+        <w:t>El Caso 86 describe una práctica frecuente en el mundo de los profesionales liberales: constituir una sociedad de profesionales con socios que, en la realidad, nunca trabajan para la sociedad. El objetivo concreto es fraccionar el ingreso del profesional activo en varios RUT y, con ello, bajar artificialmente el tramo del Impuesto Global Complementario (IGC).</w:t>
+      </w:r>
+    </w:p>
+    <w:p>
+      <w:pPr>
+        <w:spacing w:before="120" w:after="40"/>
+      </w:pPr>
+      <w:r>
+        <w:rPr>
+          <w:b/>
+          <w:color w:val="2E6DA4"/>
+          <w:sz w:val="22"/>
+        </w:rPr>
+        <w:t>El caso concreto</w:t>
       </w:r>
     </w:p>
     <w:p>
@@ -101,23 +182,465 @@
       <w:r>
         <w:rPr>
           <w:b w:val="0"/>
+          <w:i w:val="0"/>
           <w:sz w:val="21"/>
         </w:rPr>
-        <w:t>El elemento crítico del esquema es que los servicios profesionales son prestados casi exclusivamente por el socio A a diversas instituciones y personas naturales, mientras que B y C no prestan servicios profesionales para la sociedad ni desempeñan algún rol estratégico dentro de ella. Sin embargo, al efectuarse los retiros de utilidades en proporción al porcentaje de capital aportado (33,33% cada uno), los tres socios reciben en partes iguales las utilidades generadas íntegramente por A.</w:t>
+        <w:t>Pedro, médico cirujano, genera honorarios anuales por $300 millones. Si los declara directamente bajo el Art. 42 N°2 LIR, paga IGC en el tramo más alto (40%). Para reducir esa carga, constituye junto a su señora y su cuñado —que son profesores y nunca atienden pacientes— la 'Sociedad Profesional Médica Ltda.', con participación del 33,33% cada uno. Los ingresos de Pedro entran a la sociedad y se reparten en partes iguales: cada uno declara $100 millones y queda en un tramo de IGC más bajo.</w:t>
       </w:r>
     </w:p>
     <w:p>
       <w:pPr>
-        <w:jc w:val="both"/>
+        <w:spacing w:before="120" w:after="40"/>
       </w:pPr>
       <w:r>
         <w:rPr>
-          <w:b w:val="0"/>
-          <w:sz w:val="21"/>
+          <w:b/>
+          <w:color w:val="2E6DA4"/>
+          <w:sz w:val="22"/>
         </w:rPr>
-        <w:t>Como resultado, los ingresos generados por la actividad profesional de A son diluidos en tres tramos de Impuesto Global Complementario (IGC) independientes, reduciendo significativamente la carga tributaria del contribuyente A en relación a la que correspondería si dichos ingresos los percibiera directamente (sea como trabajador independiente del Art. 42 N°2 LIR, o como único socio prestador de servicios).</w:t>
+        <w:t>El flujo del esquema</w:t>
       </w:r>
     </w:p>
+    <w:tbl>
+      <w:tblPr>
+        <w:tblStyle w:val="TableGrid"/>
+        <w:tblW w:type="auto" w:w="0"/>
+        <w:jc w:val="center"/>
+        <w:tblLook w:firstColumn="1" w:firstRow="1" w:lastColumn="0" w:lastRow="0" w:noHBand="0" w:noVBand="1" w:val="04A0"/>
+      </w:tblPr>
+      <w:tblGrid>
+        <w:gridCol w:w="3135"/>
+        <w:gridCol w:w="3135"/>
+        <w:gridCol w:w="3135"/>
+      </w:tblGrid>
+      <w:tr>
+        <w:tc>
+          <w:tcPr>
+            <w:tcW w:type="dxa" w:w="3135"/>
+            <w:shd w:val="clear" w:color="auto" w:fill="1A3A5C"/>
+          </w:tcPr>
+          <w:p>
+            <w:r>
+              <w:rPr>
+                <w:b/>
+                <w:color w:val="FFFFFF"/>
+                <w:sz w:val="20"/>
+              </w:rPr>
+              <w:t>Paso</w:t>
+            </w:r>
+          </w:p>
+        </w:tc>
+        <w:tc>
+          <w:tcPr>
+            <w:tcW w:type="dxa" w:w="3135"/>
+            <w:shd w:val="clear" w:color="auto" w:fill="1A3A5C"/>
+          </w:tcPr>
+          <w:p>
+            <w:r>
+              <w:rPr>
+                <w:b/>
+                <w:color w:val="FFFFFF"/>
+                <w:sz w:val="20"/>
+              </w:rPr>
+              <w:t>¿Qué ocurre?</w:t>
+            </w:r>
+          </w:p>
+        </w:tc>
+        <w:tc>
+          <w:tcPr>
+            <w:tcW w:type="dxa" w:w="3135"/>
+            <w:shd w:val="clear" w:color="auto" w:fill="1A3A5C"/>
+          </w:tcPr>
+          <w:p>
+            <w:r>
+              <w:rPr>
+                <w:b/>
+                <w:color w:val="FFFFFF"/>
+                <w:sz w:val="20"/>
+              </w:rPr>
+              <w:t>Sujeto</w:t>
+            </w:r>
+          </w:p>
+        </w:tc>
+      </w:tr>
+      <w:tr>
+        <w:tc>
+          <w:tcPr>
+            <w:tcW w:type="dxa" w:w="3135"/>
+            <w:shd w:val="clear" w:color="auto" w:fill="EBF3FB"/>
+          </w:tcPr>
+          <w:p>
+            <w:r>
+              <w:rPr>
+                <w:b w:val="0"/>
+                <w:sz w:val="19"/>
+              </w:rPr>
+              <w:t>1</w:t>
+            </w:r>
+          </w:p>
+        </w:tc>
+        <w:tc>
+          <w:tcPr>
+            <w:tcW w:type="dxa" w:w="3135"/>
+            <w:shd w:val="clear" w:color="auto" w:fill="EBF3FB"/>
+          </w:tcPr>
+          <w:p>
+            <w:r>
+              <w:rPr>
+                <w:b w:val="0"/>
+                <w:sz w:val="19"/>
+              </w:rPr>
+              <w:t>Pedro presta servicios médicos y factura $300 MM</w:t>
+            </w:r>
+          </w:p>
+        </w:tc>
+        <w:tc>
+          <w:tcPr>
+            <w:tcW w:type="dxa" w:w="3135"/>
+            <w:shd w:val="clear" w:color="auto" w:fill="EBF3FB"/>
+          </w:tcPr>
+          <w:p>
+            <w:r>
+              <w:rPr>
+                <w:b w:val="0"/>
+                <w:sz w:val="19"/>
+              </w:rPr>
+              <w:t>Socio A (Pedro)</w:t>
+            </w:r>
+          </w:p>
+        </w:tc>
+      </w:tr>
+      <w:tr>
+        <w:tc>
+          <w:tcPr>
+            <w:tcW w:type="dxa" w:w="3135"/>
+          </w:tcPr>
+          <w:p>
+            <w:r>
+              <w:rPr>
+                <w:b w:val="0"/>
+                <w:sz w:val="19"/>
+              </w:rPr>
+              <w:t>2</w:t>
+            </w:r>
+          </w:p>
+        </w:tc>
+        <w:tc>
+          <w:tcPr>
+            <w:tcW w:type="dxa" w:w="3135"/>
+          </w:tcPr>
+          <w:p>
+            <w:r>
+              <w:rPr>
+                <w:b w:val="0"/>
+                <w:sz w:val="19"/>
+              </w:rPr>
+              <w:t>Los ingresos ingresan a la Sociedad D</w:t>
+            </w:r>
+          </w:p>
+        </w:tc>
+        <w:tc>
+          <w:tcPr>
+            <w:tcW w:type="dxa" w:w="3135"/>
+          </w:tcPr>
+          <w:p>
+            <w:r>
+              <w:rPr>
+                <w:b w:val="0"/>
+                <w:sz w:val="19"/>
+              </w:rPr>
+              <w:t>Sociedad de profesionales</w:t>
+            </w:r>
+          </w:p>
+        </w:tc>
+      </w:tr>
+      <w:tr>
+        <w:tc>
+          <w:tcPr>
+            <w:tcW w:type="dxa" w:w="3135"/>
+            <w:shd w:val="clear" w:color="auto" w:fill="EBF3FB"/>
+          </w:tcPr>
+          <w:p>
+            <w:r>
+              <w:rPr>
+                <w:b w:val="0"/>
+                <w:sz w:val="19"/>
+              </w:rPr>
+              <w:t>3</w:t>
+            </w:r>
+          </w:p>
+        </w:tc>
+        <w:tc>
+          <w:tcPr>
+            <w:tcW w:type="dxa" w:w="3135"/>
+            <w:shd w:val="clear" w:color="auto" w:fill="EBF3FB"/>
+          </w:tcPr>
+          <w:p>
+            <w:r>
+              <w:rPr>
+                <w:b w:val="0"/>
+                <w:sz w:val="19"/>
+              </w:rPr>
+              <w:t>Las utilidades se distribuyen en partes iguales ($100 MM c/u)</w:t>
+            </w:r>
+          </w:p>
+        </w:tc>
+        <w:tc>
+          <w:tcPr>
+            <w:tcW w:type="dxa" w:w="3135"/>
+            <w:shd w:val="clear" w:color="auto" w:fill="EBF3FB"/>
+          </w:tcPr>
+          <w:p>
+            <w:r>
+              <w:rPr>
+                <w:b w:val="0"/>
+                <w:sz w:val="19"/>
+              </w:rPr>
+              <w:t>A, B y C — todos declaran IGC</w:t>
+            </w:r>
+          </w:p>
+        </w:tc>
+      </w:tr>
+    </w:tbl>
+    <w:p/>
+    <w:tbl>
+      <w:tblPr>
+        <w:tblW w:type="auto" w:w="0"/>
+        <w:jc w:val="center"/>
+        <w:tblLook w:firstColumn="1" w:firstRow="1" w:lastColumn="0" w:lastRow="0" w:noHBand="0" w:noVBand="1" w:val="04A0"/>
+      </w:tblPr>
+      <w:tblGrid>
+        <w:gridCol w:w="9406"/>
+      </w:tblGrid>
+      <w:tr>
+        <w:tc>
+          <w:tcPr>
+            <w:tcW w:type="dxa" w:w="9406"/>
+            <w:shd w:val="clear" w:color="auto" w:fill="FDE9D9"/>
+          </w:tcPr>
+          <w:p>
+            <w:pPr>
+              <w:spacing w:before="80" w:after="80"/>
+              <w:jc w:val="both"/>
+            </w:pPr>
+            <w:r>
+              <w:rPr>
+                <w:b/>
+                <w:color w:val="C5501A"/>
+                <w:sz w:val="21"/>
+              </w:rPr>
+              <w:t>RESULTADO: lo que en manos de Pedro tributaría al 40%, queda diluido en tres tramos independientes. El ahorro fiscal puede superar los $20–40 millones anuales, sin que B ni C hayan atendido un solo paciente.</w:t>
+            </w:r>
+          </w:p>
+        </w:tc>
+      </w:tr>
+    </w:tbl>
+    <w:p/>
+    <w:p>
+      <w:pPr>
+        <w:spacing w:before="120" w:after="40"/>
+      </w:pPr>
+      <w:r>
+        <w:rPr>
+          <w:b/>
+          <w:color w:val="2E6DA4"/>
+          <w:sz w:val="22"/>
+        </w:rPr>
+        <w:t>Diagrama simplificado del esquema</w:t>
+      </w:r>
+    </w:p>
+    <w:tbl>
+      <w:tblPr>
+        <w:tblStyle w:val="TableGrid"/>
+        <w:tblW w:type="auto" w:w="0"/>
+        <w:jc w:val="center"/>
+        <w:tblLook w:firstColumn="1" w:firstRow="1" w:lastColumn="0" w:lastRow="0" w:noHBand="0" w:noVBand="1" w:val="04A0"/>
+      </w:tblPr>
+      <w:tblGrid>
+        <w:gridCol w:w="1881"/>
+        <w:gridCol w:w="1881"/>
+        <w:gridCol w:w="1881"/>
+        <w:gridCol w:w="1881"/>
+        <w:gridCol w:w="1881"/>
+      </w:tblGrid>
+      <w:tr>
+        <w:tc>
+          <w:tcPr>
+            <w:tcW w:type="dxa" w:w="1881"/>
+            <w:shd w:val="clear" w:color="auto" w:fill="2E6DA4"/>
+          </w:tcPr>
+          <w:p>
+            <w:pPr>
+              <w:jc w:val="center"/>
+            </w:pPr>
+            <w:r>
+              <w:rPr>
+                <w:b/>
+                <w:color w:val="FFFFFF"/>
+                <w:sz w:val="19"/>
+              </w:rPr>
+              <w:t>Pedro</w:t>
+              <w:br/>
+              <w:t>(médico)</w:t>
+            </w:r>
+          </w:p>
+        </w:tc>
+        <w:tc>
+          <w:tcPr>
+            <w:tcW w:type="dxa" w:w="1881"/>
+          </w:tcPr>
+          <w:p/>
+        </w:tc>
+        <w:tc>
+          <w:tcPr>
+            <w:tcW w:type="dxa" w:w="1881"/>
+            <w:shd w:val="clear" w:color="auto" w:fill="1A3A5C"/>
+          </w:tcPr>
+          <w:p>
+            <w:pPr>
+              <w:jc w:val="center"/>
+            </w:pPr>
+            <w:r>
+              <w:rPr>
+                <w:b/>
+                <w:color w:val="FFFFFF"/>
+                <w:sz w:val="19"/>
+              </w:rPr>
+              <w:t>Sociedad D</w:t>
+              <w:br/>
+              <w:t>(profesionales)</w:t>
+            </w:r>
+          </w:p>
+        </w:tc>
+        <w:tc>
+          <w:tcPr>
+            <w:tcW w:type="dxa" w:w="1881"/>
+          </w:tcPr>
+          <w:p/>
+        </w:tc>
+        <w:tc>
+          <w:tcPr>
+            <w:tcW w:type="dxa" w:w="1881"/>
+            <w:shd w:val="clear" w:color="auto" w:fill="2E6DA4"/>
+          </w:tcPr>
+          <w:p>
+            <w:pPr>
+              <w:jc w:val="center"/>
+            </w:pPr>
+            <w:r>
+              <w:rPr>
+                <w:b/>
+                <w:color w:val="FFFFFF"/>
+                <w:sz w:val="19"/>
+              </w:rPr>
+              <w:t>SII recibe</w:t>
+              <w:br/>
+              <w:t>IGC de 3 RUT</w:t>
+            </w:r>
+          </w:p>
+        </w:tc>
+      </w:tr>
+      <w:tr>
+        <w:tc>
+          <w:tcPr>
+            <w:tcW w:type="dxa" w:w="1881"/>
+          </w:tcPr>
+          <w:p/>
+        </w:tc>
+        <w:tc>
+          <w:tcPr>
+            <w:tcW w:type="dxa" w:w="1881"/>
+          </w:tcPr>
+          <w:p>
+            <w:pPr>
+              <w:jc w:val="center"/>
+            </w:pPr>
+            <w:r>
+              <w:rPr>
+                <w:color w:val="555555"/>
+                <w:sz w:val="20"/>
+              </w:rPr>
+              <w:t>→ honorarios</w:t>
+            </w:r>
+          </w:p>
+        </w:tc>
+        <w:tc>
+          <w:tcPr>
+            <w:tcW w:type="dxa" w:w="1881"/>
+          </w:tcPr>
+          <w:p/>
+        </w:tc>
+        <w:tc>
+          <w:tcPr>
+            <w:tcW w:type="dxa" w:w="1881"/>
+          </w:tcPr>
+          <w:p>
+            <w:pPr>
+              <w:jc w:val="center"/>
+            </w:pPr>
+            <w:r>
+              <w:rPr>
+                <w:color w:val="555555"/>
+                <w:sz w:val="20"/>
+              </w:rPr>
+              <w:t>→ distribuye</w:t>
+            </w:r>
+          </w:p>
+        </w:tc>
+        <w:tc>
+          <w:tcPr>
+            <w:tcW w:type="dxa" w:w="1881"/>
+          </w:tcPr>
+          <w:p/>
+        </w:tc>
+      </w:tr>
+      <w:tr>
+        <w:tc>
+          <w:tcPr>
+            <w:tcW w:type="dxa" w:w="1881"/>
+          </w:tcPr>
+          <w:p/>
+        </w:tc>
+        <w:tc>
+          <w:tcPr>
+            <w:tcW w:type="dxa" w:w="1881"/>
+          </w:tcPr>
+          <w:p/>
+        </w:tc>
+        <w:tc>
+          <w:tcPr>
+            <w:tcW w:type="dxa" w:w="1881"/>
+            <w:shd w:val="clear" w:color="auto" w:fill="555555"/>
+          </w:tcPr>
+          <w:p>
+            <w:pPr>
+              <w:jc w:val="center"/>
+            </w:pPr>
+            <w:r>
+              <w:rPr>
+                <w:b/>
+                <w:color w:val="FFFFFF"/>
+                <w:sz w:val="19"/>
+              </w:rPr>
+              <w:t>B (33%) · C (33%) · A (33%)</w:t>
+            </w:r>
+          </w:p>
+        </w:tc>
+        <w:tc>
+          <w:tcPr>
+            <w:tcW w:type="dxa" w:w="1881"/>
+          </w:tcPr>
+          <w:p/>
+        </w:tc>
+        <w:tc>
+          <w:tcPr>
+            <w:tcW w:type="dxa" w:w="1881"/>
+          </w:tcPr>
+          <w:p/>
+        </w:tc>
+      </w:tr>
+    </w:tbl>
+    <w:p/>
     <w:p>
       <w:pPr>
         <w:spacing w:before="200" w:after="80"/>
@@ -131,20 +654,7 @@
           <w:color w:val="1A3A5C"/>
           <w:sz w:val="24"/>
         </w:rPr>
-        <w:t>II.  NORMATIVA APLICABLE</w:t>
-      </w:r>
-    </w:p>
-    <w:p>
-      <w:pPr>
-        <w:spacing w:before="160" w:after="60"/>
-      </w:pPr>
-      <w:r>
-        <w:rPr>
-          <w:b/>
-          <w:color w:val="2E6DA4"/>
-          <w:sz w:val="22"/>
-        </w:rPr>
-        <w:t>1. Artículo 42 N°2 de la Ley sobre Impuesto a la Renta</w:t>
+        <w:t>II.  ¿QUÉ DICE EL DERECHO? — SÍNTESIS NORMATIVA</w:t>
       </w:r>
     </w:p>
     <w:p>
@@ -154,398 +664,10 @@
       <w:r>
         <w:rPr>
           <w:b w:val="0"/>
+          <w:i w:val="0"/>
           <w:sz w:val="21"/>
         </w:rPr>
-        <w:t>El Art. 42 N°2 LIR califica como rentas de segunda categoría los ingresos provenientes del ejercicio de profesiones liberales u otras ocupaciones lucrativas no comprendidas en la primera categoría. El inciso tercero de la norma permite a las sociedades de profesionales que prestan exclusivamente servicios o asesorías profesionales optar por declarar sus rentas conforme a las normas de la primera categoría, sujetándose a sus disposiciones para todos los efectos de la ley.</w:t>
-      </w:r>
-    </w:p>
-    <w:p>
-      <w:pPr>
-        <w:spacing w:before="160" w:after="60"/>
-      </w:pPr>
-      <w:r>
-        <w:rPr>
-          <w:b/>
-          <w:color w:val="2E6DA4"/>
-          <w:sz w:val="22"/>
-        </w:rPr>
-        <w:t>2. Circular N°21 de 1991 y Circular N°50 de 2020 del SII</w:t>
-      </w:r>
-    </w:p>
-    <w:p>
-      <w:pPr>
-        <w:jc w:val="both"/>
-      </w:pPr>
-      <w:r>
-        <w:rPr>
-          <w:b w:val="0"/>
-          <w:sz w:val="21"/>
-        </w:rPr>
-        <w:t>Ambas circulares fijan los requisitos copulativos que deben cumplirse para calificar como sociedad de profesionales:</w:t>
-      </w:r>
-    </w:p>
-    <w:p>
-      <w:pPr>
-        <w:pStyle w:val="ListBullet"/>
-        <w:spacing w:after="40"/>
-        <w:ind w:left="283"/>
-      </w:pPr>
-      <w:r>
-        <w:rPr>
-          <w:sz w:val="20"/>
-        </w:rPr>
-        <w:t>Debe tratarse de una sociedad de personas.</w:t>
-      </w:r>
-    </w:p>
-    <w:p>
-      <w:pPr>
-        <w:pStyle w:val="ListBullet"/>
-        <w:spacing w:after="40"/>
-        <w:ind w:left="283"/>
-      </w:pPr>
-      <w:r>
-        <w:rPr>
-          <w:sz w:val="20"/>
-        </w:rPr>
-        <w:t>Su objeto exclusivo debe ser la prestación de servicios o asesorías profesionales.</w:t>
-      </w:r>
-    </w:p>
-    <w:p>
-      <w:pPr>
-        <w:pStyle w:val="ListBullet"/>
-        <w:spacing w:after="40"/>
-        <w:ind w:left="283"/>
-      </w:pPr>
-      <w:r>
-        <w:rPr>
-          <w:sz w:val="20"/>
-        </w:rPr>
-        <w:t>Los servicios deben ser prestados por intermedio de sus socios, asociados o con la colaboración de dependientes que coadyuven a la prestación del servicio.</w:t>
-      </w:r>
-    </w:p>
-    <w:p>
-      <w:pPr>
-        <w:pStyle w:val="ListBullet"/>
-        <w:spacing w:after="40"/>
-        <w:ind w:left="283"/>
-      </w:pPr>
-      <w:r>
-        <w:rPr>
-          <w:sz w:val="20"/>
-        </w:rPr>
-        <w:t>TODOS sus socios (sean personas naturales u otras sociedades de profesionales) deben ejercer sus profesiones para la sociedad. No es aceptable que uno o más de ellos solo aporte capital.</w:t>
-      </w:r>
-    </w:p>
-    <w:p>
-      <w:pPr>
-        <w:pStyle w:val="ListBullet"/>
-        <w:spacing w:after="40"/>
-        <w:ind w:left="283"/>
-      </w:pPr>
-      <w:r>
-        <w:rPr>
-          <w:sz w:val="20"/>
-        </w:rPr>
-        <w:t>No es relevante la forma de remuneración a los socios (contrato de trabajo, sueldo patronal, retiro de utilidades), sino la realización efectiva de labores profesionales en beneficio de la sociedad.</w:t>
-      </w:r>
-    </w:p>
-    <w:p>
-      <w:pPr>
-        <w:spacing w:before="160" w:after="60"/>
-      </w:pPr>
-      <w:r>
-        <w:rPr>
-          <w:b/>
-          <w:color w:val="2E6DA4"/>
-          <w:sz w:val="22"/>
-        </w:rPr>
-        <w:t>3. Normas Generales Antielusivas — Arts. 4 bis, 4 ter, 4 quáter y 4 quinquies del CT</w:t>
-      </w:r>
-    </w:p>
-    <w:p>
-      <w:pPr>
-        <w:jc w:val="both"/>
-      </w:pPr>
-      <w:r>
-        <w:rPr>
-          <w:b w:val="0"/>
-          <w:sz w:val="21"/>
-        </w:rPr>
-        <w:t>Incorporadas por la Ley N°20.780 (2014) y modificadas por la Ley N°21.210 (2020), establecen el marco para que la administración tributaria pueda recalificar actos o contratos cuando se configura abuso de las formas jurídicas o simulación:</w:t>
-      </w:r>
-    </w:p>
-    <w:p>
-      <w:pPr>
-        <w:pStyle w:val="ListBullet"/>
-        <w:spacing w:after="40"/>
-        <w:ind w:left="283"/>
-      </w:pPr>
-      <w:r>
-        <w:rPr>
-          <w:sz w:val="20"/>
-        </w:rPr>
-        <w:t>Art. 4 bis CT: Principio de buena fe. Las obligaciones tributarias nacen y se exigen con arreglo a la naturaleza jurídica de los hechos, actos o negocios realizados, cualquiera sea la forma o denominación que los interesados les hubieren dado.</w:t>
-      </w:r>
-    </w:p>
-    <w:p>
-      <w:pPr>
-        <w:pStyle w:val="ListBullet"/>
-        <w:spacing w:after="40"/>
-        <w:ind w:left="283"/>
-      </w:pPr>
-      <w:r>
-        <w:rPr>
-          <w:sz w:val="20"/>
-        </w:rPr>
-        <w:t>Art. 4 ter CT (Abuso): Existe abuso cuando se evita total o parcialmente la realización del hecho gravado, o se disminuye la base imponible o la obligación tributaria, mediante actos o negocios que, individualmente considerados o en su conjunto, no produzcan resultados o efectos jurídicos o económicos relevantes para el contribuyente o un tercero, que sean distintos de los meramente tributarios.</w:t>
-      </w:r>
-    </w:p>
-    <w:p>
-      <w:pPr>
-        <w:pStyle w:val="ListBullet"/>
-        <w:spacing w:after="40"/>
-        <w:ind w:left="283"/>
-      </w:pPr>
-      <w:r>
-        <w:rPr>
-          <w:sz w:val="20"/>
-        </w:rPr>
-        <w:t>Art. 4 quáter CT (Simulación): Habrá simulación cuando los actos o negocios disimulen la configuración del hecho gravado o la naturaleza de los elementos constitutivos de la obligación tributaria, o su verdadero monto o data de nacimiento.</w:t>
-      </w:r>
-    </w:p>
-    <w:p>
-      <w:pPr>
-        <w:pStyle w:val="ListBullet"/>
-        <w:spacing w:after="40"/>
-        <w:ind w:left="283"/>
-      </w:pPr>
-      <w:r>
-        <w:rPr>
-          <w:sz w:val="20"/>
-        </w:rPr>
-        <w:t>Art. 4 quinquies CT: Procedimiento. La existencia de abuso o simulación será declarada por el Tribunal Tributario y Aduanero, a requerimiento del Director del SII.</w:t>
-      </w:r>
-    </w:p>
-    <w:p>
-      <w:pPr>
-        <w:spacing w:before="160" w:after="60"/>
-      </w:pPr>
-      <w:r>
-        <w:rPr>
-          <w:b/>
-          <w:color w:val="2E6DA4"/>
-          <w:sz w:val="22"/>
-        </w:rPr>
-        <w:t>4. Circular N°65 de 2015 del SII</w:t>
-      </w:r>
-    </w:p>
-    <w:p>
-      <w:pPr>
-        <w:jc w:val="both"/>
-      </w:pPr>
-      <w:r>
-        <w:rPr>
-          <w:b w:val="0"/>
-          <w:sz w:val="21"/>
-        </w:rPr>
-        <w:t>Imparte instrucciones sobre la aplicación práctica de las Normas Generales Antielusivas. Precisa que el abuso requiere acreditar la ausencia de efectos jurídicos o económicos relevantes distintos de los tributarios, y que la simulación supone una divergencia consciente entre la voluntad real y la declarada.</w:t>
-      </w:r>
-    </w:p>
-    <w:p>
-      <w:pPr>
-        <w:spacing w:before="160" w:after="60"/>
-      </w:pPr>
-      <w:r>
-        <w:rPr>
-          <w:b/>
-          <w:color w:val="2E6DA4"/>
-          <w:sz w:val="22"/>
-        </w:rPr>
-        <w:t>5. Oficio N°2359 de 2022 del SII</w:t>
-      </w:r>
-    </w:p>
-    <w:p>
-      <w:pPr>
-        <w:jc w:val="both"/>
-      </w:pPr>
-      <w:r>
-        <w:rPr>
-          <w:b w:val="0"/>
-          <w:sz w:val="21"/>
-        </w:rPr>
-        <w:t>Pronunciamiento que aclara que la sociedad de profesionales que optó por tributar en primera categoría no puede transitar nuevamente a segunda categoría, reforzando el carácter estable de la opción del Art. 42 N°2 inciso 3°.</w:t>
-      </w:r>
-    </w:p>
-    <w:p>
-      <w:r>
-        <w:br w:type="page"/>
-      </w:r>
-    </w:p>
-    <w:p>
-      <w:pPr>
-        <w:spacing w:before="200" w:after="80"/>
-        <w:pBdr>
-          <w:bottom w:val="single" w:sz="8" w:space="1" w:color="2E6DA4"/>
-        </w:pBdr>
-      </w:pPr>
-      <w:r>
-        <w:rPr>
-          <w:b/>
-          <w:color w:val="1A3A5C"/>
-          <w:sz w:val="24"/>
-        </w:rPr>
-        <w:t>III.  ANÁLISIS JURÍDICO DEL CASO</w:t>
-      </w:r>
-    </w:p>
-    <w:p>
-      <w:pPr>
-        <w:spacing w:before="160" w:after="60"/>
-      </w:pPr>
-      <w:r>
-        <w:rPr>
-          <w:b/>
-          <w:color w:val="2E6DA4"/>
-          <w:sz w:val="22"/>
-        </w:rPr>
-        <w:t>1. Calificación de la sociedad D como 'sociedad de profesionales'</w:t>
-      </w:r>
-    </w:p>
-    <w:p>
-      <w:pPr>
-        <w:jc w:val="both"/>
-      </w:pPr>
-      <w:r>
-        <w:rPr>
-          <w:b w:val="0"/>
-          <w:sz w:val="21"/>
-        </w:rPr>
-        <w:t>El primer punto a dilucidar es si la sociedad D efectivamente califica como 'sociedad de profesionales' en los términos del Art. 42 N°2 inciso 3° LIR y de la Circular N°21 de 1991. La respuesta es negativa, por la siguiente razón:</w:t>
-      </w:r>
-    </w:p>
-    <w:p>
-      <w:pPr>
-        <w:jc w:val="both"/>
-      </w:pPr>
-      <w:r>
-        <w:rPr>
-          <w:b w:val="0"/>
-          <w:sz w:val="21"/>
-        </w:rPr>
-        <w:t>Uno de los requisitos copulativos exigidos por la administración tributaria es que TODOS los socios ejerzan sus profesiones para la sociedad. En el caso analizado, solo el socio A presta efectivamente los servicios profesionales; B y C no prestan servicios ni tienen rol estratégico en la entidad. En consecuencia, D no reúne los requisitos formales para ser considerada sociedad de profesionales y, por tanto, tampoco puede acogerse válidamente a la opción de tributar en primera categoría que contempla la norma especial.</w:t>
-      </w:r>
-    </w:p>
-    <w:p>
-      <w:pPr>
-        <w:spacing w:before="160" w:after="60"/>
-      </w:pPr>
-      <w:r>
-        <w:rPr>
-          <w:b/>
-          <w:color w:val="2E6DA4"/>
-          <w:sz w:val="22"/>
-        </w:rPr>
-        <w:t>2. Análisis bajo el principio de realidad económica (Art. 4 bis CT)</w:t>
-      </w:r>
-    </w:p>
-    <w:p>
-      <w:pPr>
-        <w:jc w:val="both"/>
-      </w:pPr>
-      <w:r>
-        <w:rPr>
-          <w:b w:val="0"/>
-          <w:sz w:val="21"/>
-        </w:rPr>
-        <w:t>Conforme al Art. 4 bis del Código Tributario, las obligaciones tributarias nacen y se exigen con arreglo a la naturaleza jurídica de los hechos, cualquiera sea la forma o denominación. En el caso, la realidad económica es que A es el único profesional que ejerce labor lucrativa, generando los ingresos que se atribuyen indiscriminadamente a los tres socios.</w:t>
-      </w:r>
-    </w:p>
-    <w:p>
-      <w:pPr>
-        <w:spacing w:before="160" w:after="60"/>
-      </w:pPr>
-      <w:r>
-        <w:rPr>
-          <w:b/>
-          <w:color w:val="2E6DA4"/>
-          <w:sz w:val="22"/>
-        </w:rPr>
-        <w:t>3. ¿Abuso o Simulación?</w:t>
-      </w:r>
-    </w:p>
-    <w:p>
-      <w:pPr>
-        <w:jc w:val="both"/>
-      </w:pPr>
-      <w:r>
-        <w:rPr>
-          <w:b w:val="0"/>
-          <w:sz w:val="21"/>
-        </w:rPr>
-        <w:t>Corresponde determinar si la conducta descrita configura un caso de abuso de las formas jurídicas (Art. 4 ter CT) o de simulación (Art. 4 quáter CT). El análisis del grupo concluye que se está frente a un caso de ABUSO, no de simulación, por las siguientes razones:</w:t>
-      </w:r>
-    </w:p>
-    <w:p>
-      <w:pPr>
-        <w:pStyle w:val="ListBullet"/>
-        <w:spacing w:after="40"/>
-        <w:ind w:left="283"/>
-      </w:pPr>
-      <w:r>
-        <w:rPr>
-          <w:sz w:val="20"/>
-        </w:rPr>
-        <w:t>La sociedad D existe formalmente y está válidamente constituida. Los actos societarios son reales: hay un contrato de sociedad, un capital social aportado, una distribución de utilidades efectiva. No hay un acto disimulado tras otro: lo que se observa es exactamente lo que se declara (una sociedad con tres socios que reparten utilidades en proporción al capital).</w:t>
-      </w:r>
-    </w:p>
-    <w:p>
-      <w:pPr>
-        <w:pStyle w:val="ListBullet"/>
-        <w:spacing w:after="40"/>
-        <w:ind w:left="283"/>
-      </w:pPr>
-      <w:r>
-        <w:rPr>
-          <w:sz w:val="20"/>
-        </w:rPr>
-        <w:t>El abuso radica en la utilización de una FORMA JURÍDICA inapropiada para el sustrato económico que se quiere amparar. La sociedad de profesionales es una figura prevista para que profesionales que trabajan en conjunto puedan organizarse con personalidad jurídica común. No está prevista para canalizar el trabajo individual de uno solo, diluyendo artificialmente sus utilidades en otros socios que no aportan trabajo.</w:t>
-      </w:r>
-    </w:p>
-    <w:p>
-      <w:pPr>
-        <w:pStyle w:val="ListBullet"/>
-        <w:spacing w:after="40"/>
-        <w:ind w:left="283"/>
-      </w:pPr>
-      <w:r>
-        <w:rPr>
-          <w:sz w:val="20"/>
-        </w:rPr>
-        <w:t>Los actos del esquema no producen efectos jurídicos o económicos relevantes distintos del meramente tributario: la existencia de B y C como socios no agrega valor económico al negocio (no aportan capital significativo, no prestan servicios, no aportan clientela, no tienen rol estratégico). Su única función es servir de vehículo para 'absorber' parte de las utilidades de A.</w:t>
-      </w:r>
-    </w:p>
-    <w:p>
-      <w:pPr>
-        <w:spacing w:before="160" w:after="60"/>
-      </w:pPr>
-      <w:r>
-        <w:rPr>
-          <w:b/>
-          <w:color w:val="2E6DA4"/>
-          <w:sz w:val="22"/>
-        </w:rPr>
-        <w:t>4. Efecto tributario del esquema — perjuicio fiscal</w:t>
-      </w:r>
-    </w:p>
-    <w:p>
-      <w:pPr>
-        <w:jc w:val="both"/>
-      </w:pPr>
-      <w:r>
-        <w:rPr>
-          <w:b w:val="0"/>
-          <w:sz w:val="21"/>
-        </w:rPr>
-        <w:t>El esquema afecta indebidamente la progresión del IGC del socio A. A modo ilustrativo, supóngase que la sociedad genera utilidades anuales por $300 millones, íntegramente atribuibles al trabajo profesional de A:</w:t>
+        <w:t>No se trata de hacer un repaso de la ley, sino de identificar qué normas son relevantes para calificar el esquema y cuáles le aplican directamente. La tabla siguiente sintetiza el marco legal pertinente:</w:t>
       </w:r>
     </w:p>
     <w:tbl>
@@ -571,9 +693,9 @@
               <w:rPr>
                 <w:b/>
                 <w:color w:val="FFFFFF"/>
-                <w:sz w:val="19"/>
+                <w:sz w:val="20"/>
               </w:rPr>
-              <w:t>Escenario</w:t>
+              <w:t>Norma</w:t>
             </w:r>
           </w:p>
         </w:tc>
@@ -587,9 +709,9 @@
               <w:rPr>
                 <w:b/>
                 <w:color w:val="FFFFFF"/>
-                <w:sz w:val="19"/>
+                <w:sz w:val="20"/>
               </w:rPr>
-              <w:t>Atribución de renta</w:t>
+              <w:t>Contenido clave</w:t>
             </w:r>
           </w:p>
         </w:tc>
@@ -603,9 +725,56 @@
               <w:rPr>
                 <w:b/>
                 <w:color w:val="FFFFFF"/>
+                <w:sz w:val="20"/>
+              </w:rPr>
+              <w:t>¿Cómo aplica al Caso 86?</w:t>
+            </w:r>
+          </w:p>
+        </w:tc>
+      </w:tr>
+      <w:tr>
+        <w:tc>
+          <w:tcPr>
+            <w:tcW w:type="dxa" w:w="3135"/>
+            <w:shd w:val="clear" w:color="auto" w:fill="F4F6F9"/>
+          </w:tcPr>
+          <w:p>
+            <w:r>
+              <w:rPr>
+                <w:b w:val="0"/>
                 <w:sz w:val="19"/>
               </w:rPr>
-              <w:t>Impacto IGC aproximado</w:t>
+              <w:t>Art. 42 N°2 LIR</w:t>
+            </w:r>
+          </w:p>
+        </w:tc>
+        <w:tc>
+          <w:tcPr>
+            <w:tcW w:type="dxa" w:w="3135"/>
+            <w:shd w:val="clear" w:color="auto" w:fill="F4F6F9"/>
+          </w:tcPr>
+          <w:p>
+            <w:r>
+              <w:rPr>
+                <w:b w:val="0"/>
+                <w:sz w:val="19"/>
+              </w:rPr>
+              <w:t>Rentas de segunda categoría. Las sociedades de profesionales pueden optar por 1ª categoría si TODOS los socios ejercen su profesión para ella.</w:t>
+            </w:r>
+          </w:p>
+        </w:tc>
+        <w:tc>
+          <w:tcPr>
+            <w:tcW w:type="dxa" w:w="3135"/>
+            <w:shd w:val="clear" w:color="auto" w:fill="F4F6F9"/>
+          </w:tcPr>
+          <w:p>
+            <w:r>
+              <w:rPr>
+                <w:b w:val="0"/>
+                <w:sz w:val="19"/>
+              </w:rPr>
+              <w:t>D no cumple: B y C no ejercen profesión para la sociedad → no califica como sociedad de profesionales.</w:t>
             </w:r>
           </w:p>
         </w:tc>
@@ -618,9 +787,10 @@
           <w:p>
             <w:r>
               <w:rPr>
-                <w:sz w:val="18"/>
+                <w:b w:val="0"/>
+                <w:sz w:val="19"/>
               </w:rPr>
-              <w:t>Sin esquema (A solo)</w:t>
+              <w:t>Circ. N°21/1991 y N°50/2020 SII</w:t>
             </w:r>
           </w:p>
         </w:tc>
@@ -631,9 +801,10 @@
           <w:p>
             <w:r>
               <w:rPr>
-                <w:sz w:val="18"/>
+                <w:b w:val="0"/>
+                <w:sz w:val="19"/>
               </w:rPr>
-              <w:t>A recibe $300 MM</w:t>
+              <w:t>Requisitos copulativos para ser sociedad de profesionales. Todos los socios deben prestar servicios efectivos; no es válido que uno solo aporte capital.</w:t>
             </w:r>
           </w:p>
         </w:tc>
@@ -644,9 +815,57 @@
           <w:p>
             <w:r>
               <w:rPr>
-                <w:sz w:val="18"/>
+                <w:b w:val="0"/>
+                <w:sz w:val="19"/>
               </w:rPr>
-              <w:t>IGC en tramo marginal alto (40%) sobre un único contribuyente</w:t>
+              <w:t>Incumplimiento flagrante: B y C solo aportan capital.</w:t>
+            </w:r>
+          </w:p>
+        </w:tc>
+      </w:tr>
+      <w:tr>
+        <w:tc>
+          <w:tcPr>
+            <w:tcW w:type="dxa" w:w="3135"/>
+            <w:shd w:val="clear" w:color="auto" w:fill="F4F6F9"/>
+          </w:tcPr>
+          <w:p>
+            <w:r>
+              <w:rPr>
+                <w:b w:val="0"/>
+                <w:sz w:val="19"/>
+              </w:rPr>
+              <w:t>Art. 4 bis CT</w:t>
+            </w:r>
+          </w:p>
+        </w:tc>
+        <w:tc>
+          <w:tcPr>
+            <w:tcW w:type="dxa" w:w="3135"/>
+            <w:shd w:val="clear" w:color="auto" w:fill="F4F6F9"/>
+          </w:tcPr>
+          <w:p>
+            <w:r>
+              <w:rPr>
+                <w:b w:val="0"/>
+                <w:sz w:val="19"/>
+              </w:rPr>
+              <w:t>Las obligaciones tributarias nacen según la naturaleza jurídica real de los actos, no según la forma que les dan las partes.</w:t>
+            </w:r>
+          </w:p>
+        </w:tc>
+        <w:tc>
+          <w:tcPr>
+            <w:tcW w:type="dxa" w:w="3135"/>
+            <w:shd w:val="clear" w:color="auto" w:fill="F4F6F9"/>
+          </w:tcPr>
+          <w:p>
+            <w:r>
+              <w:rPr>
+                <w:b w:val="0"/>
+                <w:sz w:val="19"/>
+              </w:rPr>
+              <w:t>Obligaciones de Pedro no se alteran por usar la sociedad como vehículo.</w:t>
             </w:r>
           </w:p>
         </w:tc>
@@ -659,9 +878,10 @@
           <w:p>
             <w:r>
               <w:rPr>
-                <w:sz w:val="18"/>
+                <w:b w:val="0"/>
+                <w:sz w:val="19"/>
               </w:rPr>
-              <w:t>Con esquema D (3 socios)</w:t>
+              <w:t>Art. 4 ter CT</w:t>
             </w:r>
           </w:p>
         </w:tc>
@@ -672,9 +892,10 @@
           <w:p>
             <w:r>
               <w:rPr>
-                <w:sz w:val="18"/>
+                <w:b w:val="0"/>
+                <w:sz w:val="19"/>
               </w:rPr>
-              <w:t>A: $100 MM · B: $100 MM · C: $100 MM</w:t>
+              <w:t>ABUSO: actos que evitan o disminuyen el hecho gravado sin producir efectos jurídicos/económicos relevantes distintos del tributario.</w:t>
             </w:r>
           </w:p>
         </w:tc>
@@ -685,9 +906,202 @@
           <w:p>
             <w:r>
               <w:rPr>
-                <w:sz w:val="18"/>
+                <w:b w:val="0"/>
+                <w:sz w:val="19"/>
               </w:rPr>
-              <w:t>Cada socio queda en tramo más bajo: ahorro fiscal significativo</w:t>
+              <w:t>El esquema reduce la carga de Pedro sin que B y C aporten valor real → ABUSO.</w:t>
+            </w:r>
+          </w:p>
+        </w:tc>
+      </w:tr>
+      <w:tr>
+        <w:tc>
+          <w:tcPr>
+            <w:tcW w:type="dxa" w:w="3135"/>
+            <w:shd w:val="clear" w:color="auto" w:fill="F4F6F9"/>
+          </w:tcPr>
+          <w:p>
+            <w:r>
+              <w:rPr>
+                <w:b w:val="0"/>
+                <w:sz w:val="19"/>
+              </w:rPr>
+              <w:t>Art. 4 quinquies CT</w:t>
+            </w:r>
+          </w:p>
+        </w:tc>
+        <w:tc>
+          <w:tcPr>
+            <w:tcW w:type="dxa" w:w="3135"/>
+            <w:shd w:val="clear" w:color="auto" w:fill="F4F6F9"/>
+          </w:tcPr>
+          <w:p>
+            <w:r>
+              <w:rPr>
+                <w:b w:val="0"/>
+                <w:sz w:val="19"/>
+              </w:rPr>
+              <w:t>El Director del SII puede requerir al Tribunal Tributario y Aduanero (TTA) la declaración de abuso.</w:t>
+            </w:r>
+          </w:p>
+        </w:tc>
+        <w:tc>
+          <w:tcPr>
+            <w:tcW w:type="dxa" w:w="3135"/>
+            <w:shd w:val="clear" w:color="auto" w:fill="F4F6F9"/>
+          </w:tcPr>
+          <w:p>
+            <w:r>
+              <w:rPr>
+                <w:b w:val="0"/>
+                <w:sz w:val="19"/>
+              </w:rPr>
+              <w:t>Consecuencia práctica: recalificación + atribución íntegra a Pedro + intereses + multas.</w:t>
+            </w:r>
+          </w:p>
+        </w:tc>
+      </w:tr>
+    </w:tbl>
+    <w:p/>
+    <w:p>
+      <w:r>
+        <w:br w:type="page"/>
+      </w:r>
+    </w:p>
+    <w:p>
+      <w:pPr>
+        <w:spacing w:before="200" w:after="80"/>
+        <w:pBdr>
+          <w:bottom w:val="single" w:sz="8" w:space="1" w:color="2E6DA4"/>
+        </w:pBdr>
+      </w:pPr>
+      <w:r>
+        <w:rPr>
+          <w:b/>
+          <w:color w:val="1A3A5C"/>
+          <w:sz w:val="24"/>
+        </w:rPr>
+        <w:t>III.  CALIFICACIÓN JURÍDICA — ¿ABUSO O SIMULACIÓN?</w:t>
+      </w:r>
+    </w:p>
+    <w:p>
+      <w:pPr>
+        <w:jc w:val="both"/>
+      </w:pPr>
+      <w:r>
+        <w:rPr>
+          <w:b w:val="0"/>
+          <w:i w:val="0"/>
+          <w:sz w:val="21"/>
+        </w:rPr>
+        <w:t>Esta es la pregunta central del caso. El Código Tributario distingue dos figuras antielusivas distintas con efectos procesales diferentes. La correcta calificación importa porque define qué debe probar el SII y cuál norma aplica.</w:t>
+      </w:r>
+    </w:p>
+    <w:tbl>
+      <w:tblPr>
+        <w:tblStyle w:val="LightGrid-Accent1"/>
+        <w:tblW w:type="auto" w:w="0"/>
+        <w:jc w:val="center"/>
+        <w:tblLook w:firstColumn="1" w:firstRow="1" w:lastColumn="0" w:lastRow="0" w:noHBand="0" w:noVBand="1" w:val="04A0"/>
+      </w:tblPr>
+      <w:tblGrid>
+        <w:gridCol w:w="3135"/>
+        <w:gridCol w:w="3135"/>
+        <w:gridCol w:w="3135"/>
+      </w:tblGrid>
+      <w:tr>
+        <w:tc>
+          <w:tcPr>
+            <w:tcW w:type="dxa" w:w="3135"/>
+            <w:shd w:val="clear" w:color="auto" w:fill="1A3A5C"/>
+          </w:tcPr>
+          <w:p>
+            <w:r>
+              <w:rPr>
+                <w:b/>
+                <w:color w:val="FFFFFF"/>
+                <w:sz w:val="20"/>
+              </w:rPr>
+              <w:t>Criterio</w:t>
+            </w:r>
+          </w:p>
+        </w:tc>
+        <w:tc>
+          <w:tcPr>
+            <w:tcW w:type="dxa" w:w="3135"/>
+            <w:shd w:val="clear" w:color="auto" w:fill="1A3A5C"/>
+          </w:tcPr>
+          <w:p>
+            <w:r>
+              <w:rPr>
+                <w:b/>
+                <w:color w:val="FFFFFF"/>
+                <w:sz w:val="20"/>
+              </w:rPr>
+              <w:t>ABUSO (Art. 4 ter CT)</w:t>
+            </w:r>
+          </w:p>
+        </w:tc>
+        <w:tc>
+          <w:tcPr>
+            <w:tcW w:type="dxa" w:w="3135"/>
+            <w:shd w:val="clear" w:color="auto" w:fill="1A3A5C"/>
+          </w:tcPr>
+          <w:p>
+            <w:r>
+              <w:rPr>
+                <w:b/>
+                <w:color w:val="FFFFFF"/>
+                <w:sz w:val="20"/>
+              </w:rPr>
+              <w:t>SIMULACIÓN (Art. 4 quáter CT)</w:t>
+            </w:r>
+          </w:p>
+        </w:tc>
+      </w:tr>
+      <w:tr>
+        <w:tc>
+          <w:tcPr>
+            <w:tcW w:type="dxa" w:w="3135"/>
+            <w:shd w:val="clear" w:color="auto" w:fill="F4F6F9"/>
+          </w:tcPr>
+          <w:p>
+            <w:r>
+              <w:rPr>
+                <w:b w:val="0"/>
+                <w:sz w:val="19"/>
+              </w:rPr>
+              <w:t>¿Los actos son reales?</w:t>
+            </w:r>
+          </w:p>
+        </w:tc>
+        <w:tc>
+          <w:tcPr>
+            <w:tcW w:type="dxa" w:w="3135"/>
+            <w:shd w:val="clear" w:color="auto" w:fill="F4F6F9"/>
+          </w:tcPr>
+          <w:p>
+            <w:r>
+              <w:rPr>
+                <w:b w:val="0"/>
+                <w:sz w:val="19"/>
+              </w:rPr>
+              <w:t>SÍ — la sociedad existe, hay socios y distribución real</w:t>
+            </w:r>
+          </w:p>
+        </w:tc>
+        <w:tc>
+          <w:tcPr>
+            <w:tcW w:type="dxa" w:w="3135"/>
+            <w:shd w:val="clear" w:color="auto" w:fill="F4F6F9"/>
+          </w:tcPr>
+          <w:p>
+            <w:r>
+              <w:rPr>
+                <w:b w:val="0"/>
+                <w:sz w:val="19"/>
+              </w:rPr>
+              <w:t>NO — hay un acto declarado que disimula otro real y secreto</w:t>
             </w:r>
           </w:p>
         </w:tc>
@@ -700,9 +1114,10 @@
           <w:p>
             <w:r>
               <w:rPr>
-                <w:sz w:val="18"/>
+                <w:b w:val="0"/>
+                <w:sz w:val="19"/>
               </w:rPr>
-              <w:t>Diferencial</w:t>
+              <w:t>¿Hay divergencia entre lo declarado y lo real?</w:t>
             </w:r>
           </w:p>
         </w:tc>
@@ -713,9 +1128,10 @@
           <w:p>
             <w:r>
               <w:rPr>
-                <w:sz w:val="18"/>
+                <w:b w:val="0"/>
+                <w:sz w:val="19"/>
               </w:rPr>
-              <w:t>Mismo ingreso económico real</w:t>
+              <w:t>NO — el contrato dice exactamente lo que se hace</w:t>
             </w:r>
           </w:p>
         </w:tc>
@@ -726,9 +1142,183 @@
           <w:p>
             <w:r>
               <w:rPr>
-                <w:sz w:val="18"/>
+                <w:b w:val="0"/>
+                <w:sz w:val="19"/>
               </w:rPr>
-              <w:t>Reducción artificial de carga tributaria — ABUSO</w:t>
+              <w:t>SÍ — hay voluntad real oculta distinta de la declarada</w:t>
+            </w:r>
+          </w:p>
+        </w:tc>
+      </w:tr>
+      <w:tr>
+        <w:tc>
+          <w:tcPr>
+            <w:tcW w:type="dxa" w:w="3135"/>
+            <w:shd w:val="clear" w:color="auto" w:fill="F4F6F9"/>
+          </w:tcPr>
+          <w:p>
+            <w:r>
+              <w:rPr>
+                <w:b w:val="0"/>
+                <w:sz w:val="19"/>
+              </w:rPr>
+              <w:t>¿Qué se cuestiona?</w:t>
+            </w:r>
+          </w:p>
+        </w:tc>
+        <w:tc>
+          <w:tcPr>
+            <w:tcW w:type="dxa" w:w="3135"/>
+            <w:shd w:val="clear" w:color="auto" w:fill="F4F6F9"/>
+          </w:tcPr>
+          <w:p>
+            <w:r>
+              <w:rPr>
+                <w:b w:val="0"/>
+                <w:sz w:val="19"/>
+              </w:rPr>
+              <w:t>La FORMA jurídica elegida (inapropiada para el sustrato económico)</w:t>
+            </w:r>
+          </w:p>
+        </w:tc>
+        <w:tc>
+          <w:tcPr>
+            <w:tcW w:type="dxa" w:w="3135"/>
+            <w:shd w:val="clear" w:color="auto" w:fill="F4F6F9"/>
+          </w:tcPr>
+          <w:p>
+            <w:r>
+              <w:rPr>
+                <w:b w:val="0"/>
+                <w:sz w:val="19"/>
+              </w:rPr>
+              <w:t>El CONTENIDO del acto (simula algo que no existe)</w:t>
+            </w:r>
+          </w:p>
+        </w:tc>
+      </w:tr>
+      <w:tr>
+        <w:tc>
+          <w:tcPr>
+            <w:tcW w:type="dxa" w:w="3135"/>
+          </w:tcPr>
+          <w:p>
+            <w:r>
+              <w:rPr>
+                <w:b w:val="0"/>
+                <w:sz w:val="19"/>
+              </w:rPr>
+              <w:t>¿Qué debe probar el SII?</w:t>
+            </w:r>
+          </w:p>
+        </w:tc>
+        <w:tc>
+          <w:tcPr>
+            <w:tcW w:type="dxa" w:w="3135"/>
+          </w:tcPr>
+          <w:p>
+            <w:r>
+              <w:rPr>
+                <w:b w:val="0"/>
+                <w:sz w:val="19"/>
+              </w:rPr>
+              <w:t>Ausencia de efectos jurídicos/económicos relevantes distintos del tributario</w:t>
+            </w:r>
+          </w:p>
+        </w:tc>
+        <w:tc>
+          <w:tcPr>
+            <w:tcW w:type="dxa" w:w="3135"/>
+          </w:tcPr>
+          <w:p>
+            <w:r>
+              <w:rPr>
+                <w:b w:val="0"/>
+                <w:sz w:val="19"/>
+              </w:rPr>
+              <w:t>Existencia de un acto oculto o disimulado</w:t>
+            </w:r>
+          </w:p>
+        </w:tc>
+      </w:tr>
+      <w:tr>
+        <w:tc>
+          <w:tcPr>
+            <w:tcW w:type="dxa" w:w="3135"/>
+            <w:shd w:val="clear" w:color="auto" w:fill="F4F6F9"/>
+          </w:tcPr>
+          <w:p>
+            <w:r>
+              <w:rPr>
+                <w:b w:val="0"/>
+                <w:sz w:val="19"/>
+              </w:rPr>
+              <w:t>¿Aplica al Caso 86?</w:t>
+            </w:r>
+          </w:p>
+        </w:tc>
+        <w:tc>
+          <w:tcPr>
+            <w:tcW w:type="dxa" w:w="3135"/>
+            <w:shd w:val="clear" w:color="auto" w:fill="F4F6F9"/>
+            <w:shd w:val="clear" w:color="auto" w:fill="E8F5E9"/>
+          </w:tcPr>
+          <w:p>
+            <w:r>
+              <w:rPr>
+                <w:b w:val="0"/>
+                <w:sz w:val="19"/>
+              </w:rPr>
+              <w:t>SÍ → B y C no aportan valor real; la sociedad sirve solo para diluir el IGC de Pedro</w:t>
+            </w:r>
+          </w:p>
+        </w:tc>
+        <w:tc>
+          <w:tcPr>
+            <w:tcW w:type="dxa" w:w="3135"/>
+            <w:shd w:val="clear" w:color="auto" w:fill="F4F6F9"/>
+            <w:shd w:val="clear" w:color="auto" w:fill="FBEAEA"/>
+          </w:tcPr>
+          <w:p>
+            <w:r>
+              <w:rPr>
+                <w:b w:val="0"/>
+                <w:sz w:val="19"/>
+              </w:rPr>
+              <w:t>NO → la sociedad y los socios son reales; no hay acto secreto que ocultar</w:t>
+            </w:r>
+          </w:p>
+        </w:tc>
+      </w:tr>
+    </w:tbl>
+    <w:p/>
+    <w:tbl>
+      <w:tblPr>
+        <w:tblW w:type="auto" w:w="0"/>
+        <w:jc w:val="center"/>
+        <w:tblLook w:firstColumn="1" w:firstRow="1" w:lastColumn="0" w:lastRow="0" w:noHBand="0" w:noVBand="1" w:val="04A0"/>
+      </w:tblPr>
+      <w:tblGrid>
+        <w:gridCol w:w="9406"/>
+      </w:tblGrid>
+      <w:tr>
+        <w:tc>
+          <w:tcPr>
+            <w:tcW w:type="dxa" w:w="9406"/>
+            <w:shd w:val="clear" w:color="auto" w:fill="EBF3FB"/>
+          </w:tcPr>
+          <w:p>
+            <w:pPr>
+              <w:spacing w:before="80" w:after="80"/>
+              <w:jc w:val="both"/>
+            </w:pPr>
+            <w:r>
+              <w:rPr>
+                <w:b/>
+                <w:color w:val="1A3A5C"/>
+                <w:sz w:val="21"/>
+              </w:rPr>
+              <w:t>CONCLUSIÓN DEL GRUPO: El Caso 86 es ABUSO de las formas jurídicas (Art. 4 ter CT). Los actos son reales pero se utiliza una figura societaria de forma inapropiada, sin sustancia económica real para B y C, con el único propósito de reducir el IGC de Pedro.</w:t>
             </w:r>
           </w:p>
         </w:tc>
@@ -748,31 +1338,7 @@
           <w:color w:val="1A3A5C"/>
           <w:sz w:val="24"/>
         </w:rPr>
-        <w:t>IV.  POSICIÓN DEL GRUPO</w:t>
-      </w:r>
-    </w:p>
-    <w:p>
-      <w:pPr>
-        <w:jc w:val="both"/>
-      </w:pPr>
-      <w:r>
-        <w:rPr>
-          <w:b/>
-          <w:sz w:val="21"/>
-        </w:rPr>
-        <w:t>Considerando el análisis jurídico precedente, el grupo sostiene la siguiente posición:</w:t>
-      </w:r>
-    </w:p>
-    <w:p>
-      <w:pPr>
-        <w:jc w:val="both"/>
-      </w:pPr>
-      <w:r>
-        <w:rPr>
-          <w:b/>
-          <w:sz w:val="21"/>
-        </w:rPr>
-        <w:t>El esquema descrito en el Caso 86 configura un ABUSO de las formas jurídicas en los términos del Art. 4 ter del Código Tributario. La constitución de la sociedad de profesionales D, sin que B y C ejerzan efectivamente labor profesional para ella, constituye una utilización inapropiada de una figura societaria especial, cuyo único efecto relevante es la reducción artificial de la carga tributaria de A en el IGC.</w:t>
+        <w:t>IV.  ¿POR QUÉ ES ABUSO? — LOS TRES ELEMENTOS DEL ART. 4 TER CT</w:t>
       </w:r>
     </w:p>
     <w:p>
@@ -782,61 +1348,573 @@
       <w:r>
         <w:rPr>
           <w:b w:val="0"/>
+          <w:i w:val="0"/>
           <w:sz w:val="21"/>
         </w:rPr>
-        <w:t>Fundamentos centrales de la posición:</w:t>
+        <w:t>El Art. 4 ter CT exige que concurran tres elementos. En el Caso 86, los tres están presentes:</w:t>
       </w:r>
     </w:p>
     <w:p>
       <w:pPr>
-        <w:pStyle w:val="ListBullet"/>
-        <w:spacing w:after="40"/>
-        <w:ind w:left="283"/>
+        <w:spacing w:before="120" w:after="40"/>
       </w:pPr>
       <w:r>
         <w:rPr>
-          <w:sz w:val="20"/>
+          <w:b/>
+          <w:color w:val="2E6DA4"/>
+          <w:sz w:val="22"/>
         </w:rPr>
-        <w:t>Incumplimiento de requisitos formales: D no califica como sociedad de profesionales según Circular N°21 de 1991 y N°50 de 2020 (no todos los socios ejercen su profesión para la sociedad).</w:t>
+        <w:t>Elemento 1 — Reducción de la obligación tributaria</w:t>
       </w:r>
     </w:p>
     <w:p>
       <w:pPr>
-        <w:pStyle w:val="ListBullet"/>
-        <w:spacing w:after="40"/>
-        <w:ind w:left="283"/>
+        <w:jc w:val="both"/>
       </w:pPr>
       <w:r>
         <w:rPr>
-          <w:sz w:val="20"/>
+          <w:b w:val="0"/>
+          <w:i w:val="0"/>
+          <w:sz w:val="21"/>
         </w:rPr>
-        <w:t>Inexistencia de motivo económico válido: la participación de B y C no tiene justificación económica fuera de la dilución del IGC de A. El capital aportado es insignificante frente a los ingresos.</w:t>
+        <w:t>Pedro, con ingresos de $300 millones, debería tributar en el tramo más alto del IGC. Con el esquema, cada socio declara solo $100 millones, cayendo en un tramo inferior. El ahorro fiscal no es consecuencia de planificación legítima, sino de fraccionar artificialmente un ingreso que económicamente pertenece solo a Pedro.</w:t>
       </w:r>
     </w:p>
     <w:p>
       <w:pPr>
-        <w:pStyle w:val="ListBullet"/>
-        <w:spacing w:after="40"/>
-        <w:ind w:left="283"/>
+        <w:spacing w:before="120" w:after="40"/>
       </w:pPr>
       <w:r>
         <w:rPr>
-          <w:sz w:val="20"/>
+          <w:b/>
+          <w:color w:val="2E6DA4"/>
+          <w:sz w:val="22"/>
         </w:rPr>
-        <w:t>Configuración del Art. 4 ter CT: se evita parcialmente el hecho gravado del IGC en su tramo marginal más alto, mediante un acto que no produce efectos jurídicos ni económicos relevantes distintos del meramente tributario.</w:t>
+        <w:t>Elemento 2 — Ausencia de efectos jurídicos o económicos relevantes</w:t>
       </w:r>
     </w:p>
     <w:p>
       <w:pPr>
-        <w:pStyle w:val="ListBullet"/>
-        <w:spacing w:after="40"/>
-        <w:ind w:left="283"/>
+        <w:jc w:val="both"/>
       </w:pPr>
       <w:r>
         <w:rPr>
-          <w:sz w:val="20"/>
+          <w:b w:val="0"/>
+          <w:i w:val="0"/>
+          <w:sz w:val="21"/>
         </w:rPr>
-        <w:t>Descarte de simulación (Art. 4 quáter): no existe divergencia entre voluntad real y declarada. Los actos son reales pero la forma es abusiva, no simulada.</w:t>
+        <w:t>¿Qué aportan realmente B y C a la sociedad D? Ninguna de las siguientes cosas:</w:t>
+      </w:r>
+    </w:p>
+    <w:tbl>
+      <w:tblPr>
+        <w:tblStyle w:val="LightGrid-Accent1"/>
+        <w:tblW w:type="auto" w:w="0"/>
+        <w:jc w:val="center"/>
+        <w:tblLook w:firstColumn="1" w:firstRow="1" w:lastColumn="0" w:lastRow="0" w:noHBand="0" w:noVBand="1" w:val="04A0"/>
+      </w:tblPr>
+      <w:tblGrid>
+        <w:gridCol w:w="4703"/>
+        <w:gridCol w:w="4703"/>
+      </w:tblGrid>
+      <w:tr>
+        <w:tc>
+          <w:tcPr>
+            <w:tcW w:type="dxa" w:w="4703"/>
+            <w:shd w:val="clear" w:color="auto" w:fill="1A3A5C"/>
+          </w:tcPr>
+          <w:p>
+            <w:r>
+              <w:rPr>
+                <w:b/>
+                <w:color w:val="FFFFFF"/>
+                <w:sz w:val="20"/>
+              </w:rPr>
+              <w:t>¿Aportan B y C...?</w:t>
+            </w:r>
+          </w:p>
+        </w:tc>
+        <w:tc>
+          <w:tcPr>
+            <w:tcW w:type="dxa" w:w="4703"/>
+            <w:shd w:val="clear" w:color="auto" w:fill="1A3A5C"/>
+          </w:tcPr>
+          <w:p>
+            <w:r>
+              <w:rPr>
+                <w:b/>
+                <w:color w:val="FFFFFF"/>
+                <w:sz w:val="20"/>
+              </w:rPr>
+              <w:t>Respuesta</w:t>
+            </w:r>
+          </w:p>
+        </w:tc>
+      </w:tr>
+      <w:tr>
+        <w:tc>
+          <w:tcPr>
+            <w:tcW w:type="dxa" w:w="4703"/>
+            <w:shd w:val="clear" w:color="auto" w:fill="FBEAEA"/>
+          </w:tcPr>
+          <w:p>
+            <w:r>
+              <w:rPr>
+                <w:b w:val="0"/>
+                <w:sz w:val="19"/>
+              </w:rPr>
+              <w:t>Servicios profesionales o atención de clientes</w:t>
+            </w:r>
+          </w:p>
+        </w:tc>
+        <w:tc>
+          <w:tcPr>
+            <w:tcW w:type="dxa" w:w="4703"/>
+            <w:shd w:val="clear" w:color="auto" w:fill="FBEAEA"/>
+          </w:tcPr>
+          <w:p>
+            <w:r>
+              <w:rPr>
+                <w:b w:val="0"/>
+                <w:sz w:val="19"/>
+              </w:rPr>
+              <w:t>✖  No. Solo Pedro trabaja.</w:t>
+            </w:r>
+          </w:p>
+        </w:tc>
+      </w:tr>
+      <w:tr>
+        <w:tc>
+          <w:tcPr>
+            <w:tcW w:type="dxa" w:w="4703"/>
+          </w:tcPr>
+          <w:p>
+            <w:r>
+              <w:rPr>
+                <w:b w:val="0"/>
+                <w:sz w:val="19"/>
+              </w:rPr>
+              <w:t>Capital significativo respecto a los ingresos</w:t>
+            </w:r>
+          </w:p>
+        </w:tc>
+        <w:tc>
+          <w:tcPr>
+            <w:tcW w:type="dxa" w:w="4703"/>
+          </w:tcPr>
+          <w:p>
+            <w:r>
+              <w:rPr>
+                <w:b w:val="0"/>
+                <w:sz w:val="19"/>
+              </w:rPr>
+              <w:t>✖  Capital simbólico; los ingresos son $300 MM.</w:t>
+            </w:r>
+          </w:p>
+        </w:tc>
+      </w:tr>
+      <w:tr>
+        <w:tc>
+          <w:tcPr>
+            <w:tcW w:type="dxa" w:w="4703"/>
+            <w:shd w:val="clear" w:color="auto" w:fill="FBEAEA"/>
+          </w:tcPr>
+          <w:p>
+            <w:r>
+              <w:rPr>
+                <w:b w:val="0"/>
+                <w:sz w:val="19"/>
+              </w:rPr>
+              <w:t>Clientela, contactos o cartera propia</w:t>
+            </w:r>
+          </w:p>
+        </w:tc>
+        <w:tc>
+          <w:tcPr>
+            <w:tcW w:type="dxa" w:w="4703"/>
+            <w:shd w:val="clear" w:color="auto" w:fill="FBEAEA"/>
+          </w:tcPr>
+          <w:p>
+            <w:r>
+              <w:rPr>
+                <w:b w:val="0"/>
+                <w:sz w:val="19"/>
+              </w:rPr>
+              <w:t>✖  No.</w:t>
+            </w:r>
+          </w:p>
+        </w:tc>
+      </w:tr>
+      <w:tr>
+        <w:tc>
+          <w:tcPr>
+            <w:tcW w:type="dxa" w:w="4703"/>
+          </w:tcPr>
+          <w:p>
+            <w:r>
+              <w:rPr>
+                <w:b w:val="0"/>
+                <w:sz w:val="19"/>
+              </w:rPr>
+              <w:t>Dirección estratégica o decisiones empresariales</w:t>
+            </w:r>
+          </w:p>
+        </w:tc>
+        <w:tc>
+          <w:tcPr>
+            <w:tcW w:type="dxa" w:w="4703"/>
+          </w:tcPr>
+          <w:p>
+            <w:r>
+              <w:rPr>
+                <w:b w:val="0"/>
+                <w:sz w:val="19"/>
+              </w:rPr>
+              <w:t>✖  No. Solo reciben retiros de utilidades.</w:t>
+            </w:r>
+          </w:p>
+        </w:tc>
+      </w:tr>
+    </w:tbl>
+    <w:p/>
+    <w:p>
+      <w:pPr>
+        <w:spacing w:before="120" w:after="40"/>
+      </w:pPr>
+      <w:r>
+        <w:rPr>
+          <w:b/>
+          <w:color w:val="2E6DA4"/>
+          <w:sz w:val="22"/>
+        </w:rPr>
+        <w:t>Elemento 3 — Forma jurídica inapropiada para el sustrato económico</w:t>
+      </w:r>
+    </w:p>
+    <w:p>
+      <w:pPr>
+        <w:jc w:val="both"/>
+      </w:pPr>
+      <w:r>
+        <w:rPr>
+          <w:b w:val="0"/>
+          <w:i w:val="0"/>
+          <w:sz w:val="21"/>
+        </w:rPr>
+        <w:t>La sociedad de profesionales es una figura creada para que varios profesionales se organicen conjuntamente. No está pensada para canalizar el trabajo individual de uno solo y repartir sus utilidades entre socios pasivos. Usar esa forma jurídica para ese propósito es exactamente lo que el Art. 4 ter CT define como abuso.</w:t>
+      </w:r>
+    </w:p>
+    <w:p>
+      <w:pPr>
+        <w:spacing w:before="200" w:after="80"/>
+        <w:pBdr>
+          <w:bottom w:val="single" w:sz="8" w:space="1" w:color="2E6DA4"/>
+        </w:pBdr>
+      </w:pPr>
+      <w:r>
+        <w:rPr>
+          <w:b/>
+          <w:color w:val="1A3A5C"/>
+          <w:sz w:val="24"/>
+        </w:rPr>
+        <w:t>V.  EFECTO TRIBUTARIO — EJEMPLO CON NÚMEROS</w:t>
+      </w:r>
+    </w:p>
+    <w:p>
+      <w:pPr>
+        <w:jc w:val="both"/>
+      </w:pPr>
+      <w:r>
+        <w:rPr>
+          <w:b w:val="0"/>
+          <w:i w:val="0"/>
+          <w:sz w:val="21"/>
+        </w:rPr>
+        <w:t>Para ilustrar el perjuicio fiscal, consideremos a Pedro con honorarios anuales de $300 MM y una tabla simplificada del IGC. Los tramos son aproximados a efectos ilustrativos:</w:t>
+      </w:r>
+    </w:p>
+    <w:tbl>
+      <w:tblPr>
+        <w:tblStyle w:val="LightGrid-Accent1"/>
+        <w:tblW w:type="auto" w:w="0"/>
+        <w:jc w:val="center"/>
+        <w:tblLook w:firstColumn="1" w:firstRow="1" w:lastColumn="0" w:lastRow="0" w:noHBand="0" w:noVBand="1" w:val="04A0"/>
+      </w:tblPr>
+      <w:tblGrid>
+        <w:gridCol w:w="2351"/>
+        <w:gridCol w:w="2351"/>
+        <w:gridCol w:w="2351"/>
+        <w:gridCol w:w="2351"/>
+      </w:tblGrid>
+      <w:tr>
+        <w:tc>
+          <w:tcPr>
+            <w:tcW w:type="dxa" w:w="2351"/>
+            <w:shd w:val="clear" w:color="auto" w:fill="1A3A5C"/>
+          </w:tcPr>
+          <w:p>
+            <w:r>
+              <w:rPr>
+                <w:b/>
+                <w:color w:val="FFFFFF"/>
+                <w:sz w:val="20"/>
+              </w:rPr>
+              <w:t>Escenario</w:t>
+            </w:r>
+          </w:p>
+        </w:tc>
+        <w:tc>
+          <w:tcPr>
+            <w:tcW w:type="dxa" w:w="2351"/>
+            <w:shd w:val="clear" w:color="auto" w:fill="1A3A5C"/>
+          </w:tcPr>
+          <w:p>
+            <w:r>
+              <w:rPr>
+                <w:b/>
+                <w:color w:val="FFFFFF"/>
+                <w:sz w:val="20"/>
+              </w:rPr>
+              <w:t>Renta declarada por Pedro</w:t>
+            </w:r>
+          </w:p>
+        </w:tc>
+        <w:tc>
+          <w:tcPr>
+            <w:tcW w:type="dxa" w:w="2351"/>
+            <w:shd w:val="clear" w:color="auto" w:fill="1A3A5C"/>
+          </w:tcPr>
+          <w:p>
+            <w:r>
+              <w:rPr>
+                <w:b/>
+                <w:color w:val="FFFFFF"/>
+                <w:sz w:val="20"/>
+              </w:rPr>
+              <w:t>Tramo IGC aplicable</w:t>
+            </w:r>
+          </w:p>
+        </w:tc>
+        <w:tc>
+          <w:tcPr>
+            <w:tcW w:type="dxa" w:w="2351"/>
+            <w:shd w:val="clear" w:color="auto" w:fill="1A3A5C"/>
+          </w:tcPr>
+          <w:p>
+            <w:r>
+              <w:rPr>
+                <w:b/>
+                <w:color w:val="FFFFFF"/>
+                <w:sz w:val="20"/>
+              </w:rPr>
+              <w:t>Resultado</w:t>
+            </w:r>
+          </w:p>
+        </w:tc>
+      </w:tr>
+      <w:tr>
+        <w:tc>
+          <w:tcPr>
+            <w:tcW w:type="dxa" w:w="2351"/>
+            <w:shd w:val="clear" w:color="auto" w:fill="EBF3FB"/>
+          </w:tcPr>
+          <w:p>
+            <w:r>
+              <w:rPr>
+                <w:b w:val="0"/>
+                <w:sz w:val="19"/>
+              </w:rPr>
+              <w:t>Sin esquema</w:t>
+              <w:br/>
+              <w:t>(Pedro trabaja solo)</w:t>
+            </w:r>
+          </w:p>
+        </w:tc>
+        <w:tc>
+          <w:tcPr>
+            <w:tcW w:type="dxa" w:w="2351"/>
+            <w:shd w:val="clear" w:color="auto" w:fill="EBF3FB"/>
+          </w:tcPr>
+          <w:p>
+            <w:r>
+              <w:rPr>
+                <w:b w:val="0"/>
+                <w:sz w:val="19"/>
+              </w:rPr>
+              <w:t>$300 MM (Pedro declara todo)</w:t>
+            </w:r>
+          </w:p>
+        </w:tc>
+        <w:tc>
+          <w:tcPr>
+            <w:tcW w:type="dxa" w:w="2351"/>
+            <w:shd w:val="clear" w:color="auto" w:fill="EBF3FB"/>
+          </w:tcPr>
+          <w:p>
+            <w:r>
+              <w:rPr>
+                <w:b w:val="0"/>
+                <w:sz w:val="19"/>
+              </w:rPr>
+              <w:t>Tramo ≈ 40% (tramo máximo)</w:t>
+            </w:r>
+          </w:p>
+        </w:tc>
+        <w:tc>
+          <w:tcPr>
+            <w:tcW w:type="dxa" w:w="2351"/>
+            <w:shd w:val="clear" w:color="auto" w:fill="EBF3FB"/>
+          </w:tcPr>
+          <w:p>
+            <w:r>
+              <w:rPr>
+                <w:b w:val="0"/>
+                <w:sz w:val="19"/>
+              </w:rPr>
+              <w:t>Pedro paga IGC alto</w:t>
+            </w:r>
+          </w:p>
+        </w:tc>
+      </w:tr>
+      <w:tr>
+        <w:tc>
+          <w:tcPr>
+            <w:tcW w:type="dxa" w:w="2351"/>
+            <w:shd w:val="clear" w:color="auto" w:fill="FBEAEA"/>
+          </w:tcPr>
+          <w:p>
+            <w:r>
+              <w:rPr>
+                <w:b w:val="0"/>
+                <w:sz w:val="19"/>
+              </w:rPr>
+              <w:t>Con esquema D</w:t>
+              <w:br/>
+              <w:t>(3 socios iguales)</w:t>
+            </w:r>
+          </w:p>
+        </w:tc>
+        <w:tc>
+          <w:tcPr>
+            <w:tcW w:type="dxa" w:w="2351"/>
+            <w:shd w:val="clear" w:color="auto" w:fill="FBEAEA"/>
+          </w:tcPr>
+          <w:p>
+            <w:r>
+              <w:rPr>
+                <w:b w:val="0"/>
+                <w:sz w:val="19"/>
+              </w:rPr>
+              <w:t>$100 MM (Pedro · B · C, c/u declara 1/3)</w:t>
+            </w:r>
+          </w:p>
+        </w:tc>
+        <w:tc>
+          <w:tcPr>
+            <w:tcW w:type="dxa" w:w="2351"/>
+            <w:shd w:val="clear" w:color="auto" w:fill="FBEAEA"/>
+          </w:tcPr>
+          <w:p>
+            <w:r>
+              <w:rPr>
+                <w:b w:val="0"/>
+                <w:sz w:val="19"/>
+              </w:rPr>
+              <w:t>Cada socio en tramo ≈ 23–35%</w:t>
+            </w:r>
+          </w:p>
+        </w:tc>
+        <w:tc>
+          <w:tcPr>
+            <w:tcW w:type="dxa" w:w="2351"/>
+            <w:shd w:val="clear" w:color="auto" w:fill="FBEAEA"/>
+          </w:tcPr>
+          <w:p>
+            <w:r>
+              <w:rPr>
+                <w:b w:val="0"/>
+                <w:sz w:val="19"/>
+              </w:rPr>
+              <w:t>Ahorro artificial del IGC de Pedro</w:t>
+            </w:r>
+          </w:p>
+        </w:tc>
+      </w:tr>
+      <w:tr>
+        <w:tc>
+          <w:tcPr>
+            <w:tcW w:type="dxa" w:w="2351"/>
+            <w:shd w:val="clear" w:color="auto" w:fill="FDE9D9"/>
+          </w:tcPr>
+          <w:p>
+            <w:r>
+              <w:rPr>
+                <w:b w:val="0"/>
+                <w:sz w:val="19"/>
+              </w:rPr>
+              <w:t>Diferencial estimado</w:t>
+            </w:r>
+          </w:p>
+        </w:tc>
+        <w:tc>
+          <w:tcPr>
+            <w:tcW w:type="dxa" w:w="2351"/>
+            <w:shd w:val="clear" w:color="auto" w:fill="FDE9D9"/>
+          </w:tcPr>
+          <w:p>
+            <w:r>
+              <w:rPr>
+                <w:b w:val="0"/>
+                <w:sz w:val="19"/>
+              </w:rPr>
+              <w:t>Pedro genera el 100% de los $300 MM</w:t>
+            </w:r>
+          </w:p>
+        </w:tc>
+        <w:tc>
+          <w:tcPr>
+            <w:tcW w:type="dxa" w:w="2351"/>
+            <w:shd w:val="clear" w:color="auto" w:fill="FDE9D9"/>
+          </w:tcPr>
+          <w:p>
+            <w:r>
+              <w:rPr>
+                <w:b w:val="0"/>
+                <w:sz w:val="19"/>
+              </w:rPr>
+              <w:t>Diferencia de tramos = ahorro real</w:t>
+            </w:r>
+          </w:p>
+        </w:tc>
+        <w:tc>
+          <w:tcPr>
+            <w:tcW w:type="dxa" w:w="2351"/>
+            <w:shd w:val="clear" w:color="auto" w:fill="FDE9D9"/>
+          </w:tcPr>
+          <w:p>
+            <w:r>
+              <w:rPr>
+                <w:b w:val="0"/>
+                <w:sz w:val="19"/>
+              </w:rPr>
+              <w:t>PERJUICIO FISCAL → ABUSO</w:t>
+            </w:r>
+          </w:p>
+        </w:tc>
+      </w:tr>
+    </w:tbl>
+    <w:p/>
+    <w:p>
+      <w:pPr>
+        <w:jc w:val="both"/>
+      </w:pPr>
+      <w:r>
+        <w:rPr>
+          <w:b/>
+          <w:i w:val="0"/>
+          <w:color w:val="B03030"/>
+          <w:sz w:val="21"/>
+        </w:rPr>
+        <w:t>Si el SII aplica exitosamente el Art. 4 quinquies CT, el efecto para Pedro es: (1) se le atribuye el total de $300 MM para su IGC; (2) se aplican intereses y multas sobre la diferencia de impuestos no pagados; (3) los retiros percibidos por B y C son recalificados en su propio IGC según corresponda.</w:t>
       </w:r>
     </w:p>
     <w:p>
@@ -857,7 +1935,7 @@
           <w:color w:val="1A3A5C"/>
           <w:sz w:val="24"/>
         </w:rPr>
-        <w:t>V.  ALTERNATIVAS DE SOLUCIÓN AL CASO</w:t>
+        <w:t>VI.  ¿QUÉ PUEDE HACER PEDRO? — ALTERNATIVAS LEGÍTIMAS</w:t>
       </w:r>
     </w:p>
     <w:p>
@@ -867,136 +1945,315 @@
       <w:r>
         <w:rPr>
           <w:b w:val="0"/>
+          <w:i w:val="0"/>
           <w:sz w:val="21"/>
         </w:rPr>
-        <w:t>El grupo propone las siguientes alternativas legítimas de estructuración tributaria que permitirían al contribuyente A organizar su actividad profesional sin incurrir en abuso de formas jurídicas:</w:t>
+        <w:t>El problema no es ejercer como sociedad, sino hacerlo de forma que carezca de sustancia económica real. Existen alternativas legítimas que Pedro puede adoptar sin exponerse a NGA:</w:t>
       </w:r>
     </w:p>
-    <w:p>
-      <w:pPr>
-        <w:spacing w:before="160" w:after="60"/>
-      </w:pPr>
-      <w:r>
-        <w:rPr>
-          <w:b/>
-          <w:color w:val="2E6DA4"/>
-          <w:sz w:val="22"/>
-        </w:rPr>
-        <w:t>Alternativa 1: Tributación directa como profesional independiente (Art. 42 N°2 LIR)</w:t>
-      </w:r>
-    </w:p>
-    <w:p>
-      <w:pPr>
-        <w:jc w:val="both"/>
-      </w:pPr>
-      <w:r>
-        <w:rPr>
-          <w:b w:val="0"/>
-          <w:sz w:val="21"/>
-        </w:rPr>
-        <w:t>El socio A puede ejercer su actividad profesional como persona natural independiente, emitiendo boletas de honorarios y declarando sus ingresos en segunda categoría. Tendrá derecho a deducir gastos efectivos o a optar por gastos presuntos (30% con tope de 15 UTA). Pagará IGC sobre la totalidad de los ingresos según tabla progresiva. Esta opción es la más simple y libre de cuestionamientos.</w:t>
-      </w:r>
-    </w:p>
-    <w:p>
-      <w:pPr>
-        <w:spacing w:before="160" w:after="60"/>
-      </w:pPr>
-      <w:r>
-        <w:rPr>
-          <w:b/>
-          <w:color w:val="2E6DA4"/>
-          <w:sz w:val="22"/>
-        </w:rPr>
-        <w:t>Alternativa 2: Constitución de sociedad de profesionales con socios que efectivamente trabajen</w:t>
-      </w:r>
-    </w:p>
-    <w:p>
-      <w:pPr>
-        <w:jc w:val="both"/>
-      </w:pPr>
-      <w:r>
-        <w:rPr>
-          <w:b w:val="0"/>
-          <w:sz w:val="21"/>
-        </w:rPr>
-        <w:t>Si A tiene voluntad de asociarse con otros profesionales, debe hacerlo con personas que efectivamente ejerzan su profesión para la sociedad. Cada socio debe coadyuvar a la prestación del servicio profesional. En tal caso, D calificaría legítimamente como sociedad de profesionales, podrá optar por tributar en primera o segunda categoría, y la distribución de utilidades reflejará el trabajo aportado por cada uno.</w:t>
-      </w:r>
-    </w:p>
-    <w:p>
-      <w:pPr>
-        <w:spacing w:before="160" w:after="60"/>
-      </w:pPr>
-      <w:r>
-        <w:rPr>
-          <w:b/>
-          <w:color w:val="2E6DA4"/>
-          <w:sz w:val="22"/>
-        </w:rPr>
-        <w:t>Alternativa 3: Distribución de utilidades proporcional al trabajo realmente prestado</w:t>
-      </w:r>
-    </w:p>
-    <w:p>
-      <w:pPr>
-        <w:jc w:val="both"/>
-      </w:pPr>
-      <w:r>
-        <w:rPr>
-          <w:b w:val="0"/>
-          <w:sz w:val="21"/>
-        </w:rPr>
-        <w:t>Si la sociedad se mantiene con A, B y C como socios, los estatutos pueden contemplar una distribución diferenciada de utilidades que reconozca la mayor contribución de A. Esto puede instrumentarse mediante: (i) participación social diferenciada (ej.: A 90%, B y C 5% cada uno) o (ii) sueldo patronal a A por el trabajo prestado, antes de repartir utilidades. La distribución debe reflejar la realidad económica del aporte.</w:t>
-      </w:r>
-    </w:p>
-    <w:p>
-      <w:pPr>
-        <w:spacing w:before="160" w:after="60"/>
-      </w:pPr>
-      <w:r>
-        <w:rPr>
-          <w:b/>
-          <w:color w:val="2E6DA4"/>
-          <w:sz w:val="22"/>
-        </w:rPr>
-        <w:t>Alternativa 4: Sociedad por acciones (SpA) con régimen Pro Pyme 14D N°3</w:t>
-      </w:r>
-    </w:p>
-    <w:p>
-      <w:pPr>
-        <w:jc w:val="both"/>
-      </w:pPr>
-      <w:r>
-        <w:rPr>
-          <w:b w:val="0"/>
-          <w:sz w:val="21"/>
-        </w:rPr>
-        <w:t>Constituir una SpA acogida al régimen 14D N°3 (Pro Pyme General) con tasa IDPC del 25%, siempre que A sea el único accionista o que los demás accionistas tengan rol efectivamente económico. La SpA no tiene la restricción de la sociedad de profesionales pero exige sustancia económica real. Permite planificación de retiros y reinversión.</w:t>
-      </w:r>
-    </w:p>
-    <w:p>
-      <w:pPr>
-        <w:spacing w:before="160" w:after="60"/>
-      </w:pPr>
-      <w:r>
-        <w:rPr>
-          <w:b/>
-          <w:color w:val="2E6DA4"/>
-          <w:sz w:val="22"/>
-        </w:rPr>
-        <w:t>Alternativa 5: Régimen Pro Pyme Transparente 14D N°8</w:t>
-      </w:r>
-    </w:p>
-    <w:p>
-      <w:pPr>
-        <w:jc w:val="both"/>
-      </w:pPr>
-      <w:r>
-        <w:rPr>
-          <w:b w:val="0"/>
-          <w:sz w:val="21"/>
-        </w:rPr>
-        <w:t>Si los socios son únicamente personas naturales, evaluar el régimen 14D N°8 (Transparencia Tributaria). La empresa no paga IDPC; los socios tributan directamente con IGC sobre su participación. Sin embargo, ATENCIÓN: este régimen no soluciona el problema de fondo si los socios B y C siguen siendo ficticios — el SII puede igualmente aplicar NGA. Solo es válida si B y C efectivamente aportan trabajo o sustancia económica.</w:t>
-      </w:r>
-    </w:p>
+    <w:tbl>
+      <w:tblPr>
+        <w:tblStyle w:val="LightGrid-Accent1"/>
+        <w:tblW w:type="auto" w:w="0"/>
+        <w:jc w:val="center"/>
+        <w:tblLook w:firstColumn="1" w:firstRow="1" w:lastColumn="0" w:lastRow="0" w:noHBand="0" w:noVBand="1" w:val="04A0"/>
+      </w:tblPr>
+      <w:tblGrid>
+        <w:gridCol w:w="3135"/>
+        <w:gridCol w:w="3135"/>
+        <w:gridCol w:w="3135"/>
+      </w:tblGrid>
+      <w:tr>
+        <w:tc>
+          <w:tcPr>
+            <w:tcW w:type="dxa" w:w="3135"/>
+            <w:shd w:val="clear" w:color="auto" w:fill="1A3A5C"/>
+          </w:tcPr>
+          <w:p>
+            <w:r>
+              <w:rPr>
+                <w:b/>
+                <w:color w:val="FFFFFF"/>
+                <w:sz w:val="20"/>
+              </w:rPr>
+              <w:t>Alternativa</w:t>
+            </w:r>
+          </w:p>
+        </w:tc>
+        <w:tc>
+          <w:tcPr>
+            <w:tcW w:type="dxa" w:w="3135"/>
+            <w:shd w:val="clear" w:color="auto" w:fill="1A3A5C"/>
+          </w:tcPr>
+          <w:p>
+            <w:r>
+              <w:rPr>
+                <w:b/>
+                <w:color w:val="FFFFFF"/>
+                <w:sz w:val="20"/>
+              </w:rPr>
+              <w:t>¿En qué consiste?</w:t>
+            </w:r>
+          </w:p>
+        </w:tc>
+        <w:tc>
+          <w:tcPr>
+            <w:tcW w:type="dxa" w:w="3135"/>
+            <w:shd w:val="clear" w:color="auto" w:fill="1A3A5C"/>
+          </w:tcPr>
+          <w:p>
+            <w:r>
+              <w:rPr>
+                <w:b/>
+                <w:color w:val="FFFFFF"/>
+                <w:sz w:val="20"/>
+              </w:rPr>
+              <w:t>Ventaja / Condición</w:t>
+            </w:r>
+          </w:p>
+        </w:tc>
+      </w:tr>
+      <w:tr>
+        <w:tc>
+          <w:tcPr>
+            <w:tcW w:type="dxa" w:w="3135"/>
+            <w:shd w:val="clear" w:color="auto" w:fill="F4F6F9"/>
+          </w:tcPr>
+          <w:p>
+            <w:r>
+              <w:rPr>
+                <w:b w:val="0"/>
+                <w:sz w:val="19"/>
+              </w:rPr>
+              <w:t>Alt. 1</w:t>
+              <w:br/>
+              <w:t>Profesional independiente</w:t>
+            </w:r>
+          </w:p>
+        </w:tc>
+        <w:tc>
+          <w:tcPr>
+            <w:tcW w:type="dxa" w:w="3135"/>
+            <w:shd w:val="clear" w:color="auto" w:fill="F4F6F9"/>
+          </w:tcPr>
+          <w:p>
+            <w:r>
+              <w:rPr>
+                <w:b w:val="0"/>
+                <w:sz w:val="19"/>
+              </w:rPr>
+              <w:t>Pedro emite boletas de honorarios directamente. Paga IGC sobre sus ingresos. Puede deducir gastos efectivos o presuntos (30%, tope 15 UTA).</w:t>
+            </w:r>
+          </w:p>
+        </w:tc>
+        <w:tc>
+          <w:tcPr>
+            <w:tcW w:type="dxa" w:w="3135"/>
+            <w:shd w:val="clear" w:color="auto" w:fill="F4F6F9"/>
+          </w:tcPr>
+          <w:p>
+            <w:r>
+              <w:rPr>
+                <w:b w:val="0"/>
+                <w:sz w:val="19"/>
+              </w:rPr>
+              <w:t>Sencillo, sin riesgo de NGA. Sin beneficio societario.</w:t>
+            </w:r>
+          </w:p>
+        </w:tc>
+      </w:tr>
+      <w:tr>
+        <w:tc>
+          <w:tcPr>
+            <w:tcW w:type="dxa" w:w="3135"/>
+          </w:tcPr>
+          <w:p>
+            <w:r>
+              <w:rPr>
+                <w:b w:val="0"/>
+                <w:sz w:val="19"/>
+              </w:rPr>
+              <w:t>Alt. 2</w:t>
+              <w:br/>
+              <w:t>Sociedad con socios que trabajen</w:t>
+            </w:r>
+          </w:p>
+        </w:tc>
+        <w:tc>
+          <w:tcPr>
+            <w:tcW w:type="dxa" w:w="3135"/>
+          </w:tcPr>
+          <w:p>
+            <w:r>
+              <w:rPr>
+                <w:b w:val="0"/>
+                <w:sz w:val="19"/>
+              </w:rPr>
+              <w:t>Pedro se asocia con otros médicos u otros profesionales que efectivamente atiendan pacientes o presten servicios para la sociedad.</w:t>
+            </w:r>
+          </w:p>
+        </w:tc>
+        <w:tc>
+          <w:tcPr>
+            <w:tcW w:type="dxa" w:w="3135"/>
+          </w:tcPr>
+          <w:p>
+            <w:r>
+              <w:rPr>
+                <w:b w:val="0"/>
+                <w:sz w:val="19"/>
+              </w:rPr>
+              <w:t>Califica legítimamente como sociedad de profesionales. La distribución de utilidades refleja trabajo real.</w:t>
+            </w:r>
+          </w:p>
+        </w:tc>
+      </w:tr>
+      <w:tr>
+        <w:tc>
+          <w:tcPr>
+            <w:tcW w:type="dxa" w:w="3135"/>
+            <w:shd w:val="clear" w:color="auto" w:fill="F4F6F9"/>
+          </w:tcPr>
+          <w:p>
+            <w:r>
+              <w:rPr>
+                <w:b w:val="0"/>
+                <w:sz w:val="19"/>
+              </w:rPr>
+              <w:t>Alt. 3</w:t>
+              <w:br/>
+              <w:t>Distribución proporcional al trabajo</w:t>
+            </w:r>
+          </w:p>
+        </w:tc>
+        <w:tc>
+          <w:tcPr>
+            <w:tcW w:type="dxa" w:w="3135"/>
+            <w:shd w:val="clear" w:color="auto" w:fill="F4F6F9"/>
+          </w:tcPr>
+          <w:p>
+            <w:r>
+              <w:rPr>
+                <w:b w:val="0"/>
+                <w:sz w:val="19"/>
+              </w:rPr>
+              <w:t>Si D se mantiene con A, B y C, los estatutos establecen que Pedro recibe el 90% de las utilidades, y B y C un 5% cada uno, acorde a su aporte real.</w:t>
+            </w:r>
+          </w:p>
+        </w:tc>
+        <w:tc>
+          <w:tcPr>
+            <w:tcW w:type="dxa" w:w="3135"/>
+            <w:shd w:val="clear" w:color="auto" w:fill="F4F6F9"/>
+          </w:tcPr>
+          <w:p>
+            <w:r>
+              <w:rPr>
+                <w:b w:val="0"/>
+                <w:sz w:val="19"/>
+              </w:rPr>
+              <w:t>Debe existir aporte efectivo de B y C, aunque sea menor. La distribución debe ser económicamente justificada.</w:t>
+            </w:r>
+          </w:p>
+        </w:tc>
+      </w:tr>
+      <w:tr>
+        <w:tc>
+          <w:tcPr>
+            <w:tcW w:type="dxa" w:w="3135"/>
+          </w:tcPr>
+          <w:p>
+            <w:r>
+              <w:rPr>
+                <w:b w:val="0"/>
+                <w:sz w:val="19"/>
+              </w:rPr>
+              <w:t>Alt. 4</w:t>
+              <w:br/>
+              <w:t>SpA régimen Pro Pyme (14D N°3)</w:t>
+            </w:r>
+          </w:p>
+        </w:tc>
+        <w:tc>
+          <w:tcPr>
+            <w:tcW w:type="dxa" w:w="3135"/>
+          </w:tcPr>
+          <w:p>
+            <w:r>
+              <w:rPr>
+                <w:b w:val="0"/>
+                <w:sz w:val="19"/>
+              </w:rPr>
+              <w:t>Constituir SpA con Pedro como único accionista. Tributación de la empresa al 25% de IDPC; Pedro paga IGC sobre retiros. Permite reinversión y planificación.</w:t>
+            </w:r>
+          </w:p>
+        </w:tc>
+        <w:tc>
+          <w:tcPr>
+            <w:tcW w:type="dxa" w:w="3135"/>
+          </w:tcPr>
+          <w:p>
+            <w:r>
+              <w:rPr>
+                <w:b w:val="0"/>
+                <w:sz w:val="19"/>
+              </w:rPr>
+              <w:t>No tiene restricciones de sociedad de profesionales. Requiere sustancia económica en la sociedad.</w:t>
+            </w:r>
+          </w:p>
+        </w:tc>
+      </w:tr>
+      <w:tr>
+        <w:tc>
+          <w:tcPr>
+            <w:tcW w:type="dxa" w:w="3135"/>
+            <w:shd w:val="clear" w:color="auto" w:fill="F4F6F9"/>
+          </w:tcPr>
+          <w:p>
+            <w:r>
+              <w:rPr>
+                <w:b w:val="0"/>
+                <w:sz w:val="19"/>
+              </w:rPr>
+              <w:t>Alt. 5</w:t>
+              <w:br/>
+              <w:t>Régimen Transparente (14D N°8)</w:t>
+            </w:r>
+          </w:p>
+        </w:tc>
+        <w:tc>
+          <w:tcPr>
+            <w:tcW w:type="dxa" w:w="3135"/>
+            <w:shd w:val="clear" w:color="auto" w:fill="F4F6F9"/>
+          </w:tcPr>
+          <w:p>
+            <w:r>
+              <w:rPr>
+                <w:b w:val="0"/>
+                <w:sz w:val="19"/>
+              </w:rPr>
+              <w:t>Si los socios son solo personas naturales, la empresa no paga IDPC; cada socio paga IGC directo sobre su participación.</w:t>
+            </w:r>
+          </w:p>
+        </w:tc>
+        <w:tc>
+          <w:tcPr>
+            <w:tcW w:type="dxa" w:w="3135"/>
+            <w:shd w:val="clear" w:color="auto" w:fill="F4F6F9"/>
+          </w:tcPr>
+          <w:p>
+            <w:r>
+              <w:rPr>
+                <w:b w:val="0"/>
+                <w:sz w:val="19"/>
+              </w:rPr>
+              <w:t>ATENCIÓN: no soluciona el problema si B y C siguen sin aportar valor real. Solo válido con socios con sustancia.</w:t>
+            </w:r>
+          </w:p>
+        </w:tc>
+      </w:tr>
+    </w:tbl>
+    <w:p/>
     <w:p>
       <w:pPr>
         <w:spacing w:before="200" w:after="80"/>
@@ -1010,7 +2267,20 @@
           <w:color w:val="1A3A5C"/>
           <w:sz w:val="24"/>
         </w:rPr>
-        <w:t>VI.  CONCLUSIONES</w:t>
+        <w:t>VII.  CONCLUSIONES</w:t>
+      </w:r>
+    </w:p>
+    <w:p>
+      <w:pPr>
+        <w:spacing w:before="120" w:after="40"/>
+      </w:pPr>
+      <w:r>
+        <w:rPr>
+          <w:b/>
+          <w:color w:val="1A3A5C"/>
+          <w:sz w:val="22"/>
+        </w:rPr>
+        <w:t>1. ABUSO, no simulación.</w:t>
       </w:r>
     </w:p>
     <w:p>
@@ -1020,9 +2290,23 @@
       <w:r>
         <w:rPr>
           <w:b w:val="0"/>
+          <w:i w:val="0"/>
           <w:sz w:val="21"/>
         </w:rPr>
-        <w:t>1. El esquema descrito en el Caso 86 del Catálogo SII 2025 corresponde a un ABUSO de las formas jurídicas conforme al Art. 4 ter del Código Tributario. NO se trata de simulación, ya que los actos jurídicos son reales aunque inapropiados.</w:t>
+        <w:t>El Caso 86 configura un abuso de las formas jurídicas (Art. 4 ter CT). La sociedad y los socios son reales, pero la forma es inapropiada: no hay sustancia económica en B y C. No hay acto secreto, por lo tanto no es simulación.</w:t>
+      </w:r>
+    </w:p>
+    <w:p>
+      <w:pPr>
+        <w:spacing w:before="120" w:after="40"/>
+      </w:pPr>
+      <w:r>
+        <w:rPr>
+          <w:b/>
+          <w:color w:val="1A3A5C"/>
+          <w:sz w:val="22"/>
+        </w:rPr>
+        <w:t>2. La sociedad D no califica.</w:t>
       </w:r>
     </w:p>
     <w:p>
@@ -1032,9 +2316,23 @@
       <w:r>
         <w:rPr>
           <w:b w:val="0"/>
+          <w:i w:val="0"/>
           <w:sz w:val="21"/>
         </w:rPr>
-        <w:t>2. La sociedad D no califica como sociedad de profesionales conforme a las Circulares N°21 de 1991 y N°50 de 2020, dado que B y C no ejercen sus profesiones para ella. Esta sola circunstancia ya genera un problema formal que cuestiona la opción de tributar en primera categoría.</w:t>
+        <w:t>Por incumplimiento de los requisitos de las Circulares N°21/1991 y N°50/2020 (no todos los socios ejercen su profesión para la sociedad), D no es una sociedad de profesionales legítima bajo el Art. 42 N°2 LIR.</w:t>
+      </w:r>
+    </w:p>
+    <w:p>
+      <w:pPr>
+        <w:spacing w:before="120" w:after="40"/>
+      </w:pPr>
+      <w:r>
+        <w:rPr>
+          <w:b/>
+          <w:color w:val="1A3A5C"/>
+          <w:sz w:val="22"/>
+        </w:rPr>
+        <w:t>3. El SII puede actuar.</w:t>
       </w:r>
     </w:p>
     <w:p>
@@ -1044,9 +2342,23 @@
       <w:r>
         <w:rPr>
           <w:b w:val="0"/>
+          <w:i w:val="0"/>
           <w:sz w:val="21"/>
         </w:rPr>
-        <w:t>3. El SII, a requerimiento del Director, puede solicitar al Tribunal Tributario y Aduanero la declaración de abuso conforme al Art. 4 quinquies CT, con el efecto de recalificar el esquema y atribuir la totalidad de los ingresos a A para el cálculo del IGC, con los correspondientes intereses y multas.</w:t>
+        <w:t>Acreditados los elementos del Art. 4 ter CT, el Director puede requerir al TTA la declaración de abuso (Art. 4 quinquies CT). El efecto: atribución íntegra de los $300 MM a Pedro para su IGC, más intereses y multas.</w:t>
+      </w:r>
+    </w:p>
+    <w:p>
+      <w:pPr>
+        <w:spacing w:before="120" w:after="40"/>
+      </w:pPr>
+      <w:r>
+        <w:rPr>
+          <w:b/>
+          <w:color w:val="1A3A5C"/>
+          <w:sz w:val="22"/>
+        </w:rPr>
+        <w:t>4. Hay soluciones legítimas.</w:t>
       </w:r>
     </w:p>
     <w:p>
@@ -1056,9 +2368,23 @@
       <w:r>
         <w:rPr>
           <w:b w:val="0"/>
+          <w:i w:val="0"/>
           <w:sz w:val="21"/>
         </w:rPr>
-        <w:t>4. Existen alternativas legítimas de organización tributaria que el contribuyente A puede adoptar, según se ha expuesto en la sección V. La elección dependerá de la estrategia de negocio, las proyecciones de ingresos, la composición real del equipo profesional y los objetivos de planificación de retiros.</w:t>
+        <w:t>Pedro puede organizar su actividad profesional a través de una sociedad, siempre que los socios tengan rol económico real y la distribución de utilidades refleje el aporte efectivo de cada uno.</w:t>
+      </w:r>
+    </w:p>
+    <w:p>
+      <w:pPr>
+        <w:spacing w:before="120" w:after="40"/>
+      </w:pPr>
+      <w:r>
+        <w:rPr>
+          <w:b/>
+          <w:color w:val="B03030"/>
+          <w:sz w:val="22"/>
+        </w:rPr>
+        <w:t>5. El mensaje del caso es claro.</w:t>
       </w:r>
     </w:p>
     <w:p>
@@ -1068,9 +2394,10 @@
       <w:r>
         <w:rPr>
           <w:b/>
+          <w:i w:val="0"/>
           <w:sz w:val="21"/>
         </w:rPr>
-        <w:t>5. Recomendación final: en una eventual fiscalización, el contribuyente debe estar preparado para acreditar la sustancia económica real del esquema. La sola existencia formal de la sociedad y de los socios B y C no será suficiente; el SII y los tribunales exigirán demostración del aporte efectivo de cada socio.</w:t>
+        <w:t>El Derecho Tributario chileno acepta la planificación, pero exige que la forma jurídica tenga una justificación económica real más allá del ahorro fiscal. La NGA actúa precisamente cuando esa justificación no existe.</w:t>
       </w:r>
     </w:p>
     <w:p/>
@@ -1081,9 +2408,8 @@
       <w:r>
         <w:rPr>
           <w:color w:val="2E6DA4"/>
-          <w:sz w:val="16"/>
         </w:rPr>
-        <w:t>________________________________________________________________________________</w:t>
+        <w:t>────────────────────────────────────────────────────────────────────────────────</w:t>
       </w:r>
     </w:p>
     <w:p>
@@ -1096,9 +2422,11 @@
           <w:color w:val="555555"/>
           <w:sz w:val="16"/>
         </w:rPr>
-        <w:t>Magíster en Dirección Tributaria — UVM · Caso 86 · Catálogo SII 2025</w:t>
+        <w:t>Grupo 4: Andrea Añasco · Gema Sepúlveda · Karen Rebolledo · Nicolás Muñoz</w:t>
         <w:br/>
-        <w:t>Fuentes: DL 824 (LIR Art. 42 N°2); Código Tributario Arts. 4 bis, 4 ter, 4 quáter, 4 quinquies; Circular N°21 de 1991; Circular N°50 de 2020; Circular N°65 de 2015; Oficio N°2359 de 2022 SII.</w:t>
+        <w:t>Magíster en Dirección Tributaria — UVM | Caso 86 · Catálogo SII 2025</w:t>
+        <w:br/>
+        <w:t>Fuentes: LIR Art. 42 N°2; CT Arts. 4 bis, 4 ter, 4 quáter, 4 quinquies; Circ. N°21/1991; Circ. N°50/2020; Circ. N°65/2015; Oficio N°2359/2022 SII.</w:t>
       </w:r>
     </w:p>
     <w:sectPr>

</xml_diff>

<commit_message>
Caso 86 v3: PPT replica estilo compañera, Word ordenado con saltos correctos
PPT:
- Calca paleta y elementos de las slides 1-2 de la compañera: fondo gris,
  header negro con texto naranja subrayado, banda vertical RESULTADO,
  cajas oscuras para narrativa, títulos serif grandes a la izquierda.
- Slides 3-11: Análisis requisitos sociedad de profesionales, NGA, Abuso vs
  Simulación, fundamentos del abuso, efecto tributario, alternativas (2 slides)
  y conclusiones. Cierre con datos del Grupo 4.

Word:
- Vuelve a la estructura normativa más detallada (v1) pero con mejor orden:
  keep_with_next en encabezados para evitar títulos huérfanos, saltos de
  página explícitos antes de III y V para evitar cortes a mitad de sección,
  espaciado uniforme.
- Sin información inventada: cita solo DL 824, Código Tributario, Circulares
  N°21/1991, N°50/2020, N°65/2015 SII, Leyes N°20.780 y N°21.210.

https://claude.ai/code/session_01Wu4J5kMW3gnyas1BwZ5v9s
</commit_message>
<xml_diff>
--- a/Caso86_Informe.docx
+++ b/Caso86_Informe.docx
@@ -23,9 +23,9 @@
         <w:rPr>
           <w:b/>
           <w:color w:val="1A3A5C"/>
-          <w:sz w:val="40"/>
+          <w:sz w:val="30"/>
         </w:rPr>
-        <w:t>CASO 86</w:t>
+        <w:t>CASO 86 — CATÁLOGO DE ESQUEMAS TRIBUTARIOS SII 2025</w:t>
       </w:r>
     </w:p>
     <w:p>
@@ -36,9 +36,9 @@
         <w:rPr>
           <w:b/>
           <w:color w:val="2E6DA4"/>
-          <w:sz w:val="24"/>
+          <w:sz w:val="22"/>
         </w:rPr>
-        <w:t>Prestación de Servicios Profesionales mediante Sociedad Interpuesta</w:t>
+        <w:t>Prestación de servicios profesionales mediante interposición de sociedad de profesionales</w:t>
       </w:r>
     </w:p>
     <w:p>
@@ -51,51 +51,36 @@
           <w:color w:val="555555"/>
           <w:sz w:val="20"/>
         </w:rPr>
-        <w:t>Catálogo de Esquemas Tributarios SII 2025</w:t>
+        <w:t>Informe de análisis y defensa de posición</w:t>
       </w:r>
     </w:p>
     <w:p/>
     <w:tbl>
       <w:tblPr>
-        <w:tblStyle w:val="LightGrid-Accent1"/>
         <w:tblW w:type="auto" w:w="0"/>
         <w:jc w:val="center"/>
         <w:tblLook w:firstColumn="1" w:firstRow="1" w:lastColumn="0" w:lastRow="0" w:noHBand="0" w:noVBand="1" w:val="04A0"/>
       </w:tblPr>
       <w:tblGrid>
-        <w:gridCol w:w="4703"/>
-        <w:gridCol w:w="4703"/>
+        <w:gridCol w:w="9406"/>
       </w:tblGrid>
       <w:tr>
         <w:tc>
           <w:tcPr>
-            <w:tcW w:type="dxa" w:w="4703"/>
+            <w:tcW w:type="dxa" w:w="9406"/>
             <w:shd w:val="clear" w:color="auto" w:fill="1A3A5C"/>
           </w:tcPr>
           <w:p>
+            <w:pPr>
+              <w:jc w:val="center"/>
+            </w:pPr>
             <w:r>
               <w:rPr>
                 <w:b/>
                 <w:color w:val="FFFFFF"/>
-                <w:sz w:val="22"/>
+                <w:sz w:val="24"/>
               </w:rPr>
-              <w:t>Grupo 4</w:t>
-            </w:r>
-          </w:p>
-        </w:tc>
-        <w:tc>
-          <w:tcPr>
-            <w:tcW w:type="dxa" w:w="4703"/>
-            <w:shd w:val="clear" w:color="auto" w:fill="1A3A5C"/>
-          </w:tcPr>
-          <w:p>
-            <w:r>
-              <w:rPr>
-                <w:b/>
-                <w:color w:val="FFFFFF"/>
-                <w:sz w:val="22"/>
-              </w:rPr>
-              <w:t>Magíster en Dirección Tributaria UVM</w:t>
+              <w:t>GRUPO 4</w:t>
             </w:r>
           </w:p>
         </w:tc>
@@ -104,7 +89,7 @@
         <w:tc>
           <w:tcPr>
             <w:tcW w:type="dxa" w:w="9406"/>
-            <w:gridSpan w:val="2"/>
+            <w:shd w:val="clear" w:color="auto" w:fill="EBF3FB"/>
           </w:tcPr>
           <w:p>
             <w:pPr>
@@ -113,9 +98,9 @@
             <w:r>
               <w:rPr>
                 <w:color w:val="1A3A5C"/>
-                <w:sz w:val="20"/>
+                <w:sz w:val="22"/>
               </w:rPr>
-              <w:t>Andrea Añasco  ·  Gema Sepúlveda  ·  Karen Rebolledo  ·  Nicolás Muñoz</w:t>
+              <w:t>Andrea Añasco   ·   Gema Sepúlveda   ·   Karen Rebolledo   ·   Nicolás Muñoz</w:t>
             </w:r>
           </w:p>
         </w:tc>
@@ -135,22 +120,24 @@
     </w:p>
     <w:p>
       <w:pPr>
-        <w:spacing w:before="200" w:after="80"/>
+        <w:keepNext/>
+        <w:spacing w:before="240" w:after="120"/>
         <w:pBdr>
-          <w:bottom w:val="single" w:sz="8" w:space="1" w:color="2E6DA4"/>
+          <w:bottom w:val="single" w:sz="8" w:space="2" w:color="2E6DA4"/>
         </w:pBdr>
       </w:pPr>
       <w:r>
         <w:rPr>
           <w:b/>
           <w:color w:val="1A3A5C"/>
-          <w:sz w:val="24"/>
+          <w:sz w:val="26"/>
         </w:rPr>
-        <w:t>I.  EL ESQUEMA — ¿QUÉ SE HACE Y POR QUÉ IMPORTA?</w:t>
+        <w:t>I.  DESCRIPCIÓN DEL ESQUEMA OBJETO DE ANÁLISIS</w:t>
       </w:r>
     </w:p>
     <w:p>
       <w:pPr>
+        <w:spacing w:after="80"/>
         <w:jc w:val="both"/>
       </w:pPr>
       <w:r>
@@ -159,24 +146,12 @@
           <w:i w:val="0"/>
           <w:sz w:val="21"/>
         </w:rPr>
-        <w:t>El Caso 86 describe una práctica frecuente en el mundo de los profesionales liberales: constituir una sociedad de profesionales con socios que, en la realidad, nunca trabajan para la sociedad. El objetivo concreto es fraccionar el ingreso del profesional activo en varios RUT y, con ello, bajar artificialmente el tramo del Impuesto Global Complementario (IGC).</w:t>
+        <w:t>El contribuyente A, persona natural, constituye junto a otros dos socios (B y C) una sociedad de profesionales D, destinada formalmente a la prestación de servicios. La participación social se distribuye en partes iguales (33,33% cada uno), tanto en capital como en utilidades. El capital social aportado no resulta significativo en comparación con los ingresos anuales generados por la compañía.</w:t>
       </w:r>
     </w:p>
     <w:p>
       <w:pPr>
-        <w:spacing w:before="120" w:after="40"/>
-      </w:pPr>
-      <w:r>
-        <w:rPr>
-          <w:b/>
-          <w:color w:val="2E6DA4"/>
-          <w:sz w:val="22"/>
-        </w:rPr>
-        <w:t>El caso concreto</w:t>
-      </w:r>
-    </w:p>
-    <w:p>
-      <w:pPr>
+        <w:spacing w:after="80"/>
         <w:jc w:val="both"/>
       </w:pPr>
       <w:r>
@@ -185,480 +160,12 @@
           <w:i w:val="0"/>
           <w:sz w:val="21"/>
         </w:rPr>
-        <w:t>Pedro, médico cirujano, genera honorarios anuales por $300 millones. Si los declara directamente bajo el Art. 42 N°2 LIR, paga IGC en el tramo más alto (40%). Para reducir esa carga, constituye junto a su señora y su cuñado —que son profesores y nunca atienden pacientes— la 'Sociedad Profesional Médica Ltda.', con participación del 33,33% cada uno. Los ingresos de Pedro entran a la sociedad y se reparten en partes iguales: cada uno declara $100 millones y queda en un tramo de IGC más bajo.</w:t>
+        <w:t>El elemento crítico del esquema es que los servicios profesionales son prestados casi exclusivamente por el socio A a diversas instituciones y personas naturales, mientras que B y C no prestan servicios profesionales para la sociedad ni desempeñan algún rol estratégico dentro de ella. Sin embargo, al efectuarse los retiros de utilidades en proporción al porcentaje de capital aportado (33,33% cada uno), los tres socios reciben en partes iguales las utilidades generadas íntegramente por A.</w:t>
       </w:r>
     </w:p>
     <w:p>
       <w:pPr>
-        <w:spacing w:before="120" w:after="40"/>
-      </w:pPr>
-      <w:r>
-        <w:rPr>
-          <w:b/>
-          <w:color w:val="2E6DA4"/>
-          <w:sz w:val="22"/>
-        </w:rPr>
-        <w:t>El flujo del esquema</w:t>
-      </w:r>
-    </w:p>
-    <w:tbl>
-      <w:tblPr>
-        <w:tblStyle w:val="TableGrid"/>
-        <w:tblW w:type="auto" w:w="0"/>
-        <w:jc w:val="center"/>
-        <w:tblLook w:firstColumn="1" w:firstRow="1" w:lastColumn="0" w:lastRow="0" w:noHBand="0" w:noVBand="1" w:val="04A0"/>
-      </w:tblPr>
-      <w:tblGrid>
-        <w:gridCol w:w="3135"/>
-        <w:gridCol w:w="3135"/>
-        <w:gridCol w:w="3135"/>
-      </w:tblGrid>
-      <w:tr>
-        <w:tc>
-          <w:tcPr>
-            <w:tcW w:type="dxa" w:w="3135"/>
-            <w:shd w:val="clear" w:color="auto" w:fill="1A3A5C"/>
-          </w:tcPr>
-          <w:p>
-            <w:r>
-              <w:rPr>
-                <w:b/>
-                <w:color w:val="FFFFFF"/>
-                <w:sz w:val="20"/>
-              </w:rPr>
-              <w:t>Paso</w:t>
-            </w:r>
-          </w:p>
-        </w:tc>
-        <w:tc>
-          <w:tcPr>
-            <w:tcW w:type="dxa" w:w="3135"/>
-            <w:shd w:val="clear" w:color="auto" w:fill="1A3A5C"/>
-          </w:tcPr>
-          <w:p>
-            <w:r>
-              <w:rPr>
-                <w:b/>
-                <w:color w:val="FFFFFF"/>
-                <w:sz w:val="20"/>
-              </w:rPr>
-              <w:t>¿Qué ocurre?</w:t>
-            </w:r>
-          </w:p>
-        </w:tc>
-        <w:tc>
-          <w:tcPr>
-            <w:tcW w:type="dxa" w:w="3135"/>
-            <w:shd w:val="clear" w:color="auto" w:fill="1A3A5C"/>
-          </w:tcPr>
-          <w:p>
-            <w:r>
-              <w:rPr>
-                <w:b/>
-                <w:color w:val="FFFFFF"/>
-                <w:sz w:val="20"/>
-              </w:rPr>
-              <w:t>Sujeto</w:t>
-            </w:r>
-          </w:p>
-        </w:tc>
-      </w:tr>
-      <w:tr>
-        <w:tc>
-          <w:tcPr>
-            <w:tcW w:type="dxa" w:w="3135"/>
-            <w:shd w:val="clear" w:color="auto" w:fill="EBF3FB"/>
-          </w:tcPr>
-          <w:p>
-            <w:r>
-              <w:rPr>
-                <w:b w:val="0"/>
-                <w:sz w:val="19"/>
-              </w:rPr>
-              <w:t>1</w:t>
-            </w:r>
-          </w:p>
-        </w:tc>
-        <w:tc>
-          <w:tcPr>
-            <w:tcW w:type="dxa" w:w="3135"/>
-            <w:shd w:val="clear" w:color="auto" w:fill="EBF3FB"/>
-          </w:tcPr>
-          <w:p>
-            <w:r>
-              <w:rPr>
-                <w:b w:val="0"/>
-                <w:sz w:val="19"/>
-              </w:rPr>
-              <w:t>Pedro presta servicios médicos y factura $300 MM</w:t>
-            </w:r>
-          </w:p>
-        </w:tc>
-        <w:tc>
-          <w:tcPr>
-            <w:tcW w:type="dxa" w:w="3135"/>
-            <w:shd w:val="clear" w:color="auto" w:fill="EBF3FB"/>
-          </w:tcPr>
-          <w:p>
-            <w:r>
-              <w:rPr>
-                <w:b w:val="0"/>
-                <w:sz w:val="19"/>
-              </w:rPr>
-              <w:t>Socio A (Pedro)</w:t>
-            </w:r>
-          </w:p>
-        </w:tc>
-      </w:tr>
-      <w:tr>
-        <w:tc>
-          <w:tcPr>
-            <w:tcW w:type="dxa" w:w="3135"/>
-          </w:tcPr>
-          <w:p>
-            <w:r>
-              <w:rPr>
-                <w:b w:val="0"/>
-                <w:sz w:val="19"/>
-              </w:rPr>
-              <w:t>2</w:t>
-            </w:r>
-          </w:p>
-        </w:tc>
-        <w:tc>
-          <w:tcPr>
-            <w:tcW w:type="dxa" w:w="3135"/>
-          </w:tcPr>
-          <w:p>
-            <w:r>
-              <w:rPr>
-                <w:b w:val="0"/>
-                <w:sz w:val="19"/>
-              </w:rPr>
-              <w:t>Los ingresos ingresan a la Sociedad D</w:t>
-            </w:r>
-          </w:p>
-        </w:tc>
-        <w:tc>
-          <w:tcPr>
-            <w:tcW w:type="dxa" w:w="3135"/>
-          </w:tcPr>
-          <w:p>
-            <w:r>
-              <w:rPr>
-                <w:b w:val="0"/>
-                <w:sz w:val="19"/>
-              </w:rPr>
-              <w:t>Sociedad de profesionales</w:t>
-            </w:r>
-          </w:p>
-        </w:tc>
-      </w:tr>
-      <w:tr>
-        <w:tc>
-          <w:tcPr>
-            <w:tcW w:type="dxa" w:w="3135"/>
-            <w:shd w:val="clear" w:color="auto" w:fill="EBF3FB"/>
-          </w:tcPr>
-          <w:p>
-            <w:r>
-              <w:rPr>
-                <w:b w:val="0"/>
-                <w:sz w:val="19"/>
-              </w:rPr>
-              <w:t>3</w:t>
-            </w:r>
-          </w:p>
-        </w:tc>
-        <w:tc>
-          <w:tcPr>
-            <w:tcW w:type="dxa" w:w="3135"/>
-            <w:shd w:val="clear" w:color="auto" w:fill="EBF3FB"/>
-          </w:tcPr>
-          <w:p>
-            <w:r>
-              <w:rPr>
-                <w:b w:val="0"/>
-                <w:sz w:val="19"/>
-              </w:rPr>
-              <w:t>Las utilidades se distribuyen en partes iguales ($100 MM c/u)</w:t>
-            </w:r>
-          </w:p>
-        </w:tc>
-        <w:tc>
-          <w:tcPr>
-            <w:tcW w:type="dxa" w:w="3135"/>
-            <w:shd w:val="clear" w:color="auto" w:fill="EBF3FB"/>
-          </w:tcPr>
-          <w:p>
-            <w:r>
-              <w:rPr>
-                <w:b w:val="0"/>
-                <w:sz w:val="19"/>
-              </w:rPr>
-              <w:t>A, B y C — todos declaran IGC</w:t>
-            </w:r>
-          </w:p>
-        </w:tc>
-      </w:tr>
-    </w:tbl>
-    <w:p/>
-    <w:tbl>
-      <w:tblPr>
-        <w:tblW w:type="auto" w:w="0"/>
-        <w:jc w:val="center"/>
-        <w:tblLook w:firstColumn="1" w:firstRow="1" w:lastColumn="0" w:lastRow="0" w:noHBand="0" w:noVBand="1" w:val="04A0"/>
-      </w:tblPr>
-      <w:tblGrid>
-        <w:gridCol w:w="9406"/>
-      </w:tblGrid>
-      <w:tr>
-        <w:tc>
-          <w:tcPr>
-            <w:tcW w:type="dxa" w:w="9406"/>
-            <w:shd w:val="clear" w:color="auto" w:fill="FDE9D9"/>
-          </w:tcPr>
-          <w:p>
-            <w:pPr>
-              <w:spacing w:before="80" w:after="80"/>
-              <w:jc w:val="both"/>
-            </w:pPr>
-            <w:r>
-              <w:rPr>
-                <w:b/>
-                <w:color w:val="C5501A"/>
-                <w:sz w:val="21"/>
-              </w:rPr>
-              <w:t>RESULTADO: lo que en manos de Pedro tributaría al 40%, queda diluido en tres tramos independientes. El ahorro fiscal puede superar los $20–40 millones anuales, sin que B ni C hayan atendido un solo paciente.</w:t>
-            </w:r>
-          </w:p>
-        </w:tc>
-      </w:tr>
-    </w:tbl>
-    <w:p/>
-    <w:p>
-      <w:pPr>
-        <w:spacing w:before="120" w:after="40"/>
-      </w:pPr>
-      <w:r>
-        <w:rPr>
-          <w:b/>
-          <w:color w:val="2E6DA4"/>
-          <w:sz w:val="22"/>
-        </w:rPr>
-        <w:t>Diagrama simplificado del esquema</w:t>
-      </w:r>
-    </w:p>
-    <w:tbl>
-      <w:tblPr>
-        <w:tblStyle w:val="TableGrid"/>
-        <w:tblW w:type="auto" w:w="0"/>
-        <w:jc w:val="center"/>
-        <w:tblLook w:firstColumn="1" w:firstRow="1" w:lastColumn="0" w:lastRow="0" w:noHBand="0" w:noVBand="1" w:val="04A0"/>
-      </w:tblPr>
-      <w:tblGrid>
-        <w:gridCol w:w="1881"/>
-        <w:gridCol w:w="1881"/>
-        <w:gridCol w:w="1881"/>
-        <w:gridCol w:w="1881"/>
-        <w:gridCol w:w="1881"/>
-      </w:tblGrid>
-      <w:tr>
-        <w:tc>
-          <w:tcPr>
-            <w:tcW w:type="dxa" w:w="1881"/>
-            <w:shd w:val="clear" w:color="auto" w:fill="2E6DA4"/>
-          </w:tcPr>
-          <w:p>
-            <w:pPr>
-              <w:jc w:val="center"/>
-            </w:pPr>
-            <w:r>
-              <w:rPr>
-                <w:b/>
-                <w:color w:val="FFFFFF"/>
-                <w:sz w:val="19"/>
-              </w:rPr>
-              <w:t>Pedro</w:t>
-              <w:br/>
-              <w:t>(médico)</w:t>
-            </w:r>
-          </w:p>
-        </w:tc>
-        <w:tc>
-          <w:tcPr>
-            <w:tcW w:type="dxa" w:w="1881"/>
-          </w:tcPr>
-          <w:p/>
-        </w:tc>
-        <w:tc>
-          <w:tcPr>
-            <w:tcW w:type="dxa" w:w="1881"/>
-            <w:shd w:val="clear" w:color="auto" w:fill="1A3A5C"/>
-          </w:tcPr>
-          <w:p>
-            <w:pPr>
-              <w:jc w:val="center"/>
-            </w:pPr>
-            <w:r>
-              <w:rPr>
-                <w:b/>
-                <w:color w:val="FFFFFF"/>
-                <w:sz w:val="19"/>
-              </w:rPr>
-              <w:t>Sociedad D</w:t>
-              <w:br/>
-              <w:t>(profesionales)</w:t>
-            </w:r>
-          </w:p>
-        </w:tc>
-        <w:tc>
-          <w:tcPr>
-            <w:tcW w:type="dxa" w:w="1881"/>
-          </w:tcPr>
-          <w:p/>
-        </w:tc>
-        <w:tc>
-          <w:tcPr>
-            <w:tcW w:type="dxa" w:w="1881"/>
-            <w:shd w:val="clear" w:color="auto" w:fill="2E6DA4"/>
-          </w:tcPr>
-          <w:p>
-            <w:pPr>
-              <w:jc w:val="center"/>
-            </w:pPr>
-            <w:r>
-              <w:rPr>
-                <w:b/>
-                <w:color w:val="FFFFFF"/>
-                <w:sz w:val="19"/>
-              </w:rPr>
-              <w:t>SII recibe</w:t>
-              <w:br/>
-              <w:t>IGC de 3 RUT</w:t>
-            </w:r>
-          </w:p>
-        </w:tc>
-      </w:tr>
-      <w:tr>
-        <w:tc>
-          <w:tcPr>
-            <w:tcW w:type="dxa" w:w="1881"/>
-          </w:tcPr>
-          <w:p/>
-        </w:tc>
-        <w:tc>
-          <w:tcPr>
-            <w:tcW w:type="dxa" w:w="1881"/>
-          </w:tcPr>
-          <w:p>
-            <w:pPr>
-              <w:jc w:val="center"/>
-            </w:pPr>
-            <w:r>
-              <w:rPr>
-                <w:color w:val="555555"/>
-                <w:sz w:val="20"/>
-              </w:rPr>
-              <w:t>→ honorarios</w:t>
-            </w:r>
-          </w:p>
-        </w:tc>
-        <w:tc>
-          <w:tcPr>
-            <w:tcW w:type="dxa" w:w="1881"/>
-          </w:tcPr>
-          <w:p/>
-        </w:tc>
-        <w:tc>
-          <w:tcPr>
-            <w:tcW w:type="dxa" w:w="1881"/>
-          </w:tcPr>
-          <w:p>
-            <w:pPr>
-              <w:jc w:val="center"/>
-            </w:pPr>
-            <w:r>
-              <w:rPr>
-                <w:color w:val="555555"/>
-                <w:sz w:val="20"/>
-              </w:rPr>
-              <w:t>→ distribuye</w:t>
-            </w:r>
-          </w:p>
-        </w:tc>
-        <w:tc>
-          <w:tcPr>
-            <w:tcW w:type="dxa" w:w="1881"/>
-          </w:tcPr>
-          <w:p/>
-        </w:tc>
-      </w:tr>
-      <w:tr>
-        <w:tc>
-          <w:tcPr>
-            <w:tcW w:type="dxa" w:w="1881"/>
-          </w:tcPr>
-          <w:p/>
-        </w:tc>
-        <w:tc>
-          <w:tcPr>
-            <w:tcW w:type="dxa" w:w="1881"/>
-          </w:tcPr>
-          <w:p/>
-        </w:tc>
-        <w:tc>
-          <w:tcPr>
-            <w:tcW w:type="dxa" w:w="1881"/>
-            <w:shd w:val="clear" w:color="auto" w:fill="555555"/>
-          </w:tcPr>
-          <w:p>
-            <w:pPr>
-              <w:jc w:val="center"/>
-            </w:pPr>
-            <w:r>
-              <w:rPr>
-                <w:b/>
-                <w:color w:val="FFFFFF"/>
-                <w:sz w:val="19"/>
-              </w:rPr>
-              <w:t>B (33%) · C (33%) · A (33%)</w:t>
-            </w:r>
-          </w:p>
-        </w:tc>
-        <w:tc>
-          <w:tcPr>
-            <w:tcW w:type="dxa" w:w="1881"/>
-          </w:tcPr>
-          <w:p/>
-        </w:tc>
-        <w:tc>
-          <w:tcPr>
-            <w:tcW w:type="dxa" w:w="1881"/>
-          </w:tcPr>
-          <w:p/>
-        </w:tc>
-      </w:tr>
-    </w:tbl>
-    <w:p/>
-    <w:p>
-      <w:pPr>
-        <w:spacing w:before="200" w:after="80"/>
-        <w:pBdr>
-          <w:bottom w:val="single" w:sz="8" w:space="1" w:color="2E6DA4"/>
-        </w:pBdr>
-      </w:pPr>
-      <w:r>
-        <w:rPr>
-          <w:b/>
-          <w:color w:val="1A3A5C"/>
-          <w:sz w:val="24"/>
-        </w:rPr>
-        <w:t>II.  ¿QUÉ DICE EL DERECHO? — SÍNTESIS NORMATIVA</w:t>
-      </w:r>
-    </w:p>
-    <w:p>
-      <w:pPr>
+        <w:spacing w:after="80"/>
         <w:jc w:val="both"/>
       </w:pPr>
       <w:r>
@@ -667,7 +174,438 @@
           <w:i w:val="0"/>
           <w:sz w:val="21"/>
         </w:rPr>
-        <w:t>No se trata de hacer un repaso de la ley, sino de identificar qué normas son relevantes para calificar el esquema y cuáles le aplican directamente. La tabla siguiente sintetiza el marco legal pertinente:</w:t>
+        <w:t>Como resultado, los ingresos generados por la actividad profesional de A son diluidos en tres tramos de Impuesto Global Complementario (IGC) independientes, reduciendo significativamente la carga tributaria del contribuyente A en relación a la que correspondería si dichos ingresos los percibiera directamente, sea como trabajador independiente del Art. 42 N°2 LIR, o como único socio prestador de servicios.</w:t>
+      </w:r>
+    </w:p>
+    <w:p>
+      <w:pPr>
+        <w:keepNext/>
+        <w:spacing w:before="240" w:after="120"/>
+        <w:pBdr>
+          <w:bottom w:val="single" w:sz="8" w:space="2" w:color="2E6DA4"/>
+        </w:pBdr>
+      </w:pPr>
+      <w:r>
+        <w:rPr>
+          <w:b/>
+          <w:color w:val="1A3A5C"/>
+          <w:sz w:val="26"/>
+        </w:rPr>
+        <w:t>II.  NORMATIVA APLICABLE</w:t>
+      </w:r>
+    </w:p>
+    <w:p>
+      <w:pPr>
+        <w:keepNext/>
+        <w:spacing w:before="160" w:after="60"/>
+      </w:pPr>
+      <w:r>
+        <w:rPr>
+          <w:b/>
+          <w:color w:val="2E6DA4"/>
+          <w:sz w:val="22"/>
+        </w:rPr>
+        <w:t>1. Artículo 42 N°2 de la Ley sobre Impuesto a la Renta (DL 824)</w:t>
+      </w:r>
+    </w:p>
+    <w:p>
+      <w:pPr>
+        <w:spacing w:after="80"/>
+        <w:jc w:val="both"/>
+      </w:pPr>
+      <w:r>
+        <w:rPr>
+          <w:b w:val="0"/>
+          <w:i w:val="0"/>
+          <w:sz w:val="21"/>
+        </w:rPr>
+        <w:t>El Art. 42 N°2 LIR califica como rentas de segunda categoría los ingresos provenientes del ejercicio de profesiones liberales u otras ocupaciones lucrativas no comprendidas en la primera categoría. El inciso tercero de la norma permite a las sociedades de profesionales que prestan exclusivamente servicios o asesorías profesionales optar por declarar sus rentas conforme a las normas de la primera categoría, sujetándose a sus disposiciones para todos los efectos de la ley.</w:t>
+      </w:r>
+    </w:p>
+    <w:p>
+      <w:pPr>
+        <w:keepNext/>
+        <w:spacing w:before="160" w:after="60"/>
+      </w:pPr>
+      <w:r>
+        <w:rPr>
+          <w:b/>
+          <w:color w:val="2E6DA4"/>
+          <w:sz w:val="22"/>
+        </w:rPr>
+        <w:t>2. Circular N°21 de 1991 y Circular N°50 de 2020 del SII</w:t>
+      </w:r>
+    </w:p>
+    <w:p>
+      <w:pPr>
+        <w:spacing w:after="80"/>
+        <w:jc w:val="both"/>
+      </w:pPr>
+      <w:r>
+        <w:rPr>
+          <w:b w:val="0"/>
+          <w:i w:val="0"/>
+          <w:sz w:val="21"/>
+        </w:rPr>
+        <w:t>Ambas instrucciones administrativas fijan los requisitos copulativos que deben cumplirse para calificar como sociedad de profesionales:</w:t>
+      </w:r>
+    </w:p>
+    <w:p>
+      <w:pPr>
+        <w:pStyle w:val="ListBullet"/>
+        <w:keepNext w:val="0"/>
+        <w:spacing w:after="40"/>
+        <w:ind w:left="283"/>
+      </w:pPr>
+      <w:r>
+        <w:rPr>
+          <w:sz w:val="20"/>
+        </w:rPr>
+        <w:t>Debe tratarse de una sociedad de personas.</w:t>
+      </w:r>
+    </w:p>
+    <w:p>
+      <w:pPr>
+        <w:pStyle w:val="ListBullet"/>
+        <w:keepNext w:val="0"/>
+        <w:spacing w:after="40"/>
+        <w:ind w:left="283"/>
+      </w:pPr>
+      <w:r>
+        <w:rPr>
+          <w:sz w:val="20"/>
+        </w:rPr>
+        <w:t>Su objeto exclusivo debe ser la prestación de servicios o asesorías profesionales.</w:t>
+      </w:r>
+    </w:p>
+    <w:p>
+      <w:pPr>
+        <w:pStyle w:val="ListBullet"/>
+        <w:keepNext w:val="0"/>
+        <w:spacing w:after="40"/>
+        <w:ind w:left="283"/>
+      </w:pPr>
+      <w:r>
+        <w:rPr>
+          <w:sz w:val="20"/>
+        </w:rPr>
+        <w:t>Los servicios deben ser prestados por intermedio de sus socios, asociados o con la colaboración de dependientes que coadyuven a la prestación del servicio.</w:t>
+      </w:r>
+    </w:p>
+    <w:p>
+      <w:pPr>
+        <w:pStyle w:val="ListBullet"/>
+        <w:keepNext w:val="0"/>
+        <w:spacing w:after="40"/>
+        <w:ind w:left="283"/>
+      </w:pPr>
+      <w:r>
+        <w:rPr>
+          <w:sz w:val="20"/>
+        </w:rPr>
+        <w:t>TODOS sus socios (sean personas naturales u otras sociedades de profesionales) deben ejercer sus profesiones para la sociedad. No es aceptable que uno o más de ellos solo aporte capital.</w:t>
+      </w:r>
+    </w:p>
+    <w:p>
+      <w:pPr>
+        <w:pStyle w:val="ListBullet"/>
+        <w:keepNext w:val="0"/>
+        <w:spacing w:after="40"/>
+        <w:ind w:left="283"/>
+      </w:pPr>
+      <w:r>
+        <w:rPr>
+          <w:sz w:val="20"/>
+        </w:rPr>
+        <w:t>No es relevante la forma de remuneración a los socios (contrato de trabajo, sueldo patronal, retiro de utilidades), sino la realización efectiva de labores profesionales en beneficio de la sociedad.</w:t>
+      </w:r>
+    </w:p>
+    <w:p>
+      <w:pPr>
+        <w:keepNext/>
+        <w:spacing w:before="160" w:after="60"/>
+      </w:pPr>
+      <w:r>
+        <w:rPr>
+          <w:b/>
+          <w:color w:val="2E6DA4"/>
+          <w:sz w:val="22"/>
+        </w:rPr>
+        <w:t>3. Normas Generales Antielusivas — Arts. 4 bis, 4 ter, 4 quáter y 4 quinquies CT</w:t>
+      </w:r>
+    </w:p>
+    <w:p>
+      <w:pPr>
+        <w:spacing w:after="80"/>
+        <w:jc w:val="both"/>
+      </w:pPr>
+      <w:r>
+        <w:rPr>
+          <w:b w:val="0"/>
+          <w:i w:val="0"/>
+          <w:sz w:val="21"/>
+        </w:rPr>
+        <w:t>Incorporadas por la Ley N°20.780 (2014) y modificadas por la Ley N°21.210 (2020), establecen el marco para que la administración tributaria pueda recalificar actos o contratos cuando se configura abuso de las formas jurídicas o simulación:</w:t>
+      </w:r>
+    </w:p>
+    <w:p>
+      <w:pPr>
+        <w:pStyle w:val="ListBullet"/>
+        <w:keepNext w:val="0"/>
+        <w:spacing w:after="40"/>
+        <w:ind w:left="283"/>
+      </w:pPr>
+      <w:r>
+        <w:rPr>
+          <w:sz w:val="20"/>
+        </w:rPr>
+        <w:t>Art. 4 bis CT — Principio de buena fe: las obligaciones tributarias nacen y se exigen con arreglo a la naturaleza jurídica de los hechos, actos o negocios realizados, cualquiera sea la forma o denominación que los interesados les hubieren dado.</w:t>
+      </w:r>
+    </w:p>
+    <w:p>
+      <w:pPr>
+        <w:pStyle w:val="ListBullet"/>
+        <w:keepNext w:val="0"/>
+        <w:spacing w:after="40"/>
+        <w:ind w:left="283"/>
+      </w:pPr>
+      <w:r>
+        <w:rPr>
+          <w:sz w:val="20"/>
+        </w:rPr>
+        <w:t>Art. 4 ter CT — Abuso: existe abuso cuando se evita total o parcialmente la realización del hecho gravado, o se disminuye la base imponible o la obligación tributaria, mediante actos o negocios que, individualmente considerados o en su conjunto, no produzcan resultados o efectos jurídicos o económicos relevantes para el contribuyente o un tercero, que sean distintos de los meramente tributarios.</w:t>
+      </w:r>
+    </w:p>
+    <w:p>
+      <w:pPr>
+        <w:pStyle w:val="ListBullet"/>
+        <w:keepNext w:val="0"/>
+        <w:spacing w:after="40"/>
+        <w:ind w:left="283"/>
+      </w:pPr>
+      <w:r>
+        <w:rPr>
+          <w:sz w:val="20"/>
+        </w:rPr>
+        <w:t>Art. 4 quáter CT — Simulación: habrá simulación cuando los actos o negocios disimulen la configuración del hecho gravado o la naturaleza de los elementos constitutivos de la obligación tributaria, o su verdadero monto o data de nacimiento.</w:t>
+      </w:r>
+    </w:p>
+    <w:p>
+      <w:pPr>
+        <w:pStyle w:val="ListBullet"/>
+        <w:keepNext w:val="0"/>
+        <w:spacing w:after="40"/>
+        <w:ind w:left="283"/>
+      </w:pPr>
+      <w:r>
+        <w:rPr>
+          <w:sz w:val="20"/>
+        </w:rPr>
+        <w:t>Art. 4 quinquies CT — Procedimiento: la existencia de abuso o simulación será declarada por el Tribunal Tributario y Aduanero, a requerimiento del Director del SII.</w:t>
+      </w:r>
+    </w:p>
+    <w:p>
+      <w:pPr>
+        <w:keepNext/>
+        <w:spacing w:before="160" w:after="60"/>
+      </w:pPr>
+      <w:r>
+        <w:rPr>
+          <w:b/>
+          <w:color w:val="2E6DA4"/>
+          <w:sz w:val="22"/>
+        </w:rPr>
+        <w:t>4. Circular N°65 de 2015 del SII</w:t>
+      </w:r>
+    </w:p>
+    <w:p>
+      <w:pPr>
+        <w:spacing w:after="80"/>
+        <w:jc w:val="both"/>
+      </w:pPr>
+      <w:r>
+        <w:rPr>
+          <w:b w:val="0"/>
+          <w:i w:val="0"/>
+          <w:sz w:val="21"/>
+        </w:rPr>
+        <w:t>Imparte instrucciones sobre la aplicación práctica de las Normas Generales Antielusivas. Precisa que el abuso requiere acreditar la ausencia de efectos jurídicos o económicos relevantes distintos de los tributarios, y que la simulación supone una divergencia consciente entre la voluntad real y la declarada.</w:t>
+      </w:r>
+    </w:p>
+    <w:p>
+      <w:r>
+        <w:br w:type="page"/>
+      </w:r>
+    </w:p>
+    <w:p>
+      <w:pPr>
+        <w:keepNext/>
+        <w:spacing w:before="240" w:after="120"/>
+        <w:pBdr>
+          <w:bottom w:val="single" w:sz="8" w:space="2" w:color="2E6DA4"/>
+        </w:pBdr>
+      </w:pPr>
+      <w:r>
+        <w:rPr>
+          <w:b/>
+          <w:color w:val="1A3A5C"/>
+          <w:sz w:val="26"/>
+        </w:rPr>
+        <w:t>III.  ANÁLISIS JURÍDICO DEL CASO</w:t>
+      </w:r>
+    </w:p>
+    <w:p>
+      <w:pPr>
+        <w:keepNext/>
+        <w:spacing w:before="160" w:after="60"/>
+      </w:pPr>
+      <w:r>
+        <w:rPr>
+          <w:b/>
+          <w:color w:val="2E6DA4"/>
+          <w:sz w:val="22"/>
+        </w:rPr>
+        <w:t>1. Calificación de la sociedad D como 'sociedad de profesionales'</w:t>
+      </w:r>
+    </w:p>
+    <w:p>
+      <w:pPr>
+        <w:spacing w:after="80"/>
+        <w:jc w:val="both"/>
+      </w:pPr>
+      <w:r>
+        <w:rPr>
+          <w:b w:val="0"/>
+          <w:i w:val="0"/>
+          <w:sz w:val="21"/>
+        </w:rPr>
+        <w:t>El primer punto a dilucidar es si la sociedad D efectivamente califica como 'sociedad de profesionales' en los términos del Art. 42 N°2 inc. 3° LIR y de las Circulares N°21/1991 y N°50/2020. La respuesta es negativa: uno de los requisitos copulativos exigidos por la administración tributaria es que TODOS los socios ejerzan sus profesiones para la sociedad. En el caso analizado, solo el socio A presta efectivamente los servicios profesionales; B y C no prestan servicios ni tienen rol estratégico en la entidad. En consecuencia, D no reúne los requisitos formales para ser considerada sociedad de profesionales y, por tanto, tampoco puede acogerse válidamente a la opción de tributar en primera categoría.</w:t>
+      </w:r>
+    </w:p>
+    <w:p>
+      <w:pPr>
+        <w:keepNext/>
+        <w:spacing w:before="160" w:after="60"/>
+      </w:pPr>
+      <w:r>
+        <w:rPr>
+          <w:b/>
+          <w:color w:val="2E6DA4"/>
+          <w:sz w:val="22"/>
+        </w:rPr>
+        <w:t>2. Principio de realidad económica (Art. 4 bis CT)</w:t>
+      </w:r>
+    </w:p>
+    <w:p>
+      <w:pPr>
+        <w:spacing w:after="80"/>
+        <w:jc w:val="both"/>
+      </w:pPr>
+      <w:r>
+        <w:rPr>
+          <w:b w:val="0"/>
+          <w:i w:val="0"/>
+          <w:sz w:val="21"/>
+        </w:rPr>
+        <w:t>Conforme al Art. 4 bis del Código Tributario, las obligaciones tributarias nacen y se exigen con arreglo a la naturaleza jurídica de los hechos, cualquiera sea la forma o denominación. En el caso, la realidad económica es que A es el único profesional que ejerce labor lucrativa, generando los ingresos que se atribuyen indiscriminadamente a los tres socios.</w:t>
+      </w:r>
+    </w:p>
+    <w:p>
+      <w:pPr>
+        <w:keepNext/>
+        <w:spacing w:before="160" w:after="60"/>
+      </w:pPr>
+      <w:r>
+        <w:rPr>
+          <w:b/>
+          <w:color w:val="2E6DA4"/>
+          <w:sz w:val="22"/>
+        </w:rPr>
+        <w:t>3. Calificación: ¿abuso o simulación?</w:t>
+      </w:r>
+    </w:p>
+    <w:p>
+      <w:pPr>
+        <w:spacing w:after="80"/>
+        <w:jc w:val="both"/>
+      </w:pPr>
+      <w:r>
+        <w:rPr>
+          <w:b w:val="0"/>
+          <w:i w:val="0"/>
+          <w:sz w:val="21"/>
+        </w:rPr>
+        <w:t>Corresponde determinar si la conducta descrita configura un caso de abuso de las formas jurídicas (Art. 4 ter CT) o de simulación (Art. 4 quáter CT). El análisis del grupo concluye que se está frente a un caso de ABUSO, no de simulación, por las siguientes razones:</w:t>
+      </w:r>
+    </w:p>
+    <w:p>
+      <w:pPr>
+        <w:pStyle w:val="ListBullet"/>
+        <w:keepNext w:val="0"/>
+        <w:spacing w:after="40"/>
+        <w:ind w:left="283"/>
+      </w:pPr>
+      <w:r>
+        <w:rPr>
+          <w:sz w:val="20"/>
+        </w:rPr>
+        <w:t>La sociedad D existe formalmente y está válidamente constituida. Los actos societarios son reales: hay un contrato de sociedad, un capital social aportado y una distribución de utilidades efectiva. No hay un acto disimulado tras otro.</w:t>
+      </w:r>
+    </w:p>
+    <w:p>
+      <w:pPr>
+        <w:pStyle w:val="ListBullet"/>
+        <w:keepNext w:val="0"/>
+        <w:spacing w:after="40"/>
+        <w:ind w:left="283"/>
+      </w:pPr>
+      <w:r>
+        <w:rPr>
+          <w:sz w:val="20"/>
+        </w:rPr>
+        <w:t>El abuso radica en la utilización de una FORMA JURÍDICA inapropiada para el sustrato económico que se quiere amparar. La sociedad de profesionales está prevista para que profesionales que trabajan en conjunto puedan organizarse con personalidad jurídica común. No está prevista para canalizar el trabajo individual de un solo socio, diluyendo artificialmente sus utilidades en otros socios que no aportan trabajo.</w:t>
+      </w:r>
+    </w:p>
+    <w:p>
+      <w:pPr>
+        <w:pStyle w:val="ListBullet"/>
+        <w:keepNext w:val="0"/>
+        <w:spacing w:after="40"/>
+        <w:ind w:left="283"/>
+      </w:pPr>
+      <w:r>
+        <w:rPr>
+          <w:sz w:val="20"/>
+        </w:rPr>
+        <w:t>Los actos del esquema no producen efectos jurídicos o económicos relevantes distintos del meramente tributario: la existencia de B y C como socios no agrega valor económico al negocio (no aportan capital significativo, no prestan servicios, no aportan clientela, no tienen rol estratégico). Su única función es absorber parte de las utilidades de A.</w:t>
+      </w:r>
+    </w:p>
+    <w:p>
+      <w:pPr>
+        <w:keepNext/>
+        <w:spacing w:before="160" w:after="60"/>
+      </w:pPr>
+      <w:r>
+        <w:rPr>
+          <w:b/>
+          <w:color w:val="2E6DA4"/>
+          <w:sz w:val="22"/>
+        </w:rPr>
+        <w:t>4. Efecto tributario del esquema — perjuicio fiscal</w:t>
+      </w:r>
+    </w:p>
+    <w:p>
+      <w:pPr>
+        <w:spacing w:after="80"/>
+        <w:jc w:val="both"/>
+      </w:pPr>
+      <w:r>
+        <w:rPr>
+          <w:b w:val="0"/>
+          <w:i w:val="0"/>
+          <w:sz w:val="21"/>
+        </w:rPr>
+        <w:t>El esquema afecta indebidamente la progresión del IGC del socio A. La tabla siguiente sintetiza, a modo ilustrativo, la dilución de la carga tributaria:</w:t>
       </w:r>
     </w:p>
     <w:tbl>
@@ -689,13 +627,16 @@
             <w:shd w:val="clear" w:color="auto" w:fill="1A3A5C"/>
           </w:tcPr>
           <w:p>
+            <w:pPr>
+              <w:jc w:val="center"/>
+            </w:pPr>
             <w:r>
               <w:rPr>
                 <w:b/>
                 <w:color w:val="FFFFFF"/>
                 <w:sz w:val="20"/>
               </w:rPr>
-              <w:t>Norma</w:t>
+              <w:t>Escenario</w:t>
             </w:r>
           </w:p>
         </w:tc>
@@ -705,13 +646,16 @@
             <w:shd w:val="clear" w:color="auto" w:fill="1A3A5C"/>
           </w:tcPr>
           <w:p>
+            <w:pPr>
+              <w:jc w:val="center"/>
+            </w:pPr>
             <w:r>
               <w:rPr>
                 <w:b/>
                 <w:color w:val="FFFFFF"/>
                 <w:sz w:val="20"/>
               </w:rPr>
-              <w:t>Contenido clave</w:t>
+              <w:t>Atribución de la renta</w:t>
             </w:r>
           </w:p>
         </w:tc>
@@ -721,13 +665,16 @@
             <w:shd w:val="clear" w:color="auto" w:fill="1A3A5C"/>
           </w:tcPr>
           <w:p>
+            <w:pPr>
+              <w:jc w:val="center"/>
+            </w:pPr>
             <w:r>
               <w:rPr>
                 <w:b/>
                 <w:color w:val="FFFFFF"/>
                 <w:sz w:val="20"/>
               </w:rPr>
-              <w:t>¿Cómo aplica al Caso 86?</w:t>
+              <w:t>Tramo IGC marginal</w:t>
             </w:r>
           </w:p>
         </w:tc>
@@ -744,7 +691,7 @@
                 <w:b w:val="0"/>
                 <w:sz w:val="19"/>
               </w:rPr>
-              <w:t>Art. 42 N°2 LIR</w:t>
+              <w:t>Sin esquema (A solo)</w:t>
             </w:r>
           </w:p>
         </w:tc>
@@ -759,7 +706,7 @@
                 <w:b w:val="0"/>
                 <w:sz w:val="19"/>
               </w:rPr>
-              <w:t>Rentas de segunda categoría. Las sociedades de profesionales pueden optar por 1ª categoría si TODOS los socios ejercen su profesión para ella.</w:t>
+              <w:t>A recibe el total de los ingresos</w:t>
             </w:r>
           </w:p>
         </w:tc>
@@ -774,7 +721,7 @@
                 <w:b w:val="0"/>
                 <w:sz w:val="19"/>
               </w:rPr>
-              <w:t>D no cumple: B y C no ejercen profesión para la sociedad → no califica como sociedad de profesionales.</w:t>
+              <w:t>Tramo alto (≈40%)</w:t>
             </w:r>
           </w:p>
         </w:tc>
@@ -790,7 +737,7 @@
                 <w:b w:val="0"/>
                 <w:sz w:val="19"/>
               </w:rPr>
-              <w:t>Circ. N°21/1991 y N°50/2020 SII</w:t>
+              <w:t>Con esquema D (3 socios iguales)</w:t>
             </w:r>
           </w:p>
         </w:tc>
@@ -804,7 +751,7 @@
                 <w:b w:val="0"/>
                 <w:sz w:val="19"/>
               </w:rPr>
-              <w:t>Requisitos copulativos para ser sociedad de profesionales. Todos los socios deben prestar servicios efectivos; no es válido que uno solo aporte capital.</w:t>
+              <w:t>A : B : C reciben 1/3 cada uno</w:t>
             </w:r>
           </w:p>
         </w:tc>
@@ -818,7 +765,7 @@
                 <w:b w:val="0"/>
                 <w:sz w:val="19"/>
               </w:rPr>
-              <w:t>Incumplimiento flagrante: B y C solo aportan capital.</w:t>
+              <w:t>Cada socio en tramo medio</w:t>
             </w:r>
           </w:p>
         </w:tc>
@@ -835,7 +782,7 @@
                 <w:b w:val="0"/>
                 <w:sz w:val="19"/>
               </w:rPr>
-              <w:t>Art. 4 bis CT</w:t>
+              <w:t>Diferencial</w:t>
             </w:r>
           </w:p>
         </w:tc>
@@ -850,7 +797,7 @@
                 <w:b w:val="0"/>
                 <w:sz w:val="19"/>
               </w:rPr>
-              <w:t>Las obligaciones tributarias nacen según la naturaleza jurídica real de los actos, no según la forma que les dan las partes.</w:t>
+              <w:t>Mismo ingreso económico real</w:t>
             </w:r>
           </w:p>
         </w:tc>
@@ -865,460 +812,7 @@
                 <w:b w:val="0"/>
                 <w:sz w:val="19"/>
               </w:rPr>
-              <w:t>Obligaciones de Pedro no se alteran por usar la sociedad como vehículo.</w:t>
-            </w:r>
-          </w:p>
-        </w:tc>
-      </w:tr>
-      <w:tr>
-        <w:tc>
-          <w:tcPr>
-            <w:tcW w:type="dxa" w:w="3135"/>
-          </w:tcPr>
-          <w:p>
-            <w:r>
-              <w:rPr>
-                <w:b w:val="0"/>
-                <w:sz w:val="19"/>
-              </w:rPr>
-              <w:t>Art. 4 ter CT</w:t>
-            </w:r>
-          </w:p>
-        </w:tc>
-        <w:tc>
-          <w:tcPr>
-            <w:tcW w:type="dxa" w:w="3135"/>
-          </w:tcPr>
-          <w:p>
-            <w:r>
-              <w:rPr>
-                <w:b w:val="0"/>
-                <w:sz w:val="19"/>
-              </w:rPr>
-              <w:t>ABUSO: actos que evitan o disminuyen el hecho gravado sin producir efectos jurídicos/económicos relevantes distintos del tributario.</w:t>
-            </w:r>
-          </w:p>
-        </w:tc>
-        <w:tc>
-          <w:tcPr>
-            <w:tcW w:type="dxa" w:w="3135"/>
-          </w:tcPr>
-          <w:p>
-            <w:r>
-              <w:rPr>
-                <w:b w:val="0"/>
-                <w:sz w:val="19"/>
-              </w:rPr>
-              <w:t>El esquema reduce la carga de Pedro sin que B y C aporten valor real → ABUSO.</w:t>
-            </w:r>
-          </w:p>
-        </w:tc>
-      </w:tr>
-      <w:tr>
-        <w:tc>
-          <w:tcPr>
-            <w:tcW w:type="dxa" w:w="3135"/>
-            <w:shd w:val="clear" w:color="auto" w:fill="F4F6F9"/>
-          </w:tcPr>
-          <w:p>
-            <w:r>
-              <w:rPr>
-                <w:b w:val="0"/>
-                <w:sz w:val="19"/>
-              </w:rPr>
-              <w:t>Art. 4 quinquies CT</w:t>
-            </w:r>
-          </w:p>
-        </w:tc>
-        <w:tc>
-          <w:tcPr>
-            <w:tcW w:type="dxa" w:w="3135"/>
-            <w:shd w:val="clear" w:color="auto" w:fill="F4F6F9"/>
-          </w:tcPr>
-          <w:p>
-            <w:r>
-              <w:rPr>
-                <w:b w:val="0"/>
-                <w:sz w:val="19"/>
-              </w:rPr>
-              <w:t>El Director del SII puede requerir al Tribunal Tributario y Aduanero (TTA) la declaración de abuso.</w:t>
-            </w:r>
-          </w:p>
-        </w:tc>
-        <w:tc>
-          <w:tcPr>
-            <w:tcW w:type="dxa" w:w="3135"/>
-            <w:shd w:val="clear" w:color="auto" w:fill="F4F6F9"/>
-          </w:tcPr>
-          <w:p>
-            <w:r>
-              <w:rPr>
-                <w:b w:val="0"/>
-                <w:sz w:val="19"/>
-              </w:rPr>
-              <w:t>Consecuencia práctica: recalificación + atribución íntegra a Pedro + intereses + multas.</w:t>
-            </w:r>
-          </w:p>
-        </w:tc>
-      </w:tr>
-    </w:tbl>
-    <w:p/>
-    <w:p>
-      <w:r>
-        <w:br w:type="page"/>
-      </w:r>
-    </w:p>
-    <w:p>
-      <w:pPr>
-        <w:spacing w:before="200" w:after="80"/>
-        <w:pBdr>
-          <w:bottom w:val="single" w:sz="8" w:space="1" w:color="2E6DA4"/>
-        </w:pBdr>
-      </w:pPr>
-      <w:r>
-        <w:rPr>
-          <w:b/>
-          <w:color w:val="1A3A5C"/>
-          <w:sz w:val="24"/>
-        </w:rPr>
-        <w:t>III.  CALIFICACIÓN JURÍDICA — ¿ABUSO O SIMULACIÓN?</w:t>
-      </w:r>
-    </w:p>
-    <w:p>
-      <w:pPr>
-        <w:jc w:val="both"/>
-      </w:pPr>
-      <w:r>
-        <w:rPr>
-          <w:b w:val="0"/>
-          <w:i w:val="0"/>
-          <w:sz w:val="21"/>
-        </w:rPr>
-        <w:t>Esta es la pregunta central del caso. El Código Tributario distingue dos figuras antielusivas distintas con efectos procesales diferentes. La correcta calificación importa porque define qué debe probar el SII y cuál norma aplica.</w:t>
-      </w:r>
-    </w:p>
-    <w:tbl>
-      <w:tblPr>
-        <w:tblStyle w:val="LightGrid-Accent1"/>
-        <w:tblW w:type="auto" w:w="0"/>
-        <w:jc w:val="center"/>
-        <w:tblLook w:firstColumn="1" w:firstRow="1" w:lastColumn="0" w:lastRow="0" w:noHBand="0" w:noVBand="1" w:val="04A0"/>
-      </w:tblPr>
-      <w:tblGrid>
-        <w:gridCol w:w="3135"/>
-        <w:gridCol w:w="3135"/>
-        <w:gridCol w:w="3135"/>
-      </w:tblGrid>
-      <w:tr>
-        <w:tc>
-          <w:tcPr>
-            <w:tcW w:type="dxa" w:w="3135"/>
-            <w:shd w:val="clear" w:color="auto" w:fill="1A3A5C"/>
-          </w:tcPr>
-          <w:p>
-            <w:r>
-              <w:rPr>
-                <w:b/>
-                <w:color w:val="FFFFFF"/>
-                <w:sz w:val="20"/>
-              </w:rPr>
-              <w:t>Criterio</w:t>
-            </w:r>
-          </w:p>
-        </w:tc>
-        <w:tc>
-          <w:tcPr>
-            <w:tcW w:type="dxa" w:w="3135"/>
-            <w:shd w:val="clear" w:color="auto" w:fill="1A3A5C"/>
-          </w:tcPr>
-          <w:p>
-            <w:r>
-              <w:rPr>
-                <w:b/>
-                <w:color w:val="FFFFFF"/>
-                <w:sz w:val="20"/>
-              </w:rPr>
-              <w:t>ABUSO (Art. 4 ter CT)</w:t>
-            </w:r>
-          </w:p>
-        </w:tc>
-        <w:tc>
-          <w:tcPr>
-            <w:tcW w:type="dxa" w:w="3135"/>
-            <w:shd w:val="clear" w:color="auto" w:fill="1A3A5C"/>
-          </w:tcPr>
-          <w:p>
-            <w:r>
-              <w:rPr>
-                <w:b/>
-                <w:color w:val="FFFFFF"/>
-                <w:sz w:val="20"/>
-              </w:rPr>
-              <w:t>SIMULACIÓN (Art. 4 quáter CT)</w:t>
-            </w:r>
-          </w:p>
-        </w:tc>
-      </w:tr>
-      <w:tr>
-        <w:tc>
-          <w:tcPr>
-            <w:tcW w:type="dxa" w:w="3135"/>
-            <w:shd w:val="clear" w:color="auto" w:fill="F4F6F9"/>
-          </w:tcPr>
-          <w:p>
-            <w:r>
-              <w:rPr>
-                <w:b w:val="0"/>
-                <w:sz w:val="19"/>
-              </w:rPr>
-              <w:t>¿Los actos son reales?</w:t>
-            </w:r>
-          </w:p>
-        </w:tc>
-        <w:tc>
-          <w:tcPr>
-            <w:tcW w:type="dxa" w:w="3135"/>
-            <w:shd w:val="clear" w:color="auto" w:fill="F4F6F9"/>
-          </w:tcPr>
-          <w:p>
-            <w:r>
-              <w:rPr>
-                <w:b w:val="0"/>
-                <w:sz w:val="19"/>
-              </w:rPr>
-              <w:t>SÍ — la sociedad existe, hay socios y distribución real</w:t>
-            </w:r>
-          </w:p>
-        </w:tc>
-        <w:tc>
-          <w:tcPr>
-            <w:tcW w:type="dxa" w:w="3135"/>
-            <w:shd w:val="clear" w:color="auto" w:fill="F4F6F9"/>
-          </w:tcPr>
-          <w:p>
-            <w:r>
-              <w:rPr>
-                <w:b w:val="0"/>
-                <w:sz w:val="19"/>
-              </w:rPr>
-              <w:t>NO — hay un acto declarado que disimula otro real y secreto</w:t>
-            </w:r>
-          </w:p>
-        </w:tc>
-      </w:tr>
-      <w:tr>
-        <w:tc>
-          <w:tcPr>
-            <w:tcW w:type="dxa" w:w="3135"/>
-          </w:tcPr>
-          <w:p>
-            <w:r>
-              <w:rPr>
-                <w:b w:val="0"/>
-                <w:sz w:val="19"/>
-              </w:rPr>
-              <w:t>¿Hay divergencia entre lo declarado y lo real?</w:t>
-            </w:r>
-          </w:p>
-        </w:tc>
-        <w:tc>
-          <w:tcPr>
-            <w:tcW w:type="dxa" w:w="3135"/>
-          </w:tcPr>
-          <w:p>
-            <w:r>
-              <w:rPr>
-                <w:b w:val="0"/>
-                <w:sz w:val="19"/>
-              </w:rPr>
-              <w:t>NO — el contrato dice exactamente lo que se hace</w:t>
-            </w:r>
-          </w:p>
-        </w:tc>
-        <w:tc>
-          <w:tcPr>
-            <w:tcW w:type="dxa" w:w="3135"/>
-          </w:tcPr>
-          <w:p>
-            <w:r>
-              <w:rPr>
-                <w:b w:val="0"/>
-                <w:sz w:val="19"/>
-              </w:rPr>
-              <w:t>SÍ — hay voluntad real oculta distinta de la declarada</w:t>
-            </w:r>
-          </w:p>
-        </w:tc>
-      </w:tr>
-      <w:tr>
-        <w:tc>
-          <w:tcPr>
-            <w:tcW w:type="dxa" w:w="3135"/>
-            <w:shd w:val="clear" w:color="auto" w:fill="F4F6F9"/>
-          </w:tcPr>
-          <w:p>
-            <w:r>
-              <w:rPr>
-                <w:b w:val="0"/>
-                <w:sz w:val="19"/>
-              </w:rPr>
-              <w:t>¿Qué se cuestiona?</w:t>
-            </w:r>
-          </w:p>
-        </w:tc>
-        <w:tc>
-          <w:tcPr>
-            <w:tcW w:type="dxa" w:w="3135"/>
-            <w:shd w:val="clear" w:color="auto" w:fill="F4F6F9"/>
-          </w:tcPr>
-          <w:p>
-            <w:r>
-              <w:rPr>
-                <w:b w:val="0"/>
-                <w:sz w:val="19"/>
-              </w:rPr>
-              <w:t>La FORMA jurídica elegida (inapropiada para el sustrato económico)</w:t>
-            </w:r>
-          </w:p>
-        </w:tc>
-        <w:tc>
-          <w:tcPr>
-            <w:tcW w:type="dxa" w:w="3135"/>
-            <w:shd w:val="clear" w:color="auto" w:fill="F4F6F9"/>
-          </w:tcPr>
-          <w:p>
-            <w:r>
-              <w:rPr>
-                <w:b w:val="0"/>
-                <w:sz w:val="19"/>
-              </w:rPr>
-              <w:t>El CONTENIDO del acto (simula algo que no existe)</w:t>
-            </w:r>
-          </w:p>
-        </w:tc>
-      </w:tr>
-      <w:tr>
-        <w:tc>
-          <w:tcPr>
-            <w:tcW w:type="dxa" w:w="3135"/>
-          </w:tcPr>
-          <w:p>
-            <w:r>
-              <w:rPr>
-                <w:b w:val="0"/>
-                <w:sz w:val="19"/>
-              </w:rPr>
-              <w:t>¿Qué debe probar el SII?</w:t>
-            </w:r>
-          </w:p>
-        </w:tc>
-        <w:tc>
-          <w:tcPr>
-            <w:tcW w:type="dxa" w:w="3135"/>
-          </w:tcPr>
-          <w:p>
-            <w:r>
-              <w:rPr>
-                <w:b w:val="0"/>
-                <w:sz w:val="19"/>
-              </w:rPr>
-              <w:t>Ausencia de efectos jurídicos/económicos relevantes distintos del tributario</w:t>
-            </w:r>
-          </w:p>
-        </w:tc>
-        <w:tc>
-          <w:tcPr>
-            <w:tcW w:type="dxa" w:w="3135"/>
-          </w:tcPr>
-          <w:p>
-            <w:r>
-              <w:rPr>
-                <w:b w:val="0"/>
-                <w:sz w:val="19"/>
-              </w:rPr>
-              <w:t>Existencia de un acto oculto o disimulado</w:t>
-            </w:r>
-          </w:p>
-        </w:tc>
-      </w:tr>
-      <w:tr>
-        <w:tc>
-          <w:tcPr>
-            <w:tcW w:type="dxa" w:w="3135"/>
-            <w:shd w:val="clear" w:color="auto" w:fill="F4F6F9"/>
-          </w:tcPr>
-          <w:p>
-            <w:r>
-              <w:rPr>
-                <w:b w:val="0"/>
-                <w:sz w:val="19"/>
-              </w:rPr>
-              <w:t>¿Aplica al Caso 86?</w:t>
-            </w:r>
-          </w:p>
-        </w:tc>
-        <w:tc>
-          <w:tcPr>
-            <w:tcW w:type="dxa" w:w="3135"/>
-            <w:shd w:val="clear" w:color="auto" w:fill="F4F6F9"/>
-            <w:shd w:val="clear" w:color="auto" w:fill="E8F5E9"/>
-          </w:tcPr>
-          <w:p>
-            <w:r>
-              <w:rPr>
-                <w:b w:val="0"/>
-                <w:sz w:val="19"/>
-              </w:rPr>
-              <w:t>SÍ → B y C no aportan valor real; la sociedad sirve solo para diluir el IGC de Pedro</w:t>
-            </w:r>
-          </w:p>
-        </w:tc>
-        <w:tc>
-          <w:tcPr>
-            <w:tcW w:type="dxa" w:w="3135"/>
-            <w:shd w:val="clear" w:color="auto" w:fill="F4F6F9"/>
-            <w:shd w:val="clear" w:color="auto" w:fill="FBEAEA"/>
-          </w:tcPr>
-          <w:p>
-            <w:r>
-              <w:rPr>
-                <w:b w:val="0"/>
-                <w:sz w:val="19"/>
-              </w:rPr>
-              <w:t>NO → la sociedad y los socios son reales; no hay acto secreto que ocultar</w:t>
-            </w:r>
-          </w:p>
-        </w:tc>
-      </w:tr>
-    </w:tbl>
-    <w:p/>
-    <w:tbl>
-      <w:tblPr>
-        <w:tblW w:type="auto" w:w="0"/>
-        <w:jc w:val="center"/>
-        <w:tblLook w:firstColumn="1" w:firstRow="1" w:lastColumn="0" w:lastRow="0" w:noHBand="0" w:noVBand="1" w:val="04A0"/>
-      </w:tblPr>
-      <w:tblGrid>
-        <w:gridCol w:w="9406"/>
-      </w:tblGrid>
-      <w:tr>
-        <w:tc>
-          <w:tcPr>
-            <w:tcW w:type="dxa" w:w="9406"/>
-            <w:shd w:val="clear" w:color="auto" w:fill="EBF3FB"/>
-          </w:tcPr>
-          <w:p>
-            <w:pPr>
-              <w:spacing w:before="80" w:after="80"/>
-              <w:jc w:val="both"/>
-            </w:pPr>
-            <w:r>
-              <w:rPr>
-                <w:b/>
-                <w:color w:val="1A3A5C"/>
-                <w:sz w:val="21"/>
-              </w:rPr>
-              <w:t>CONCLUSIÓN DEL GRUPO: El Caso 86 es ABUSO de las formas jurídicas (Art. 4 ter CT). Los actos son reales pero se utiliza una figura societaria de forma inapropiada, sin sustancia económica real para B y C, con el único propósito de reducir el IGC de Pedro.</w:t>
+              <w:t>Reducción artificial de la carga</w:t>
             </w:r>
           </w:p>
         </w:tc>
@@ -1327,36 +821,54 @@
     <w:p/>
     <w:p>
       <w:pPr>
-        <w:spacing w:before="200" w:after="80"/>
+        <w:spacing w:after="80"/>
+        <w:jc w:val="both"/>
+      </w:pPr>
+      <w:r>
+        <w:rPr>
+          <w:b w:val="0"/>
+          <w:i/>
+          <w:color w:val="555555"/>
+          <w:sz w:val="19"/>
+        </w:rPr>
+        <w:t>Las tasas mencionadas son ilustrativas; el perjuicio fiscal efectivo dependerá del monto real de los ingresos y demás rentas de cada socio.</w:t>
+      </w:r>
+    </w:p>
+    <w:p>
+      <w:pPr>
+        <w:keepNext/>
+        <w:spacing w:before="240" w:after="120"/>
         <w:pBdr>
-          <w:bottom w:val="single" w:sz="8" w:space="1" w:color="2E6DA4"/>
+          <w:bottom w:val="single" w:sz="8" w:space="2" w:color="2E6DA4"/>
         </w:pBdr>
       </w:pPr>
       <w:r>
         <w:rPr>
           <w:b/>
           <w:color w:val="1A3A5C"/>
-          <w:sz w:val="24"/>
+          <w:sz w:val="26"/>
         </w:rPr>
-        <w:t>IV.  ¿POR QUÉ ES ABUSO? — LOS TRES ELEMENTOS DEL ART. 4 TER CT</w:t>
+        <w:t>IV.  POSICIÓN DEL GRUPO</w:t>
       </w:r>
     </w:p>
     <w:p>
       <w:pPr>
+        <w:spacing w:after="80"/>
         <w:jc w:val="both"/>
       </w:pPr>
       <w:r>
         <w:rPr>
-          <w:b w:val="0"/>
+          <w:b/>
           <w:i w:val="0"/>
           <w:sz w:val="21"/>
         </w:rPr>
-        <w:t>El Art. 4 ter CT exige que concurran tres elementos. En el Caso 86, los tres están presentes:</w:t>
+        <w:t>El esquema descrito en el Caso 86 configura un ABUSO de las formas jurídicas en los términos del Art. 4 ter del Código Tributario. La constitución de la sociedad de profesionales D, sin que B y C ejerzan efectivamente labor profesional para ella, constituye una utilización inapropiada de una figura societaria especial, cuyo único efecto relevante es la reducción artificial de la carga tributaria de A en el IGC.</w:t>
       </w:r>
     </w:p>
     <w:p>
       <w:pPr>
-        <w:spacing w:before="120" w:after="40"/>
+        <w:keepNext/>
+        <w:spacing w:before="160" w:after="60"/>
       </w:pPr>
       <w:r>
         <w:rPr>
@@ -1364,557 +876,63 @@
           <w:color w:val="2E6DA4"/>
           <w:sz w:val="22"/>
         </w:rPr>
-        <w:t>Elemento 1 — Reducción de la obligación tributaria</w:t>
+        <w:t>Fundamentos centrales</w:t>
       </w:r>
     </w:p>
     <w:p>
       <w:pPr>
-        <w:jc w:val="both"/>
+        <w:pStyle w:val="ListBullet"/>
+        <w:keepNext w:val="0"/>
+        <w:spacing w:after="40"/>
+        <w:ind w:left="283"/>
       </w:pPr>
       <w:r>
         <w:rPr>
-          <w:b w:val="0"/>
-          <w:i w:val="0"/>
-          <w:sz w:val="21"/>
+          <w:sz w:val="20"/>
         </w:rPr>
-        <w:t>Pedro, con ingresos de $300 millones, debería tributar en el tramo más alto del IGC. Con el esquema, cada socio declara solo $100 millones, cayendo en un tramo inferior. El ahorro fiscal no es consecuencia de planificación legítima, sino de fraccionar artificialmente un ingreso que económicamente pertenece solo a Pedro.</w:t>
+        <w:t>Incumplimiento de requisitos formales: D no califica como sociedad de profesionales según Circular N°21/1991 y N°50/2020 (no todos los socios ejercen su profesión para la sociedad).</w:t>
       </w:r>
     </w:p>
     <w:p>
       <w:pPr>
-        <w:spacing w:before="120" w:after="40"/>
+        <w:pStyle w:val="ListBullet"/>
+        <w:keepNext w:val="0"/>
+        <w:spacing w:after="40"/>
+        <w:ind w:left="283"/>
       </w:pPr>
       <w:r>
         <w:rPr>
-          <w:b/>
-          <w:color w:val="2E6DA4"/>
-          <w:sz w:val="22"/>
+          <w:sz w:val="20"/>
         </w:rPr>
-        <w:t>Elemento 2 — Ausencia de efectos jurídicos o económicos relevantes</w:t>
+        <w:t>Inexistencia de motivo económico válido: la participación de B y C no tiene justificación económica fuera de la dilución del IGC de A. El capital aportado es insignificante frente a los ingresos.</w:t>
       </w:r>
     </w:p>
     <w:p>
       <w:pPr>
-        <w:jc w:val="both"/>
+        <w:pStyle w:val="ListBullet"/>
+        <w:keepNext w:val="0"/>
+        <w:spacing w:after="40"/>
+        <w:ind w:left="283"/>
       </w:pPr>
       <w:r>
         <w:rPr>
-          <w:b w:val="0"/>
-          <w:i w:val="0"/>
-          <w:sz w:val="21"/>
+          <w:sz w:val="20"/>
         </w:rPr>
-        <w:t>¿Qué aportan realmente B y C a la sociedad D? Ninguna de las siguientes cosas:</w:t>
-      </w:r>
-    </w:p>
-    <w:tbl>
-      <w:tblPr>
-        <w:tblStyle w:val="LightGrid-Accent1"/>
-        <w:tblW w:type="auto" w:w="0"/>
-        <w:jc w:val="center"/>
-        <w:tblLook w:firstColumn="1" w:firstRow="1" w:lastColumn="0" w:lastRow="0" w:noHBand="0" w:noVBand="1" w:val="04A0"/>
-      </w:tblPr>
-      <w:tblGrid>
-        <w:gridCol w:w="4703"/>
-        <w:gridCol w:w="4703"/>
-      </w:tblGrid>
-      <w:tr>
-        <w:tc>
-          <w:tcPr>
-            <w:tcW w:type="dxa" w:w="4703"/>
-            <w:shd w:val="clear" w:color="auto" w:fill="1A3A5C"/>
-          </w:tcPr>
-          <w:p>
-            <w:r>
-              <w:rPr>
-                <w:b/>
-                <w:color w:val="FFFFFF"/>
-                <w:sz w:val="20"/>
-              </w:rPr>
-              <w:t>¿Aportan B y C...?</w:t>
-            </w:r>
-          </w:p>
-        </w:tc>
-        <w:tc>
-          <w:tcPr>
-            <w:tcW w:type="dxa" w:w="4703"/>
-            <w:shd w:val="clear" w:color="auto" w:fill="1A3A5C"/>
-          </w:tcPr>
-          <w:p>
-            <w:r>
-              <w:rPr>
-                <w:b/>
-                <w:color w:val="FFFFFF"/>
-                <w:sz w:val="20"/>
-              </w:rPr>
-              <w:t>Respuesta</w:t>
-            </w:r>
-          </w:p>
-        </w:tc>
-      </w:tr>
-      <w:tr>
-        <w:tc>
-          <w:tcPr>
-            <w:tcW w:type="dxa" w:w="4703"/>
-            <w:shd w:val="clear" w:color="auto" w:fill="FBEAEA"/>
-          </w:tcPr>
-          <w:p>
-            <w:r>
-              <w:rPr>
-                <w:b w:val="0"/>
-                <w:sz w:val="19"/>
-              </w:rPr>
-              <w:t>Servicios profesionales o atención de clientes</w:t>
-            </w:r>
-          </w:p>
-        </w:tc>
-        <w:tc>
-          <w:tcPr>
-            <w:tcW w:type="dxa" w:w="4703"/>
-            <w:shd w:val="clear" w:color="auto" w:fill="FBEAEA"/>
-          </w:tcPr>
-          <w:p>
-            <w:r>
-              <w:rPr>
-                <w:b w:val="0"/>
-                <w:sz w:val="19"/>
-              </w:rPr>
-              <w:t>✖  No. Solo Pedro trabaja.</w:t>
-            </w:r>
-          </w:p>
-        </w:tc>
-      </w:tr>
-      <w:tr>
-        <w:tc>
-          <w:tcPr>
-            <w:tcW w:type="dxa" w:w="4703"/>
-          </w:tcPr>
-          <w:p>
-            <w:r>
-              <w:rPr>
-                <w:b w:val="0"/>
-                <w:sz w:val="19"/>
-              </w:rPr>
-              <w:t>Capital significativo respecto a los ingresos</w:t>
-            </w:r>
-          </w:p>
-        </w:tc>
-        <w:tc>
-          <w:tcPr>
-            <w:tcW w:type="dxa" w:w="4703"/>
-          </w:tcPr>
-          <w:p>
-            <w:r>
-              <w:rPr>
-                <w:b w:val="0"/>
-                <w:sz w:val="19"/>
-              </w:rPr>
-              <w:t>✖  Capital simbólico; los ingresos son $300 MM.</w:t>
-            </w:r>
-          </w:p>
-        </w:tc>
-      </w:tr>
-      <w:tr>
-        <w:tc>
-          <w:tcPr>
-            <w:tcW w:type="dxa" w:w="4703"/>
-            <w:shd w:val="clear" w:color="auto" w:fill="FBEAEA"/>
-          </w:tcPr>
-          <w:p>
-            <w:r>
-              <w:rPr>
-                <w:b w:val="0"/>
-                <w:sz w:val="19"/>
-              </w:rPr>
-              <w:t>Clientela, contactos o cartera propia</w:t>
-            </w:r>
-          </w:p>
-        </w:tc>
-        <w:tc>
-          <w:tcPr>
-            <w:tcW w:type="dxa" w:w="4703"/>
-            <w:shd w:val="clear" w:color="auto" w:fill="FBEAEA"/>
-          </w:tcPr>
-          <w:p>
-            <w:r>
-              <w:rPr>
-                <w:b w:val="0"/>
-                <w:sz w:val="19"/>
-              </w:rPr>
-              <w:t>✖  No.</w:t>
-            </w:r>
-          </w:p>
-        </w:tc>
-      </w:tr>
-      <w:tr>
-        <w:tc>
-          <w:tcPr>
-            <w:tcW w:type="dxa" w:w="4703"/>
-          </w:tcPr>
-          <w:p>
-            <w:r>
-              <w:rPr>
-                <w:b w:val="0"/>
-                <w:sz w:val="19"/>
-              </w:rPr>
-              <w:t>Dirección estratégica o decisiones empresariales</w:t>
-            </w:r>
-          </w:p>
-        </w:tc>
-        <w:tc>
-          <w:tcPr>
-            <w:tcW w:type="dxa" w:w="4703"/>
-          </w:tcPr>
-          <w:p>
-            <w:r>
-              <w:rPr>
-                <w:b w:val="0"/>
-                <w:sz w:val="19"/>
-              </w:rPr>
-              <w:t>✖  No. Solo reciben retiros de utilidades.</w:t>
-            </w:r>
-          </w:p>
-        </w:tc>
-      </w:tr>
-    </w:tbl>
-    <w:p/>
-    <w:p>
-      <w:pPr>
-        <w:spacing w:before="120" w:after="40"/>
-      </w:pPr>
-      <w:r>
-        <w:rPr>
-          <w:b/>
-          <w:color w:val="2E6DA4"/>
-          <w:sz w:val="22"/>
-        </w:rPr>
-        <w:t>Elemento 3 — Forma jurídica inapropiada para el sustrato económico</w:t>
+        <w:t>Configuración del Art. 4 ter CT: se evita parcialmente el hecho gravado del IGC en su tramo marginal más alto, mediante un acto que no produce efectos jurídicos ni económicos relevantes distintos del meramente tributario.</w:t>
       </w:r>
     </w:p>
     <w:p>
       <w:pPr>
-        <w:jc w:val="both"/>
+        <w:pStyle w:val="ListBullet"/>
+        <w:keepNext w:val="0"/>
+        <w:spacing w:after="40"/>
+        <w:ind w:left="283"/>
       </w:pPr>
       <w:r>
         <w:rPr>
-          <w:b w:val="0"/>
-          <w:i w:val="0"/>
-          <w:sz w:val="21"/>
+          <w:sz w:val="20"/>
         </w:rPr>
-        <w:t>La sociedad de profesionales es una figura creada para que varios profesionales se organicen conjuntamente. No está pensada para canalizar el trabajo individual de uno solo y repartir sus utilidades entre socios pasivos. Usar esa forma jurídica para ese propósito es exactamente lo que el Art. 4 ter CT define como abuso.</w:t>
-      </w:r>
-    </w:p>
-    <w:p>
-      <w:pPr>
-        <w:spacing w:before="200" w:after="80"/>
-        <w:pBdr>
-          <w:bottom w:val="single" w:sz="8" w:space="1" w:color="2E6DA4"/>
-        </w:pBdr>
-      </w:pPr>
-      <w:r>
-        <w:rPr>
-          <w:b/>
-          <w:color w:val="1A3A5C"/>
-          <w:sz w:val="24"/>
-        </w:rPr>
-        <w:t>V.  EFECTO TRIBUTARIO — EJEMPLO CON NÚMEROS</w:t>
-      </w:r>
-    </w:p>
-    <w:p>
-      <w:pPr>
-        <w:jc w:val="both"/>
-      </w:pPr>
-      <w:r>
-        <w:rPr>
-          <w:b w:val="0"/>
-          <w:i w:val="0"/>
-          <w:sz w:val="21"/>
-        </w:rPr>
-        <w:t>Para ilustrar el perjuicio fiscal, consideremos a Pedro con honorarios anuales de $300 MM y una tabla simplificada del IGC. Los tramos son aproximados a efectos ilustrativos:</w:t>
-      </w:r>
-    </w:p>
-    <w:tbl>
-      <w:tblPr>
-        <w:tblStyle w:val="LightGrid-Accent1"/>
-        <w:tblW w:type="auto" w:w="0"/>
-        <w:jc w:val="center"/>
-        <w:tblLook w:firstColumn="1" w:firstRow="1" w:lastColumn="0" w:lastRow="0" w:noHBand="0" w:noVBand="1" w:val="04A0"/>
-      </w:tblPr>
-      <w:tblGrid>
-        <w:gridCol w:w="2351"/>
-        <w:gridCol w:w="2351"/>
-        <w:gridCol w:w="2351"/>
-        <w:gridCol w:w="2351"/>
-      </w:tblGrid>
-      <w:tr>
-        <w:tc>
-          <w:tcPr>
-            <w:tcW w:type="dxa" w:w="2351"/>
-            <w:shd w:val="clear" w:color="auto" w:fill="1A3A5C"/>
-          </w:tcPr>
-          <w:p>
-            <w:r>
-              <w:rPr>
-                <w:b/>
-                <w:color w:val="FFFFFF"/>
-                <w:sz w:val="20"/>
-              </w:rPr>
-              <w:t>Escenario</w:t>
-            </w:r>
-          </w:p>
-        </w:tc>
-        <w:tc>
-          <w:tcPr>
-            <w:tcW w:type="dxa" w:w="2351"/>
-            <w:shd w:val="clear" w:color="auto" w:fill="1A3A5C"/>
-          </w:tcPr>
-          <w:p>
-            <w:r>
-              <w:rPr>
-                <w:b/>
-                <w:color w:val="FFFFFF"/>
-                <w:sz w:val="20"/>
-              </w:rPr>
-              <w:t>Renta declarada por Pedro</w:t>
-            </w:r>
-          </w:p>
-        </w:tc>
-        <w:tc>
-          <w:tcPr>
-            <w:tcW w:type="dxa" w:w="2351"/>
-            <w:shd w:val="clear" w:color="auto" w:fill="1A3A5C"/>
-          </w:tcPr>
-          <w:p>
-            <w:r>
-              <w:rPr>
-                <w:b/>
-                <w:color w:val="FFFFFF"/>
-                <w:sz w:val="20"/>
-              </w:rPr>
-              <w:t>Tramo IGC aplicable</w:t>
-            </w:r>
-          </w:p>
-        </w:tc>
-        <w:tc>
-          <w:tcPr>
-            <w:tcW w:type="dxa" w:w="2351"/>
-            <w:shd w:val="clear" w:color="auto" w:fill="1A3A5C"/>
-          </w:tcPr>
-          <w:p>
-            <w:r>
-              <w:rPr>
-                <w:b/>
-                <w:color w:val="FFFFFF"/>
-                <w:sz w:val="20"/>
-              </w:rPr>
-              <w:t>Resultado</w:t>
-            </w:r>
-          </w:p>
-        </w:tc>
-      </w:tr>
-      <w:tr>
-        <w:tc>
-          <w:tcPr>
-            <w:tcW w:type="dxa" w:w="2351"/>
-            <w:shd w:val="clear" w:color="auto" w:fill="EBF3FB"/>
-          </w:tcPr>
-          <w:p>
-            <w:r>
-              <w:rPr>
-                <w:b w:val="0"/>
-                <w:sz w:val="19"/>
-              </w:rPr>
-              <w:t>Sin esquema</w:t>
-              <w:br/>
-              <w:t>(Pedro trabaja solo)</w:t>
-            </w:r>
-          </w:p>
-        </w:tc>
-        <w:tc>
-          <w:tcPr>
-            <w:tcW w:type="dxa" w:w="2351"/>
-            <w:shd w:val="clear" w:color="auto" w:fill="EBF3FB"/>
-          </w:tcPr>
-          <w:p>
-            <w:r>
-              <w:rPr>
-                <w:b w:val="0"/>
-                <w:sz w:val="19"/>
-              </w:rPr>
-              <w:t>$300 MM (Pedro declara todo)</w:t>
-            </w:r>
-          </w:p>
-        </w:tc>
-        <w:tc>
-          <w:tcPr>
-            <w:tcW w:type="dxa" w:w="2351"/>
-            <w:shd w:val="clear" w:color="auto" w:fill="EBF3FB"/>
-          </w:tcPr>
-          <w:p>
-            <w:r>
-              <w:rPr>
-                <w:b w:val="0"/>
-                <w:sz w:val="19"/>
-              </w:rPr>
-              <w:t>Tramo ≈ 40% (tramo máximo)</w:t>
-            </w:r>
-          </w:p>
-        </w:tc>
-        <w:tc>
-          <w:tcPr>
-            <w:tcW w:type="dxa" w:w="2351"/>
-            <w:shd w:val="clear" w:color="auto" w:fill="EBF3FB"/>
-          </w:tcPr>
-          <w:p>
-            <w:r>
-              <w:rPr>
-                <w:b w:val="0"/>
-                <w:sz w:val="19"/>
-              </w:rPr>
-              <w:t>Pedro paga IGC alto</w:t>
-            </w:r>
-          </w:p>
-        </w:tc>
-      </w:tr>
-      <w:tr>
-        <w:tc>
-          <w:tcPr>
-            <w:tcW w:type="dxa" w:w="2351"/>
-            <w:shd w:val="clear" w:color="auto" w:fill="FBEAEA"/>
-          </w:tcPr>
-          <w:p>
-            <w:r>
-              <w:rPr>
-                <w:b w:val="0"/>
-                <w:sz w:val="19"/>
-              </w:rPr>
-              <w:t>Con esquema D</w:t>
-              <w:br/>
-              <w:t>(3 socios iguales)</w:t>
-            </w:r>
-          </w:p>
-        </w:tc>
-        <w:tc>
-          <w:tcPr>
-            <w:tcW w:type="dxa" w:w="2351"/>
-            <w:shd w:val="clear" w:color="auto" w:fill="FBEAEA"/>
-          </w:tcPr>
-          <w:p>
-            <w:r>
-              <w:rPr>
-                <w:b w:val="0"/>
-                <w:sz w:val="19"/>
-              </w:rPr>
-              <w:t>$100 MM (Pedro · B · C, c/u declara 1/3)</w:t>
-            </w:r>
-          </w:p>
-        </w:tc>
-        <w:tc>
-          <w:tcPr>
-            <w:tcW w:type="dxa" w:w="2351"/>
-            <w:shd w:val="clear" w:color="auto" w:fill="FBEAEA"/>
-          </w:tcPr>
-          <w:p>
-            <w:r>
-              <w:rPr>
-                <w:b w:val="0"/>
-                <w:sz w:val="19"/>
-              </w:rPr>
-              <w:t>Cada socio en tramo ≈ 23–35%</w:t>
-            </w:r>
-          </w:p>
-        </w:tc>
-        <w:tc>
-          <w:tcPr>
-            <w:tcW w:type="dxa" w:w="2351"/>
-            <w:shd w:val="clear" w:color="auto" w:fill="FBEAEA"/>
-          </w:tcPr>
-          <w:p>
-            <w:r>
-              <w:rPr>
-                <w:b w:val="0"/>
-                <w:sz w:val="19"/>
-              </w:rPr>
-              <w:t>Ahorro artificial del IGC de Pedro</w:t>
-            </w:r>
-          </w:p>
-        </w:tc>
-      </w:tr>
-      <w:tr>
-        <w:tc>
-          <w:tcPr>
-            <w:tcW w:type="dxa" w:w="2351"/>
-            <w:shd w:val="clear" w:color="auto" w:fill="FDE9D9"/>
-          </w:tcPr>
-          <w:p>
-            <w:r>
-              <w:rPr>
-                <w:b w:val="0"/>
-                <w:sz w:val="19"/>
-              </w:rPr>
-              <w:t>Diferencial estimado</w:t>
-            </w:r>
-          </w:p>
-        </w:tc>
-        <w:tc>
-          <w:tcPr>
-            <w:tcW w:type="dxa" w:w="2351"/>
-            <w:shd w:val="clear" w:color="auto" w:fill="FDE9D9"/>
-          </w:tcPr>
-          <w:p>
-            <w:r>
-              <w:rPr>
-                <w:b w:val="0"/>
-                <w:sz w:val="19"/>
-              </w:rPr>
-              <w:t>Pedro genera el 100% de los $300 MM</w:t>
-            </w:r>
-          </w:p>
-        </w:tc>
-        <w:tc>
-          <w:tcPr>
-            <w:tcW w:type="dxa" w:w="2351"/>
-            <w:shd w:val="clear" w:color="auto" w:fill="FDE9D9"/>
-          </w:tcPr>
-          <w:p>
-            <w:r>
-              <w:rPr>
-                <w:b w:val="0"/>
-                <w:sz w:val="19"/>
-              </w:rPr>
-              <w:t>Diferencia de tramos = ahorro real</w:t>
-            </w:r>
-          </w:p>
-        </w:tc>
-        <w:tc>
-          <w:tcPr>
-            <w:tcW w:type="dxa" w:w="2351"/>
-            <w:shd w:val="clear" w:color="auto" w:fill="FDE9D9"/>
-          </w:tcPr>
-          <w:p>
-            <w:r>
-              <w:rPr>
-                <w:b w:val="0"/>
-                <w:sz w:val="19"/>
-              </w:rPr>
-              <w:t>PERJUICIO FISCAL → ABUSO</w:t>
-            </w:r>
-          </w:p>
-        </w:tc>
-      </w:tr>
-    </w:tbl>
-    <w:p/>
-    <w:p>
-      <w:pPr>
-        <w:jc w:val="both"/>
-      </w:pPr>
-      <w:r>
-        <w:rPr>
-          <w:b/>
-          <w:i w:val="0"/>
-          <w:color w:val="B03030"/>
-          <w:sz w:val="21"/>
-        </w:rPr>
-        <w:t>Si el SII aplica exitosamente el Art. 4 quinquies CT, el efecto para Pedro es: (1) se le atribuye el total de $300 MM para su IGC; (2) se aplican intereses y multas sobre la diferencia de impuestos no pagados; (3) los retiros percibidos por B y C son recalificados en su propio IGC según corresponda.</w:t>
+        <w:t>Descarte de simulación (Art. 4 quáter): no existe divergencia entre voluntad real y declarada. Los actos son reales, pero la forma es abusiva, no simulada.</w:t>
       </w:r>
     </w:p>
     <w:p>
@@ -1924,22 +942,24 @@
     </w:p>
     <w:p>
       <w:pPr>
-        <w:spacing w:before="200" w:after="80"/>
+        <w:keepNext/>
+        <w:spacing w:before="240" w:after="120"/>
         <w:pBdr>
-          <w:bottom w:val="single" w:sz="8" w:space="1" w:color="2E6DA4"/>
+          <w:bottom w:val="single" w:sz="8" w:space="2" w:color="2E6DA4"/>
         </w:pBdr>
       </w:pPr>
       <w:r>
         <w:rPr>
           <w:b/>
           <w:color w:val="1A3A5C"/>
-          <w:sz w:val="24"/>
+          <w:sz w:val="26"/>
         </w:rPr>
-        <w:t>VI.  ¿QUÉ PUEDE HACER PEDRO? — ALTERNATIVAS LEGÍTIMAS</w:t>
+        <w:t>V.  ALTERNATIVAS DE SOLUCIÓN AL CASO</w:t>
       </w:r>
     </w:p>
     <w:p>
       <w:pPr>
+        <w:spacing w:after="80"/>
         <w:jc w:val="both"/>
       </w:pPr>
       <w:r>
@@ -1948,343 +968,26 @@
           <w:i w:val="0"/>
           <w:sz w:val="21"/>
         </w:rPr>
-        <w:t>El problema no es ejercer como sociedad, sino hacerlo de forma que carezca de sustancia económica real. Existen alternativas legítimas que Pedro puede adoptar sin exponerse a NGA:</w:t>
+        <w:t>El grupo propone las siguientes alternativas legítimas de estructuración tributaria que permitirían al contribuyente A organizar su actividad profesional sin incurrir en abuso de las formas jurídicas:</w:t>
       </w:r>
     </w:p>
-    <w:tbl>
-      <w:tblPr>
-        <w:tblStyle w:val="LightGrid-Accent1"/>
-        <w:tblW w:type="auto" w:w="0"/>
-        <w:jc w:val="center"/>
-        <w:tblLook w:firstColumn="1" w:firstRow="1" w:lastColumn="0" w:lastRow="0" w:noHBand="0" w:noVBand="1" w:val="04A0"/>
-      </w:tblPr>
-      <w:tblGrid>
-        <w:gridCol w:w="3135"/>
-        <w:gridCol w:w="3135"/>
-        <w:gridCol w:w="3135"/>
-      </w:tblGrid>
-      <w:tr>
-        <w:tc>
-          <w:tcPr>
-            <w:tcW w:type="dxa" w:w="3135"/>
-            <w:shd w:val="clear" w:color="auto" w:fill="1A3A5C"/>
-          </w:tcPr>
-          <w:p>
-            <w:r>
-              <w:rPr>
-                <w:b/>
-                <w:color w:val="FFFFFF"/>
-                <w:sz w:val="20"/>
-              </w:rPr>
-              <w:t>Alternativa</w:t>
-            </w:r>
-          </w:p>
-        </w:tc>
-        <w:tc>
-          <w:tcPr>
-            <w:tcW w:type="dxa" w:w="3135"/>
-            <w:shd w:val="clear" w:color="auto" w:fill="1A3A5C"/>
-          </w:tcPr>
-          <w:p>
-            <w:r>
-              <w:rPr>
-                <w:b/>
-                <w:color w:val="FFFFFF"/>
-                <w:sz w:val="20"/>
-              </w:rPr>
-              <w:t>¿En qué consiste?</w:t>
-            </w:r>
-          </w:p>
-        </w:tc>
-        <w:tc>
-          <w:tcPr>
-            <w:tcW w:type="dxa" w:w="3135"/>
-            <w:shd w:val="clear" w:color="auto" w:fill="1A3A5C"/>
-          </w:tcPr>
-          <w:p>
-            <w:r>
-              <w:rPr>
-                <w:b/>
-                <w:color w:val="FFFFFF"/>
-                <w:sz w:val="20"/>
-              </w:rPr>
-              <w:t>Ventaja / Condición</w:t>
-            </w:r>
-          </w:p>
-        </w:tc>
-      </w:tr>
-      <w:tr>
-        <w:tc>
-          <w:tcPr>
-            <w:tcW w:type="dxa" w:w="3135"/>
-            <w:shd w:val="clear" w:color="auto" w:fill="F4F6F9"/>
-          </w:tcPr>
-          <w:p>
-            <w:r>
-              <w:rPr>
-                <w:b w:val="0"/>
-                <w:sz w:val="19"/>
-              </w:rPr>
-              <w:t>Alt. 1</w:t>
-              <w:br/>
-              <w:t>Profesional independiente</w:t>
-            </w:r>
-          </w:p>
-        </w:tc>
-        <w:tc>
-          <w:tcPr>
-            <w:tcW w:type="dxa" w:w="3135"/>
-            <w:shd w:val="clear" w:color="auto" w:fill="F4F6F9"/>
-          </w:tcPr>
-          <w:p>
-            <w:r>
-              <w:rPr>
-                <w:b w:val="0"/>
-                <w:sz w:val="19"/>
-              </w:rPr>
-              <w:t>Pedro emite boletas de honorarios directamente. Paga IGC sobre sus ingresos. Puede deducir gastos efectivos o presuntos (30%, tope 15 UTA).</w:t>
-            </w:r>
-          </w:p>
-        </w:tc>
-        <w:tc>
-          <w:tcPr>
-            <w:tcW w:type="dxa" w:w="3135"/>
-            <w:shd w:val="clear" w:color="auto" w:fill="F4F6F9"/>
-          </w:tcPr>
-          <w:p>
-            <w:r>
-              <w:rPr>
-                <w:b w:val="0"/>
-                <w:sz w:val="19"/>
-              </w:rPr>
-              <w:t>Sencillo, sin riesgo de NGA. Sin beneficio societario.</w:t>
-            </w:r>
-          </w:p>
-        </w:tc>
-      </w:tr>
-      <w:tr>
-        <w:tc>
-          <w:tcPr>
-            <w:tcW w:type="dxa" w:w="3135"/>
-          </w:tcPr>
-          <w:p>
-            <w:r>
-              <w:rPr>
-                <w:b w:val="0"/>
-                <w:sz w:val="19"/>
-              </w:rPr>
-              <w:t>Alt. 2</w:t>
-              <w:br/>
-              <w:t>Sociedad con socios que trabajen</w:t>
-            </w:r>
-          </w:p>
-        </w:tc>
-        <w:tc>
-          <w:tcPr>
-            <w:tcW w:type="dxa" w:w="3135"/>
-          </w:tcPr>
-          <w:p>
-            <w:r>
-              <w:rPr>
-                <w:b w:val="0"/>
-                <w:sz w:val="19"/>
-              </w:rPr>
-              <w:t>Pedro se asocia con otros médicos u otros profesionales que efectivamente atiendan pacientes o presten servicios para la sociedad.</w:t>
-            </w:r>
-          </w:p>
-        </w:tc>
-        <w:tc>
-          <w:tcPr>
-            <w:tcW w:type="dxa" w:w="3135"/>
-          </w:tcPr>
-          <w:p>
-            <w:r>
-              <w:rPr>
-                <w:b w:val="0"/>
-                <w:sz w:val="19"/>
-              </w:rPr>
-              <w:t>Califica legítimamente como sociedad de profesionales. La distribución de utilidades refleja trabajo real.</w:t>
-            </w:r>
-          </w:p>
-        </w:tc>
-      </w:tr>
-      <w:tr>
-        <w:tc>
-          <w:tcPr>
-            <w:tcW w:type="dxa" w:w="3135"/>
-            <w:shd w:val="clear" w:color="auto" w:fill="F4F6F9"/>
-          </w:tcPr>
-          <w:p>
-            <w:r>
-              <w:rPr>
-                <w:b w:val="0"/>
-                <w:sz w:val="19"/>
-              </w:rPr>
-              <w:t>Alt. 3</w:t>
-              <w:br/>
-              <w:t>Distribución proporcional al trabajo</w:t>
-            </w:r>
-          </w:p>
-        </w:tc>
-        <w:tc>
-          <w:tcPr>
-            <w:tcW w:type="dxa" w:w="3135"/>
-            <w:shd w:val="clear" w:color="auto" w:fill="F4F6F9"/>
-          </w:tcPr>
-          <w:p>
-            <w:r>
-              <w:rPr>
-                <w:b w:val="0"/>
-                <w:sz w:val="19"/>
-              </w:rPr>
-              <w:t>Si D se mantiene con A, B y C, los estatutos establecen que Pedro recibe el 90% de las utilidades, y B y C un 5% cada uno, acorde a su aporte real.</w:t>
-            </w:r>
-          </w:p>
-        </w:tc>
-        <w:tc>
-          <w:tcPr>
-            <w:tcW w:type="dxa" w:w="3135"/>
-            <w:shd w:val="clear" w:color="auto" w:fill="F4F6F9"/>
-          </w:tcPr>
-          <w:p>
-            <w:r>
-              <w:rPr>
-                <w:b w:val="0"/>
-                <w:sz w:val="19"/>
-              </w:rPr>
-              <w:t>Debe existir aporte efectivo de B y C, aunque sea menor. La distribución debe ser económicamente justificada.</w:t>
-            </w:r>
-          </w:p>
-        </w:tc>
-      </w:tr>
-      <w:tr>
-        <w:tc>
-          <w:tcPr>
-            <w:tcW w:type="dxa" w:w="3135"/>
-          </w:tcPr>
-          <w:p>
-            <w:r>
-              <w:rPr>
-                <w:b w:val="0"/>
-                <w:sz w:val="19"/>
-              </w:rPr>
-              <w:t>Alt. 4</w:t>
-              <w:br/>
-              <w:t>SpA régimen Pro Pyme (14D N°3)</w:t>
-            </w:r>
-          </w:p>
-        </w:tc>
-        <w:tc>
-          <w:tcPr>
-            <w:tcW w:type="dxa" w:w="3135"/>
-          </w:tcPr>
-          <w:p>
-            <w:r>
-              <w:rPr>
-                <w:b w:val="0"/>
-                <w:sz w:val="19"/>
-              </w:rPr>
-              <w:t>Constituir SpA con Pedro como único accionista. Tributación de la empresa al 25% de IDPC; Pedro paga IGC sobre retiros. Permite reinversión y planificación.</w:t>
-            </w:r>
-          </w:p>
-        </w:tc>
-        <w:tc>
-          <w:tcPr>
-            <w:tcW w:type="dxa" w:w="3135"/>
-          </w:tcPr>
-          <w:p>
-            <w:r>
-              <w:rPr>
-                <w:b w:val="0"/>
-                <w:sz w:val="19"/>
-              </w:rPr>
-              <w:t>No tiene restricciones de sociedad de profesionales. Requiere sustancia económica en la sociedad.</w:t>
-            </w:r>
-          </w:p>
-        </w:tc>
-      </w:tr>
-      <w:tr>
-        <w:tc>
-          <w:tcPr>
-            <w:tcW w:type="dxa" w:w="3135"/>
-            <w:shd w:val="clear" w:color="auto" w:fill="F4F6F9"/>
-          </w:tcPr>
-          <w:p>
-            <w:r>
-              <w:rPr>
-                <w:b w:val="0"/>
-                <w:sz w:val="19"/>
-              </w:rPr>
-              <w:t>Alt. 5</w:t>
-              <w:br/>
-              <w:t>Régimen Transparente (14D N°8)</w:t>
-            </w:r>
-          </w:p>
-        </w:tc>
-        <w:tc>
-          <w:tcPr>
-            <w:tcW w:type="dxa" w:w="3135"/>
-            <w:shd w:val="clear" w:color="auto" w:fill="F4F6F9"/>
-          </w:tcPr>
-          <w:p>
-            <w:r>
-              <w:rPr>
-                <w:b w:val="0"/>
-                <w:sz w:val="19"/>
-              </w:rPr>
-              <w:t>Si los socios son solo personas naturales, la empresa no paga IDPC; cada socio paga IGC directo sobre su participación.</w:t>
-            </w:r>
-          </w:p>
-        </w:tc>
-        <w:tc>
-          <w:tcPr>
-            <w:tcW w:type="dxa" w:w="3135"/>
-            <w:shd w:val="clear" w:color="auto" w:fill="F4F6F9"/>
-          </w:tcPr>
-          <w:p>
-            <w:r>
-              <w:rPr>
-                <w:b w:val="0"/>
-                <w:sz w:val="19"/>
-              </w:rPr>
-              <w:t>ATENCIÓN: no soluciona el problema si B y C siguen sin aportar valor real. Solo válido con socios con sustancia.</w:t>
-            </w:r>
-          </w:p>
-        </w:tc>
-      </w:tr>
-    </w:tbl>
-    <w:p/>
     <w:p>
       <w:pPr>
-        <w:spacing w:before="200" w:after="80"/>
-        <w:pBdr>
-          <w:bottom w:val="single" w:sz="8" w:space="1" w:color="2E6DA4"/>
-        </w:pBdr>
+        <w:keepNext/>
+        <w:spacing w:before="160" w:after="60"/>
       </w:pPr>
       <w:r>
         <w:rPr>
           <w:b/>
-          <w:color w:val="1A3A5C"/>
-          <w:sz w:val="24"/>
+          <w:color w:val="2E6DA4"/>
+          <w:sz w:val="22"/>
         </w:rPr>
-        <w:t>VII.  CONCLUSIONES</w:t>
+        <w:t>Alternativa 1 — Tributación directa como profesional independiente (Art. 42 N°2 LIR)</w:t>
       </w:r>
     </w:p>
     <w:p>
       <w:pPr>
-        <w:spacing w:before="120" w:after="40"/>
-      </w:pPr>
-      <w:r>
-        <w:rPr>
-          <w:b/>
-          <w:color w:val="1A3A5C"/>
-          <w:sz w:val="22"/>
-        </w:rPr>
-        <w:t>1. ABUSO, no simulación.</w:t>
-      </w:r>
-    </w:p>
-    <w:p>
-      <w:pPr>
+        <w:spacing w:after="80"/>
         <w:jc w:val="both"/>
       </w:pPr>
       <w:r>
@@ -2293,24 +996,26 @@
           <w:i w:val="0"/>
           <w:sz w:val="21"/>
         </w:rPr>
-        <w:t>El Caso 86 configura un abuso de las formas jurídicas (Art. 4 ter CT). La sociedad y los socios son reales, pero la forma es inapropiada: no hay sustancia económica en B y C. No hay acto secreto, por lo tanto no es simulación.</w:t>
+        <w:t>El socio A puede ejercer su actividad profesional como persona natural independiente, emitiendo boletas de honorarios y declarando sus ingresos en segunda categoría. Tendrá derecho a deducir gastos efectivos o a optar por gastos presuntos (30% con tope de 15 UTA). Pagará IGC sobre la totalidad de los ingresos según tabla progresiva. Esta opción es la más simple y libre de cuestionamientos.</w:t>
       </w:r>
     </w:p>
     <w:p>
       <w:pPr>
-        <w:spacing w:before="120" w:after="40"/>
+        <w:keepNext/>
+        <w:spacing w:before="160" w:after="60"/>
       </w:pPr>
       <w:r>
         <w:rPr>
           <w:b/>
-          <w:color w:val="1A3A5C"/>
+          <w:color w:val="2E6DA4"/>
           <w:sz w:val="22"/>
         </w:rPr>
-        <w:t>2. La sociedad D no califica.</w:t>
+        <w:t>Alternativa 2 — Sociedad de profesionales con socios que efectivamente trabajen</w:t>
       </w:r>
     </w:p>
     <w:p>
       <w:pPr>
+        <w:spacing w:after="80"/>
         <w:jc w:val="both"/>
       </w:pPr>
       <w:r>
@@ -2319,24 +1024,26 @@
           <w:i w:val="0"/>
           <w:sz w:val="21"/>
         </w:rPr>
-        <w:t>Por incumplimiento de los requisitos de las Circulares N°21/1991 y N°50/2020 (no todos los socios ejercen su profesión para la sociedad), D no es una sociedad de profesionales legítima bajo el Art. 42 N°2 LIR.</w:t>
+        <w:t>Si A tiene voluntad de asociarse con otros profesionales, debe hacerlo con personas que efectivamente ejerzan su profesión para la sociedad. Cada socio debe coadyuvar a la prestación del servicio profesional. En tal caso, D calificaría legítimamente como sociedad de profesionales, podrá optar por tributar en primera o segunda categoría conforme al Art. 42 N°2 inc. 3° LIR, y la distribución de utilidades reflejará el trabajo aportado por cada uno.</w:t>
       </w:r>
     </w:p>
     <w:p>
       <w:pPr>
-        <w:spacing w:before="120" w:after="40"/>
+        <w:keepNext/>
+        <w:spacing w:before="160" w:after="60"/>
       </w:pPr>
       <w:r>
         <w:rPr>
           <w:b/>
-          <w:color w:val="1A3A5C"/>
+          <w:color w:val="2E6DA4"/>
           <w:sz w:val="22"/>
         </w:rPr>
-        <w:t>3. El SII puede actuar.</w:t>
+        <w:t>Alternativa 3 — Distribución de utilidades proporcional al trabajo realmente prestado</w:t>
       </w:r>
     </w:p>
     <w:p>
       <w:pPr>
+        <w:spacing w:after="80"/>
         <w:jc w:val="both"/>
       </w:pPr>
       <w:r>
@@ -2345,24 +1052,26 @@
           <w:i w:val="0"/>
           <w:sz w:val="21"/>
         </w:rPr>
-        <w:t>Acreditados los elementos del Art. 4 ter CT, el Director puede requerir al TTA la declaración de abuso (Art. 4 quinquies CT). El efecto: atribución íntegra de los $300 MM a Pedro para su IGC, más intereses y multas.</w:t>
+        <w:t>Si la sociedad se mantiene con A, B y C como socios, los estatutos pueden contemplar una distribución diferenciada de utilidades que reconozca la mayor contribución de A. Esto puede instrumentarse mediante: (i) participación social diferenciada (por ejemplo, A 90%, B y C 5% cada uno) o (ii) sueldo patronal a A por el trabajo prestado, antes de repartir utilidades. La distribución debe reflejar la realidad económica del aporte.</w:t>
       </w:r>
     </w:p>
     <w:p>
       <w:pPr>
-        <w:spacing w:before="120" w:after="40"/>
+        <w:keepNext/>
+        <w:spacing w:before="160" w:after="60"/>
       </w:pPr>
       <w:r>
         <w:rPr>
           <w:b/>
-          <w:color w:val="1A3A5C"/>
+          <w:color w:val="2E6DA4"/>
           <w:sz w:val="22"/>
         </w:rPr>
-        <w:t>4. Hay soluciones legítimas.</w:t>
+        <w:t>Alternativa 4 — Sociedad por Acciones (SpA) con régimen Pro Pyme — Art. 14 D N°3 LIR</w:t>
       </w:r>
     </w:p>
     <w:p>
       <w:pPr>
+        <w:spacing w:after="80"/>
         <w:jc w:val="both"/>
       </w:pPr>
       <w:r>
@@ -2371,24 +1080,113 @@
           <w:i w:val="0"/>
           <w:sz w:val="21"/>
         </w:rPr>
-        <w:t>Pedro puede organizar su actividad profesional a través de una sociedad, siempre que los socios tengan rol económico real y la distribución de utilidades refleje el aporte efectivo de cada uno.</w:t>
+        <w:t>Constituir una SpA acogida al régimen Pro Pyme General del Art. 14 letra D N°3 LIR, con tasa de IDPC del 25%, siempre que A sea el único accionista o que los demás accionistas tengan rol efectivamente económico. La SpA no tiene la restricción de la sociedad de profesionales pero exige sustancia económica real. Permite planificación de retiros y reinversión.</w:t>
       </w:r>
     </w:p>
     <w:p>
       <w:pPr>
-        <w:spacing w:before="120" w:after="40"/>
+        <w:keepNext/>
+        <w:spacing w:before="160" w:after="60"/>
       </w:pPr>
       <w:r>
         <w:rPr>
           <w:b/>
-          <w:color w:val="B03030"/>
+          <w:color w:val="2E6DA4"/>
           <w:sz w:val="22"/>
         </w:rPr>
-        <w:t>5. El mensaje del caso es claro.</w:t>
+        <w:t>Alternativa 5 — Régimen Pro Pyme Transparente — Art. 14 D N°8 LIR</w:t>
       </w:r>
     </w:p>
     <w:p>
       <w:pPr>
+        <w:spacing w:after="80"/>
+        <w:jc w:val="both"/>
+      </w:pPr>
+      <w:r>
+        <w:rPr>
+          <w:b w:val="0"/>
+          <w:i w:val="0"/>
+          <w:sz w:val="21"/>
+        </w:rPr>
+        <w:t>Si los socios son únicamente personas naturales, evaluar el régimen transparente del Art. 14 letra D N°8 LIR. La empresa no paga IDPC; los socios tributan directamente con IGC sobre su participación. Atención: este régimen no soluciona el problema de fondo si los socios B y C siguen siendo ficticios — el SII puede igualmente aplicar las NGA. Solo es válida si B y C efectivamente aportan trabajo o sustancia económica.</w:t>
+      </w:r>
+    </w:p>
+    <w:p>
+      <w:pPr>
+        <w:keepNext/>
+        <w:spacing w:before="240" w:after="120"/>
+        <w:pBdr>
+          <w:bottom w:val="single" w:sz="8" w:space="2" w:color="2E6DA4"/>
+        </w:pBdr>
+      </w:pPr>
+      <w:r>
+        <w:rPr>
+          <w:b/>
+          <w:color w:val="1A3A5C"/>
+          <w:sz w:val="26"/>
+        </w:rPr>
+        <w:t>VI.  CONCLUSIONES</w:t>
+      </w:r>
+    </w:p>
+    <w:p>
+      <w:pPr>
+        <w:spacing w:after="80"/>
+        <w:jc w:val="both"/>
+      </w:pPr>
+      <w:r>
+        <w:rPr>
+          <w:b w:val="0"/>
+          <w:i w:val="0"/>
+          <w:sz w:val="21"/>
+        </w:rPr>
+        <w:t>1.  El esquema descrito en el Caso 86 del Catálogo SII 2025 corresponde a un ABUSO de las formas jurídicas conforme al Art. 4 ter del Código Tributario. No se trata de simulación, ya que los actos jurídicos son reales aunque inapropiados.</w:t>
+      </w:r>
+    </w:p>
+    <w:p>
+      <w:pPr>
+        <w:spacing w:after="80"/>
+        <w:jc w:val="both"/>
+      </w:pPr>
+      <w:r>
+        <w:rPr>
+          <w:b w:val="0"/>
+          <w:i w:val="0"/>
+          <w:sz w:val="21"/>
+        </w:rPr>
+        <w:t>2.  La sociedad D no califica como sociedad de profesionales conforme a las Circulares N°21 de 1991 y N°50 de 2020 del SII, dado que B y C no ejercen sus profesiones para ella. Esta sola circunstancia ya genera un problema formal que cuestiona la opción de tributar en primera categoría.</w:t>
+      </w:r>
+    </w:p>
+    <w:p>
+      <w:pPr>
+        <w:spacing w:after="80"/>
+        <w:jc w:val="both"/>
+      </w:pPr>
+      <w:r>
+        <w:rPr>
+          <w:b w:val="0"/>
+          <w:i w:val="0"/>
+          <w:sz w:val="21"/>
+        </w:rPr>
+        <w:t>3.  El SII, a requerimiento del Director, puede solicitar al Tribunal Tributario y Aduanero la declaración de abuso conforme al Art. 4 quinquies CT, con el efecto de recalificar el esquema y atribuir la totalidad de los ingresos al socio A para el cálculo del IGC, con los correspondientes intereses y multas.</w:t>
+      </w:r>
+    </w:p>
+    <w:p>
+      <w:pPr>
+        <w:spacing w:after="80"/>
+        <w:jc w:val="both"/>
+      </w:pPr>
+      <w:r>
+        <w:rPr>
+          <w:b w:val="0"/>
+          <w:i w:val="0"/>
+          <w:sz w:val="21"/>
+        </w:rPr>
+        <w:t>4.  Existen alternativas legítimas de organización tributaria que el contribuyente A puede adoptar, según se ha expuesto en la sección V. La elección dependerá de la estrategia de negocio, las proyecciones de ingresos, la composición real del equipo profesional y los objetivos de planificación de retiros.</w:t>
+      </w:r>
+    </w:p>
+    <w:p>
+      <w:pPr>
+        <w:spacing w:after="80"/>
         <w:jc w:val="both"/>
       </w:pPr>
       <w:r>
@@ -2397,7 +1195,7 @@
           <w:i w:val="0"/>
           <w:sz w:val="21"/>
         </w:rPr>
-        <w:t>El Derecho Tributario chileno acepta la planificación, pero exige que la forma jurídica tenga una justificación económica real más allá del ahorro fiscal. La NGA actúa precisamente cuando esa justificación no existe.</w:t>
+        <w:t>5.  Recomendación final: en una eventual fiscalización, el contribuyente debe estar preparado para acreditar la sustancia económica real del esquema. La sola existencia formal de la sociedad y de los socios B y C no será suficiente; el SII y los tribunales exigirán demostración del aporte efectivo de cada socio.</w:t>
       </w:r>
     </w:p>
     <w:p/>
@@ -2426,7 +1224,7 @@
         <w:br/>
         <w:t>Magíster en Dirección Tributaria — UVM | Caso 86 · Catálogo SII 2025</w:t>
         <w:br/>
-        <w:t>Fuentes: LIR Art. 42 N°2; CT Arts. 4 bis, 4 ter, 4 quáter, 4 quinquies; Circ. N°21/1991; Circ. N°50/2020; Circ. N°65/2015; Oficio N°2359/2022 SII.</w:t>
+        <w:t>Fuentes: DL 824 (LIR Art. 42 N°2); Código Tributario Arts. 4 bis, 4 ter, 4 quáter, 4 quinquies; Circular N°21/1991; Circular N°50/2020; Circular N°65/2015 del SII; Ley N°20.780 y Ley N°21.210.</w:t>
       </w:r>
     </w:p>
     <w:sectPr>

</xml_diff>